<commit_message>
Docs com o custo dos componentes
</commit_message>
<xml_diff>
--- a/2026/trabalhos/TCC/Sistemas_Embarcados_HistoriandoFinal.docx
+++ b/2026/trabalhos/TCC/Sistemas_Embarcados_HistoriandoFinal.docx
@@ -748,7 +748,21 @@
           <w:bCs/>
           <w:szCs w:val="24"/>
         </w:rPr>
-        <w:t xml:space="preserve">Há um módulo Joystick (basicamente dois potenciômetros e um botão juntos) e um </w:t>
+        <w:t>Há um módulo Joystick (basicamente dois pote</w:t>
+      </w:r>
+      <w:r>
+        <w:rPr>
+          <w:bCs/>
+          <w:szCs w:val="24"/>
+        </w:rPr>
+        <w:t xml:space="preserve">nciômetros e um botão juntos), </w:t>
+      </w:r>
+      <w:r>
+        <w:rPr>
+          <w:bCs/>
+          <w:szCs w:val="24"/>
+        </w:rPr>
+        <w:t xml:space="preserve">um </w:t>
       </w:r>
       <w:proofErr w:type="spellStart"/>
       <w:r>
@@ -765,6 +779,13 @@
           <w:szCs w:val="24"/>
         </w:rPr>
         <w:t xml:space="preserve"> UNO</w:t>
+      </w:r>
+      <w:r>
+        <w:rPr>
+          <w:bCs/>
+          <w:szCs w:val="24"/>
+        </w:rPr>
+        <w:t xml:space="preserve"> e 5 jumpers Macho X Fêmea</w:t>
       </w:r>
     </w:p>
     <w:p>
@@ -3027,8 +3048,6 @@
           <w:szCs w:val="24"/>
         </w:rPr>
       </w:pPr>
-      <w:bookmarkStart w:id="0" w:name="_GoBack"/>
-      <w:bookmarkEnd w:id="0"/>
     </w:p>
     <w:p>
       <w:pPr>
@@ -3061,12 +3080,14 @@
         <w:rPr>
           <w:b/>
           <w:bCs/>
-          <w:szCs w:val="24"/>
+          <w:noProof/>
+          <w:szCs w:val="24"/>
+          <w:lang w:eastAsia="pt-BR"/>
         </w:rPr>
         <w:drawing>
-          <wp:inline distT="0" distB="0" distL="0" distR="0" wp14:anchorId="4D52B08B" wp14:editId="264F9B32">
-            <wp:extent cx="4482810" cy="2190750"/>
-            <wp:effectExtent l="0" t="0" r="0" b="0"/>
+          <wp:inline distT="0" distB="0" distL="0" distR="0" wp14:anchorId="4D52B08B" wp14:editId="3BFD74ED">
+            <wp:extent cx="4378516" cy="2139781"/>
+            <wp:effectExtent l="76200" t="76200" r="136525" b="127635"/>
             <wp:docPr id="2" name="Imagem 2"/>
             <wp:cNvGraphicFramePr>
               <a:graphicFrameLocks xmlns:a="http://schemas.openxmlformats.org/drawingml/2006/main" noChangeAspect="1"/>
@@ -3087,11 +3108,644 @@
                   <pic:spPr>
                     <a:xfrm>
                       <a:off x="0" y="0"/>
-                      <a:ext cx="4521491" cy="2209653"/>
+                      <a:ext cx="4422319" cy="2161188"/>
                     </a:xfrm>
                     <a:prstGeom prst="rect">
                       <a:avLst/>
                     </a:prstGeom>
+                    <a:ln w="38100" cap="sq">
+                      <a:solidFill>
+                        <a:srgbClr val="000000"/>
+                      </a:solidFill>
+                      <a:prstDash val="solid"/>
+                      <a:miter lim="800000"/>
+                    </a:ln>
+                    <a:effectLst>
+                      <a:outerShdw blurRad="50800" dist="38100" dir="2700000" algn="tl" rotWithShape="0">
+                        <a:srgbClr val="000000">
+                          <a:alpha val="43000"/>
+                        </a:srgbClr>
+                      </a:outerShdw>
+                    </a:effectLst>
+                  </pic:spPr>
+                </pic:pic>
+              </a:graphicData>
+            </a:graphic>
+          </wp:inline>
+        </w:drawing>
+      </w:r>
+    </w:p>
+    <w:p>
+      <w:pPr>
+        <w:spacing w:line="360" w:lineRule="auto"/>
+        <w:rPr>
+          <w:b/>
+          <w:bCs/>
+          <w:szCs w:val="24"/>
+        </w:rPr>
+      </w:pPr>
+      <w:r>
+        <w:rPr>
+          <w:b/>
+          <w:bCs/>
+          <w:szCs w:val="24"/>
+        </w:rPr>
+        <w:lastRenderedPageBreak/>
+        <w:drawing>
+          <wp:inline distT="0" distB="0" distL="0" distR="0" wp14:anchorId="48481D89" wp14:editId="280A3C0F">
+            <wp:extent cx="4376822" cy="1949329"/>
+            <wp:effectExtent l="76200" t="76200" r="138430" b="127635"/>
+            <wp:docPr id="3" name="Imagem 3"/>
+            <wp:cNvGraphicFramePr>
+              <a:graphicFrameLocks xmlns:a="http://schemas.openxmlformats.org/drawingml/2006/main" noChangeAspect="1"/>
+            </wp:cNvGraphicFramePr>
+            <a:graphic xmlns:a="http://schemas.openxmlformats.org/drawingml/2006/main">
+              <a:graphicData uri="http://schemas.openxmlformats.org/drawingml/2006/picture">
+                <pic:pic xmlns:pic="http://schemas.openxmlformats.org/drawingml/2006/picture">
+                  <pic:nvPicPr>
+                    <pic:cNvPr id="1" name=""/>
+                    <pic:cNvPicPr/>
+                  </pic:nvPicPr>
+                  <pic:blipFill>
+                    <a:blip r:embed="rId12"/>
+                    <a:stretch>
+                      <a:fillRect/>
+                    </a:stretch>
+                  </pic:blipFill>
+                  <pic:spPr>
+                    <a:xfrm>
+                      <a:off x="0" y="0"/>
+                      <a:ext cx="4396116" cy="1957922"/>
+                    </a:xfrm>
+                    <a:prstGeom prst="rect">
+                      <a:avLst/>
+                    </a:prstGeom>
+                    <a:ln w="38100" cap="sq">
+                      <a:solidFill>
+                        <a:srgbClr val="000000"/>
+                      </a:solidFill>
+                      <a:prstDash val="solid"/>
+                      <a:miter lim="800000"/>
+                    </a:ln>
+                    <a:effectLst>
+                      <a:outerShdw blurRad="50800" dist="38100" dir="2700000" algn="tl" rotWithShape="0">
+                        <a:srgbClr val="000000">
+                          <a:alpha val="43000"/>
+                        </a:srgbClr>
+                      </a:outerShdw>
+                    </a:effectLst>
+                  </pic:spPr>
+                </pic:pic>
+              </a:graphicData>
+            </a:graphic>
+          </wp:inline>
+        </w:drawing>
+      </w:r>
+    </w:p>
+    <w:p>
+      <w:pPr>
+        <w:spacing w:line="360" w:lineRule="auto"/>
+        <w:rPr>
+          <w:b/>
+          <w:bCs/>
+          <w:szCs w:val="24"/>
+        </w:rPr>
+      </w:pPr>
+      <w:r>
+        <w:rPr>
+          <w:b/>
+          <w:bCs/>
+          <w:szCs w:val="24"/>
+        </w:rPr>
+        <w:drawing>
+          <wp:inline distT="0" distB="0" distL="0" distR="0" wp14:anchorId="6DF9EED9" wp14:editId="7CE0271E">
+            <wp:extent cx="4350385" cy="1889595"/>
+            <wp:effectExtent l="76200" t="76200" r="126365" b="130175"/>
+            <wp:docPr id="4" name="Imagem 4"/>
+            <wp:cNvGraphicFramePr>
+              <a:graphicFrameLocks xmlns:a="http://schemas.openxmlformats.org/drawingml/2006/main" noChangeAspect="1"/>
+            </wp:cNvGraphicFramePr>
+            <a:graphic xmlns:a="http://schemas.openxmlformats.org/drawingml/2006/main">
+              <a:graphicData uri="http://schemas.openxmlformats.org/drawingml/2006/picture">
+                <pic:pic xmlns:pic="http://schemas.openxmlformats.org/drawingml/2006/picture">
+                  <pic:nvPicPr>
+                    <pic:cNvPr id="1" name=""/>
+                    <pic:cNvPicPr/>
+                  </pic:nvPicPr>
+                  <pic:blipFill>
+                    <a:blip r:embed="rId13"/>
+                    <a:stretch>
+                      <a:fillRect/>
+                    </a:stretch>
+                  </pic:blipFill>
+                  <pic:spPr>
+                    <a:xfrm>
+                      <a:off x="0" y="0"/>
+                      <a:ext cx="4363813" cy="1895427"/>
+                    </a:xfrm>
+                    <a:prstGeom prst="rect">
+                      <a:avLst/>
+                    </a:prstGeom>
+                    <a:ln w="38100" cap="sq">
+                      <a:solidFill>
+                        <a:srgbClr val="000000"/>
+                      </a:solidFill>
+                      <a:prstDash val="solid"/>
+                      <a:miter lim="800000"/>
+                    </a:ln>
+                    <a:effectLst>
+                      <a:outerShdw blurRad="50800" dist="38100" dir="2700000" algn="tl" rotWithShape="0">
+                        <a:srgbClr val="000000">
+                          <a:alpha val="43000"/>
+                        </a:srgbClr>
+                      </a:outerShdw>
+                    </a:effectLst>
+                  </pic:spPr>
+                </pic:pic>
+              </a:graphicData>
+            </a:graphic>
+          </wp:inline>
+        </w:drawing>
+      </w:r>
+    </w:p>
+    <w:p>
+      <w:pPr>
+        <w:spacing w:line="360" w:lineRule="auto"/>
+        <w:rPr>
+          <w:b/>
+          <w:bCs/>
+          <w:szCs w:val="24"/>
+        </w:rPr>
+      </w:pPr>
+    </w:p>
+    <w:p>
+      <w:pPr>
+        <w:spacing w:line="360" w:lineRule="auto"/>
+        <w:rPr>
+          <w:b/>
+          <w:bCs/>
+          <w:szCs w:val="24"/>
+        </w:rPr>
+      </w:pPr>
+      <w:bookmarkStart w:id="0" w:name="_GoBack"/>
+      <w:bookmarkEnd w:id="0"/>
+      <w:r>
+        <w:rPr>
+          <w:b/>
+          <w:bCs/>
+          <w:szCs w:val="24"/>
+        </w:rPr>
+        <w:drawing>
+          <wp:inline distT="0" distB="0" distL="0" distR="0" wp14:anchorId="3A548E8B" wp14:editId="2AE9CF0C">
+            <wp:extent cx="4331528" cy="1906712"/>
+            <wp:effectExtent l="76200" t="76200" r="126365" b="132080"/>
+            <wp:docPr id="5" name="Imagem 5"/>
+            <wp:cNvGraphicFramePr>
+              <a:graphicFrameLocks xmlns:a="http://schemas.openxmlformats.org/drawingml/2006/main" noChangeAspect="1"/>
+            </wp:cNvGraphicFramePr>
+            <a:graphic xmlns:a="http://schemas.openxmlformats.org/drawingml/2006/main">
+              <a:graphicData uri="http://schemas.openxmlformats.org/drawingml/2006/picture">
+                <pic:pic xmlns:pic="http://schemas.openxmlformats.org/drawingml/2006/picture">
+                  <pic:nvPicPr>
+                    <pic:cNvPr id="1" name=""/>
+                    <pic:cNvPicPr/>
+                  </pic:nvPicPr>
+                  <pic:blipFill>
+                    <a:blip r:embed="rId14"/>
+                    <a:stretch>
+                      <a:fillRect/>
+                    </a:stretch>
+                  </pic:blipFill>
+                  <pic:spPr>
+                    <a:xfrm>
+                      <a:off x="0" y="0"/>
+                      <a:ext cx="4350142" cy="1914906"/>
+                    </a:xfrm>
+                    <a:prstGeom prst="rect">
+                      <a:avLst/>
+                    </a:prstGeom>
+                    <a:ln w="38100" cap="sq">
+                      <a:solidFill>
+                        <a:srgbClr val="000000"/>
+                      </a:solidFill>
+                      <a:prstDash val="solid"/>
+                      <a:miter lim="800000"/>
+                    </a:ln>
+                    <a:effectLst>
+                      <a:outerShdw blurRad="50800" dist="38100" dir="2700000" algn="tl" rotWithShape="0">
+                        <a:srgbClr val="000000">
+                          <a:alpha val="43000"/>
+                        </a:srgbClr>
+                      </a:outerShdw>
+                    </a:effectLst>
+                  </pic:spPr>
+                </pic:pic>
+              </a:graphicData>
+            </a:graphic>
+          </wp:inline>
+        </w:drawing>
+      </w:r>
+    </w:p>
+    <w:p>
+      <w:pPr>
+        <w:spacing w:line="360" w:lineRule="auto"/>
+        <w:rPr>
+          <w:b/>
+          <w:bCs/>
+          <w:szCs w:val="24"/>
+        </w:rPr>
+      </w:pPr>
+    </w:p>
+    <w:p>
+      <w:pPr>
+        <w:spacing w:line="360" w:lineRule="auto"/>
+        <w:rPr>
+          <w:b/>
+          <w:bCs/>
+          <w:szCs w:val="24"/>
+        </w:rPr>
+      </w:pPr>
+      <w:r>
+        <w:rPr>
+          <w:b/>
+          <w:bCs/>
+          <w:szCs w:val="24"/>
+        </w:rPr>
+        <w:lastRenderedPageBreak/>
+        <w:drawing>
+          <wp:inline distT="0" distB="0" distL="0" distR="0" wp14:anchorId="2DE60D16" wp14:editId="2FA9DD7A">
+            <wp:extent cx="4190120" cy="1962150"/>
+            <wp:effectExtent l="76200" t="76200" r="134620" b="133350"/>
+            <wp:docPr id="6" name="Imagem 6"/>
+            <wp:cNvGraphicFramePr>
+              <a:graphicFrameLocks xmlns:a="http://schemas.openxmlformats.org/drawingml/2006/main" noChangeAspect="1"/>
+            </wp:cNvGraphicFramePr>
+            <a:graphic xmlns:a="http://schemas.openxmlformats.org/drawingml/2006/main">
+              <a:graphicData uri="http://schemas.openxmlformats.org/drawingml/2006/picture">
+                <pic:pic xmlns:pic="http://schemas.openxmlformats.org/drawingml/2006/picture">
+                  <pic:nvPicPr>
+                    <pic:cNvPr id="1" name=""/>
+                    <pic:cNvPicPr/>
+                  </pic:nvPicPr>
+                  <pic:blipFill>
+                    <a:blip r:embed="rId15"/>
+                    <a:stretch>
+                      <a:fillRect/>
+                    </a:stretch>
+                  </pic:blipFill>
+                  <pic:spPr>
+                    <a:xfrm>
+                      <a:off x="0" y="0"/>
+                      <a:ext cx="4226603" cy="1979234"/>
+                    </a:xfrm>
+                    <a:prstGeom prst="rect">
+                      <a:avLst/>
+                    </a:prstGeom>
+                    <a:ln w="38100" cap="sq">
+                      <a:solidFill>
+                        <a:srgbClr val="000000"/>
+                      </a:solidFill>
+                      <a:prstDash val="solid"/>
+                      <a:miter lim="800000"/>
+                    </a:ln>
+                    <a:effectLst>
+                      <a:outerShdw blurRad="50800" dist="38100" dir="2700000" algn="tl" rotWithShape="0">
+                        <a:srgbClr val="000000">
+                          <a:alpha val="43000"/>
+                        </a:srgbClr>
+                      </a:outerShdw>
+                    </a:effectLst>
+                  </pic:spPr>
+                </pic:pic>
+              </a:graphicData>
+            </a:graphic>
+          </wp:inline>
+        </w:drawing>
+      </w:r>
+    </w:p>
+    <w:p>
+      <w:pPr>
+        <w:spacing w:line="360" w:lineRule="auto"/>
+        <w:rPr>
+          <w:b/>
+          <w:bCs/>
+          <w:szCs w:val="24"/>
+        </w:rPr>
+      </w:pPr>
+      <w:r>
+        <w:rPr>
+          <w:b/>
+          <w:bCs/>
+          <w:szCs w:val="24"/>
+        </w:rPr>
+        <w:drawing>
+          <wp:inline distT="0" distB="0" distL="0" distR="0" wp14:anchorId="1DAA226A" wp14:editId="13B66BD7">
+            <wp:extent cx="4178300" cy="1882775"/>
+            <wp:effectExtent l="76200" t="76200" r="127000" b="136525"/>
+            <wp:docPr id="7" name="Imagem 7"/>
+            <wp:cNvGraphicFramePr>
+              <a:graphicFrameLocks xmlns:a="http://schemas.openxmlformats.org/drawingml/2006/main" noChangeAspect="1"/>
+            </wp:cNvGraphicFramePr>
+            <a:graphic xmlns:a="http://schemas.openxmlformats.org/drawingml/2006/main">
+              <a:graphicData uri="http://schemas.openxmlformats.org/drawingml/2006/picture">
+                <pic:pic xmlns:pic="http://schemas.openxmlformats.org/drawingml/2006/picture">
+                  <pic:nvPicPr>
+                    <pic:cNvPr id="1" name=""/>
+                    <pic:cNvPicPr/>
+                  </pic:nvPicPr>
+                  <pic:blipFill>
+                    <a:blip r:embed="rId16"/>
+                    <a:stretch>
+                      <a:fillRect/>
+                    </a:stretch>
+                  </pic:blipFill>
+                  <pic:spPr>
+                    <a:xfrm>
+                      <a:off x="0" y="0"/>
+                      <a:ext cx="4178300" cy="1882775"/>
+                    </a:xfrm>
+                    <a:prstGeom prst="rect">
+                      <a:avLst/>
+                    </a:prstGeom>
+                    <a:ln w="38100" cap="sq">
+                      <a:solidFill>
+                        <a:srgbClr val="000000"/>
+                      </a:solidFill>
+                      <a:prstDash val="solid"/>
+                      <a:miter lim="800000"/>
+                    </a:ln>
+                    <a:effectLst>
+                      <a:outerShdw blurRad="50800" dist="38100" dir="2700000" algn="tl" rotWithShape="0">
+                        <a:srgbClr val="000000">
+                          <a:alpha val="43000"/>
+                        </a:srgbClr>
+                      </a:outerShdw>
+                    </a:effectLst>
+                  </pic:spPr>
+                </pic:pic>
+              </a:graphicData>
+            </a:graphic>
+          </wp:inline>
+        </w:drawing>
+      </w:r>
+    </w:p>
+    <w:p>
+      <w:pPr>
+        <w:spacing w:line="360" w:lineRule="auto"/>
+        <w:rPr>
+          <w:b/>
+          <w:bCs/>
+          <w:szCs w:val="24"/>
+        </w:rPr>
+      </w:pPr>
+      <w:r>
+        <w:rPr>
+          <w:b/>
+          <w:bCs/>
+          <w:szCs w:val="24"/>
+        </w:rPr>
+        <w:drawing>
+          <wp:inline distT="0" distB="0" distL="0" distR="0" wp14:anchorId="6DE05117" wp14:editId="732AFCE8">
+            <wp:extent cx="4171950" cy="2349276"/>
+            <wp:effectExtent l="76200" t="76200" r="133350" b="127635"/>
+            <wp:docPr id="8" name="Imagem 8"/>
+            <wp:cNvGraphicFramePr>
+              <a:graphicFrameLocks xmlns:a="http://schemas.openxmlformats.org/drawingml/2006/main" noChangeAspect="1"/>
+            </wp:cNvGraphicFramePr>
+            <a:graphic xmlns:a="http://schemas.openxmlformats.org/drawingml/2006/main">
+              <a:graphicData uri="http://schemas.openxmlformats.org/drawingml/2006/picture">
+                <pic:pic xmlns:pic="http://schemas.openxmlformats.org/drawingml/2006/picture">
+                  <pic:nvPicPr>
+                    <pic:cNvPr id="1" name=""/>
+                    <pic:cNvPicPr/>
+                  </pic:nvPicPr>
+                  <pic:blipFill>
+                    <a:blip r:embed="rId17"/>
+                    <a:stretch>
+                      <a:fillRect/>
+                    </a:stretch>
+                  </pic:blipFill>
+                  <pic:spPr>
+                    <a:xfrm>
+                      <a:off x="0" y="0"/>
+                      <a:ext cx="4191665" cy="2360378"/>
+                    </a:xfrm>
+                    <a:prstGeom prst="rect">
+                      <a:avLst/>
+                    </a:prstGeom>
+                    <a:ln w="38100" cap="sq">
+                      <a:solidFill>
+                        <a:srgbClr val="000000"/>
+                      </a:solidFill>
+                      <a:prstDash val="solid"/>
+                      <a:miter lim="800000"/>
+                    </a:ln>
+                    <a:effectLst>
+                      <a:outerShdw blurRad="50800" dist="38100" dir="2700000" algn="tl" rotWithShape="0">
+                        <a:srgbClr val="000000">
+                          <a:alpha val="43000"/>
+                        </a:srgbClr>
+                      </a:outerShdw>
+                    </a:effectLst>
+                  </pic:spPr>
+                </pic:pic>
+              </a:graphicData>
+            </a:graphic>
+          </wp:inline>
+        </w:drawing>
+      </w:r>
+    </w:p>
+    <w:p>
+      <w:pPr>
+        <w:spacing w:line="360" w:lineRule="auto"/>
+        <w:rPr>
+          <w:b/>
+          <w:bCs/>
+          <w:szCs w:val="24"/>
+        </w:rPr>
+      </w:pPr>
+      <w:r>
+        <w:rPr>
+          <w:b/>
+          <w:bCs/>
+          <w:szCs w:val="24"/>
+        </w:rPr>
+        <w:lastRenderedPageBreak/>
+        <w:drawing>
+          <wp:inline distT="0" distB="0" distL="0" distR="0" wp14:anchorId="67482253" wp14:editId="7E355C77">
+            <wp:extent cx="4381551" cy="2482215"/>
+            <wp:effectExtent l="76200" t="76200" r="133350" b="127635"/>
+            <wp:docPr id="9" name="Imagem 9"/>
+            <wp:cNvGraphicFramePr>
+              <a:graphicFrameLocks xmlns:a="http://schemas.openxmlformats.org/drawingml/2006/main" noChangeAspect="1"/>
+            </wp:cNvGraphicFramePr>
+            <a:graphic xmlns:a="http://schemas.openxmlformats.org/drawingml/2006/main">
+              <a:graphicData uri="http://schemas.openxmlformats.org/drawingml/2006/picture">
+                <pic:pic xmlns:pic="http://schemas.openxmlformats.org/drawingml/2006/picture">
+                  <pic:nvPicPr>
+                    <pic:cNvPr id="1" name=""/>
+                    <pic:cNvPicPr/>
+                  </pic:nvPicPr>
+                  <pic:blipFill>
+                    <a:blip r:embed="rId18"/>
+                    <a:stretch>
+                      <a:fillRect/>
+                    </a:stretch>
+                  </pic:blipFill>
+                  <pic:spPr>
+                    <a:xfrm>
+                      <a:off x="0" y="0"/>
+                      <a:ext cx="4397701" cy="2491364"/>
+                    </a:xfrm>
+                    <a:prstGeom prst="rect">
+                      <a:avLst/>
+                    </a:prstGeom>
+                    <a:ln w="38100" cap="sq">
+                      <a:solidFill>
+                        <a:srgbClr val="000000"/>
+                      </a:solidFill>
+                      <a:prstDash val="solid"/>
+                      <a:miter lim="800000"/>
+                    </a:ln>
+                    <a:effectLst>
+                      <a:outerShdw blurRad="50800" dist="38100" dir="2700000" algn="tl" rotWithShape="0">
+                        <a:srgbClr val="000000">
+                          <a:alpha val="43000"/>
+                        </a:srgbClr>
+                      </a:outerShdw>
+                    </a:effectLst>
+                  </pic:spPr>
+                </pic:pic>
+              </a:graphicData>
+            </a:graphic>
+          </wp:inline>
+        </w:drawing>
+      </w:r>
+    </w:p>
+    <w:p>
+      <w:pPr>
+        <w:spacing w:line="360" w:lineRule="auto"/>
+        <w:rPr>
+          <w:b/>
+          <w:bCs/>
+          <w:szCs w:val="24"/>
+        </w:rPr>
+      </w:pPr>
+      <w:r>
+        <w:rPr>
+          <w:b/>
+          <w:bCs/>
+          <w:szCs w:val="24"/>
+        </w:rPr>
+        <w:drawing>
+          <wp:inline distT="0" distB="0" distL="0" distR="0" wp14:anchorId="1F3AC781" wp14:editId="382D1FDE">
+            <wp:extent cx="4432300" cy="2174600"/>
+            <wp:effectExtent l="76200" t="76200" r="139700" b="130810"/>
+            <wp:docPr id="10" name="Imagem 10"/>
+            <wp:cNvGraphicFramePr>
+              <a:graphicFrameLocks xmlns:a="http://schemas.openxmlformats.org/drawingml/2006/main" noChangeAspect="1"/>
+            </wp:cNvGraphicFramePr>
+            <a:graphic xmlns:a="http://schemas.openxmlformats.org/drawingml/2006/main">
+              <a:graphicData uri="http://schemas.openxmlformats.org/drawingml/2006/picture">
+                <pic:pic xmlns:pic="http://schemas.openxmlformats.org/drawingml/2006/picture">
+                  <pic:nvPicPr>
+                    <pic:cNvPr id="1" name=""/>
+                    <pic:cNvPicPr/>
+                  </pic:nvPicPr>
+                  <pic:blipFill>
+                    <a:blip r:embed="rId19"/>
+                    <a:stretch>
+                      <a:fillRect/>
+                    </a:stretch>
+                  </pic:blipFill>
+                  <pic:spPr>
+                    <a:xfrm>
+                      <a:off x="0" y="0"/>
+                      <a:ext cx="4450563" cy="2183560"/>
+                    </a:xfrm>
+                    <a:prstGeom prst="rect">
+                      <a:avLst/>
+                    </a:prstGeom>
+                    <a:ln w="38100" cap="sq">
+                      <a:solidFill>
+                        <a:srgbClr val="000000"/>
+                      </a:solidFill>
+                      <a:prstDash val="solid"/>
+                      <a:miter lim="800000"/>
+                    </a:ln>
+                    <a:effectLst>
+                      <a:outerShdw blurRad="50800" dist="38100" dir="2700000" algn="tl" rotWithShape="0">
+                        <a:srgbClr val="000000">
+                          <a:alpha val="43000"/>
+                        </a:srgbClr>
+                      </a:outerShdw>
+                    </a:effectLst>
+                  </pic:spPr>
+                </pic:pic>
+              </a:graphicData>
+            </a:graphic>
+          </wp:inline>
+        </w:drawing>
+      </w:r>
+    </w:p>
+    <w:p>
+      <w:pPr>
+        <w:spacing w:line="360" w:lineRule="auto"/>
+        <w:rPr>
+          <w:b/>
+          <w:bCs/>
+          <w:szCs w:val="24"/>
+        </w:rPr>
+      </w:pPr>
+      <w:r>
+        <w:rPr>
+          <w:b/>
+          <w:bCs/>
+          <w:szCs w:val="24"/>
+        </w:rPr>
+        <w:drawing>
+          <wp:inline distT="0" distB="0" distL="0" distR="0" wp14:anchorId="4B4C5FCA" wp14:editId="7DEA3F4B">
+            <wp:extent cx="4512996" cy="2417445"/>
+            <wp:effectExtent l="76200" t="76200" r="135255" b="135255"/>
+            <wp:docPr id="11" name="Imagem 11"/>
+            <wp:cNvGraphicFramePr>
+              <a:graphicFrameLocks xmlns:a="http://schemas.openxmlformats.org/drawingml/2006/main" noChangeAspect="1"/>
+            </wp:cNvGraphicFramePr>
+            <a:graphic xmlns:a="http://schemas.openxmlformats.org/drawingml/2006/main">
+              <a:graphicData uri="http://schemas.openxmlformats.org/drawingml/2006/picture">
+                <pic:pic xmlns:pic="http://schemas.openxmlformats.org/drawingml/2006/picture">
+                  <pic:nvPicPr>
+                    <pic:cNvPr id="1" name=""/>
+                    <pic:cNvPicPr/>
+                  </pic:nvPicPr>
+                  <pic:blipFill>
+                    <a:blip r:embed="rId20"/>
+                    <a:stretch>
+                      <a:fillRect/>
+                    </a:stretch>
+                  </pic:blipFill>
+                  <pic:spPr>
+                    <a:xfrm>
+                      <a:off x="0" y="0"/>
+                      <a:ext cx="4517969" cy="2420109"/>
+                    </a:xfrm>
+                    <a:prstGeom prst="rect">
+                      <a:avLst/>
+                    </a:prstGeom>
+                    <a:ln w="38100" cap="sq">
+                      <a:solidFill>
+                        <a:srgbClr val="000000"/>
+                      </a:solidFill>
+                      <a:prstDash val="solid"/>
+                      <a:miter lim="800000"/>
+                    </a:ln>
+                    <a:effectLst>
+                      <a:outerShdw blurRad="50800" dist="38100" dir="2700000" algn="tl" rotWithShape="0">
+                        <a:srgbClr val="000000">
+                          <a:alpha val="43000"/>
+                        </a:srgbClr>
+                      </a:outerShdw>
+                    </a:effectLst>
                   </pic:spPr>
                 </pic:pic>
               </a:graphicData>
@@ -4213,12 +4867,11 @@
 </file>
 
 <file path=customXml/item1.xml><?xml version="1.0" encoding="utf-8"?>
-<?mso-contentType ?>
-<FormTemplates xmlns="http://schemas.microsoft.com/sharepoint/v3/contenttype/forms">
-  <Display>DocumentLibraryForm</Display>
-  <Edit>DocumentLibraryForm</Edit>
-  <New>DocumentLibraryForm</New>
-</FormTemplates>
+<p:properties xmlns:p="http://schemas.microsoft.com/office/2006/metadata/properties" xmlns:xsi="http://www.w3.org/2001/XMLSchema-instance" xmlns:pc="http://schemas.microsoft.com/office/infopath/2007/PartnerControls">
+  <documentManagement>
+    <ReferenceId xmlns="21e0ce27-b0e2-41aa-a79b-741a4637cbb0" xsi:nil="true"/>
+  </documentManagement>
+</p:properties>
 </file>
 
 <file path=customXml/item2.xml><?xml version="1.0" encoding="utf-8"?>
@@ -4348,17 +5001,20 @@
 </file>
 
 <file path=customXml/item3.xml><?xml version="1.0" encoding="utf-8"?>
-<p:properties xmlns:p="http://schemas.microsoft.com/office/2006/metadata/properties" xmlns:xsi="http://www.w3.org/2001/XMLSchema-instance" xmlns:pc="http://schemas.microsoft.com/office/infopath/2007/PartnerControls">
-  <documentManagement>
-    <ReferenceId xmlns="21e0ce27-b0e2-41aa-a79b-741a4637cbb0" xsi:nil="true"/>
-  </documentManagement>
-</p:properties>
+<?mso-contentType ?>
+<FormTemplates xmlns="http://schemas.microsoft.com/sharepoint/v3/contenttype/forms">
+  <Display>DocumentLibraryForm</Display>
+  <Edit>DocumentLibraryForm</Edit>
+  <New>DocumentLibraryForm</New>
+</FormTemplates>
 </file>
 
 <file path=customXml/itemProps1.xml><?xml version="1.0" encoding="utf-8"?>
-<ds:datastoreItem xmlns:ds="http://schemas.openxmlformats.org/officeDocument/2006/customXml" ds:itemID="{3091FFD0-3601-428E-B685-84AFEE0B15BE}">
+<ds:datastoreItem xmlns:ds="http://schemas.openxmlformats.org/officeDocument/2006/customXml" ds:itemID="{5FE6D219-976A-4CE1-9EDB-A109B2021195}">
   <ds:schemaRefs>
-    <ds:schemaRef ds:uri="http://schemas.microsoft.com/sharepoint/v3/contenttype/forms"/>
+    <ds:schemaRef ds:uri="http://schemas.microsoft.com/office/2006/metadata/properties"/>
+    <ds:schemaRef ds:uri="http://schemas.microsoft.com/office/infopath/2007/PartnerControls"/>
+    <ds:schemaRef ds:uri="21e0ce27-b0e2-41aa-a79b-741a4637cbb0"/>
   </ds:schemaRefs>
 </ds:datastoreItem>
 </file>
@@ -4382,11 +5038,9 @@
 </file>
 
 <file path=customXml/itemProps3.xml><?xml version="1.0" encoding="utf-8"?>
-<ds:datastoreItem xmlns:ds="http://schemas.openxmlformats.org/officeDocument/2006/customXml" ds:itemID="{5FE6D219-976A-4CE1-9EDB-A109B2021195}">
+<ds:datastoreItem xmlns:ds="http://schemas.openxmlformats.org/officeDocument/2006/customXml" ds:itemID="{3091FFD0-3601-428E-B685-84AFEE0B15BE}">
   <ds:schemaRefs>
-    <ds:schemaRef ds:uri="http://schemas.microsoft.com/office/2006/metadata/properties"/>
-    <ds:schemaRef ds:uri="http://schemas.microsoft.com/office/infopath/2007/PartnerControls"/>
-    <ds:schemaRef ds:uri="21e0ce27-b0e2-41aa-a79b-741a4637cbb0"/>
+    <ds:schemaRef ds:uri="http://schemas.microsoft.com/sharepoint/v3/contenttype/forms"/>
   </ds:schemaRefs>
 </ds:datastoreItem>
 </file>
</xml_diff>

<commit_message>
Docs com os valores dos componentes em Tabela
</commit_message>
<xml_diff>
--- a/2026/trabalhos/TCC/Sistemas_Embarcados_HistoriandoFinal.docx
+++ b/2026/trabalhos/TCC/Sistemas_Embarcados_HistoriandoFinal.docx
@@ -1,6 +1,6 @@
 
 <file path=word/document.xml><?xml version="1.0" encoding="utf-8"?>
-<w:document xmlns:wpc="http://schemas.microsoft.com/office/word/2010/wordprocessingCanvas" xmlns:cx="http://schemas.microsoft.com/office/drawing/2014/chartex" xmlns:cx1="http://schemas.microsoft.com/office/drawing/2015/9/8/chartex" xmlns:mc="http://schemas.openxmlformats.org/markup-compatibility/2006" xmlns:o="urn:schemas-microsoft-com:office:office" xmlns:r="http://schemas.openxmlformats.org/officeDocument/2006/relationships" xmlns:m="http://schemas.openxmlformats.org/officeDocument/2006/math" xmlns:v="urn:schemas-microsoft-com:vml" xmlns:wp14="http://schemas.microsoft.com/office/word/2010/wordprocessingDrawing" xmlns:wp="http://schemas.openxmlformats.org/drawingml/2006/wordprocessingDrawing" xmlns:w10="urn:schemas-microsoft-com:office:word" xmlns:w="http://schemas.openxmlformats.org/wordprocessingml/2006/main" xmlns:w14="http://schemas.microsoft.com/office/word/2010/wordml" xmlns:w15="http://schemas.microsoft.com/office/word/2012/wordml" xmlns:w16se="http://schemas.microsoft.com/office/word/2015/wordml/symex" xmlns:wpg="http://schemas.microsoft.com/office/word/2010/wordprocessingGroup" xmlns:wpi="http://schemas.microsoft.com/office/word/2010/wordprocessingInk" xmlns:wne="http://schemas.microsoft.com/office/word/2006/wordml" xmlns:wps="http://schemas.microsoft.com/office/word/2010/wordprocessingShape" mc:Ignorable="w14 w15 w16se wp14">
+<w:document xmlns:wpc="http://schemas.microsoft.com/office/word/2010/wordprocessingCanvas" xmlns:cx="http://schemas.microsoft.com/office/drawing/2014/chartex" xmlns:cx1="http://schemas.microsoft.com/office/drawing/2015/9/8/chartex" xmlns:cx2="http://schemas.microsoft.com/office/drawing/2015/10/21/chartex" xmlns:cx3="http://schemas.microsoft.com/office/drawing/2016/5/9/chartex" xmlns:cx4="http://schemas.microsoft.com/office/drawing/2016/5/10/chartex" xmlns:cx5="http://schemas.microsoft.com/office/drawing/2016/5/11/chartex" xmlns:cx6="http://schemas.microsoft.com/office/drawing/2016/5/12/chartex" xmlns:cx7="http://schemas.microsoft.com/office/drawing/2016/5/13/chartex" xmlns:cx8="http://schemas.microsoft.com/office/drawing/2016/5/14/chartex" xmlns:mc="http://schemas.openxmlformats.org/markup-compatibility/2006" xmlns:aink="http://schemas.microsoft.com/office/drawing/2016/ink" xmlns:am3d="http://schemas.microsoft.com/office/drawing/2017/model3d" xmlns:o="urn:schemas-microsoft-com:office:office" xmlns:oel="http://schemas.microsoft.com/office/2019/extlst" xmlns:r="http://schemas.openxmlformats.org/officeDocument/2006/relationships" xmlns:m="http://schemas.openxmlformats.org/officeDocument/2006/math" xmlns:v="urn:schemas-microsoft-com:vml" xmlns:wp14="http://schemas.microsoft.com/office/word/2010/wordprocessingDrawing" xmlns:wp="http://schemas.openxmlformats.org/drawingml/2006/wordprocessingDrawing" xmlns:w10="urn:schemas-microsoft-com:office:word" xmlns:w="http://schemas.openxmlformats.org/wordprocessingml/2006/main" xmlns:w14="http://schemas.microsoft.com/office/word/2010/wordml" xmlns:w15="http://schemas.microsoft.com/office/word/2012/wordml" xmlns:w16cex="http://schemas.microsoft.com/office/word/2018/wordml/cex" xmlns:w16cid="http://schemas.microsoft.com/office/word/2016/wordml/cid" xmlns:w16="http://schemas.microsoft.com/office/word/2018/wordml" xmlns:w16du="http://schemas.microsoft.com/office/word/2023/wordml/word16du" xmlns:w16sdtdh="http://schemas.microsoft.com/office/word/2020/wordml/sdtdatahash" xmlns:w16sdtfl="http://schemas.microsoft.com/office/word/2024/wordml/sdtformatlock" xmlns:w16se="http://schemas.microsoft.com/office/word/2015/wordml/symex" xmlns:wpg="http://schemas.microsoft.com/office/word/2010/wordprocessingGroup" xmlns:wpi="http://schemas.microsoft.com/office/word/2010/wordprocessingInk" xmlns:wne="http://schemas.microsoft.com/office/word/2006/wordml" xmlns:wps="http://schemas.microsoft.com/office/word/2010/wordprocessingShape" mc:Ignorable="w14 w15 w16se w16cid w16 w16cex w16sdtdh w16sdtfl w16du wp14">
   <w:body>
     <w:p>
       <w:pPr>
@@ -657,7 +657,7 @@
           <w:lang w:eastAsia="pt-BR"/>
         </w:rPr>
         <w:drawing>
-          <wp:inline distT="0" distB="0" distL="0" distR="0" wp14:anchorId="4FD6C4E9" wp14:editId="0EA02DC2">
+          <wp:inline distT="0" distB="0" distL="0" distR="0" wp14:anchorId="4FD6C4E9" wp14:editId="74766065">
             <wp:extent cx="5760085" cy="3261995"/>
             <wp:effectExtent l="0" t="0" r="0" b="0"/>
             <wp:docPr id="1" name="Imagem 1"/>
@@ -762,23 +762,7 @@
           <w:bCs/>
           <w:szCs w:val="24"/>
         </w:rPr>
-        <w:t xml:space="preserve">um </w:t>
-      </w:r>
-      <w:proofErr w:type="spellStart"/>
-      <w:r>
-        <w:rPr>
-          <w:bCs/>
-          <w:szCs w:val="24"/>
-        </w:rPr>
-        <w:t>Arduino</w:t>
-      </w:r>
-      <w:proofErr w:type="spellEnd"/>
-      <w:r>
-        <w:rPr>
-          <w:bCs/>
-          <w:szCs w:val="24"/>
-        </w:rPr>
-        <w:t xml:space="preserve"> UNO</w:t>
+        <w:t>um Arduino UNO</w:t>
       </w:r>
       <w:r>
         <w:rPr>
@@ -1115,7 +1099,6 @@
         </w:rPr>
         <w:t xml:space="preserve">  </w:t>
       </w:r>
-      <w:proofErr w:type="gramStart"/>
       <w:r>
         <w:rPr>
           <w:rFonts w:ascii="Consolas" w:eastAsia="Times New Roman" w:hAnsi="Consolas" w:cs="Times New Roman"/>
@@ -1126,7 +1109,6 @@
         </w:rPr>
         <w:t>false</w:t>
       </w:r>
-      <w:proofErr w:type="gramEnd"/>
       <w:r>
         <w:rPr>
           <w:rFonts w:ascii="Consolas" w:eastAsia="Times New Roman" w:hAnsi="Consolas" w:cs="Times New Roman"/>
@@ -1368,16 +1350,1225 @@
         </w:rPr>
       </w:pPr>
       <w:proofErr w:type="spellStart"/>
+      <w:r>
+        <w:rPr>
+          <w:rFonts w:ascii="Consolas" w:eastAsia="Times New Roman" w:hAnsi="Consolas" w:cs="Times New Roman"/>
+          <w:color w:val="0000FF"/>
+          <w:sz w:val="21"/>
+          <w:szCs w:val="21"/>
+          <w:lang w:eastAsia="pt-BR"/>
+        </w:rPr>
+        <w:t>void</w:t>
+      </w:r>
+      <w:proofErr w:type="spellEnd"/>
+      <w:r>
+        <w:rPr>
+          <w:rFonts w:ascii="Consolas" w:eastAsia="Times New Roman" w:hAnsi="Consolas" w:cs="Times New Roman"/>
+          <w:color w:val="000000"/>
+          <w:sz w:val="21"/>
+          <w:szCs w:val="21"/>
+          <w:lang w:eastAsia="pt-BR"/>
+        </w:rPr>
+        <w:t xml:space="preserve"> </w:t>
+      </w:r>
       <w:proofErr w:type="gramStart"/>
       <w:r>
         <w:rPr>
           <w:rFonts w:ascii="Consolas" w:eastAsia="Times New Roman" w:hAnsi="Consolas" w:cs="Times New Roman"/>
+          <w:color w:val="5E6D03"/>
+          <w:sz w:val="21"/>
+          <w:szCs w:val="21"/>
+          <w:lang w:eastAsia="pt-BR"/>
+        </w:rPr>
+        <w:t>setup</w:t>
+      </w:r>
+      <w:r>
+        <w:rPr>
+          <w:rFonts w:ascii="Consolas" w:eastAsia="Times New Roman" w:hAnsi="Consolas" w:cs="Times New Roman"/>
+          <w:color w:val="000000"/>
+          <w:sz w:val="21"/>
+          <w:szCs w:val="21"/>
+          <w:lang w:eastAsia="pt-BR"/>
+        </w:rPr>
+        <w:t>(</w:t>
+      </w:r>
+      <w:proofErr w:type="gramEnd"/>
+      <w:r>
+        <w:rPr>
+          <w:rFonts w:ascii="Consolas" w:eastAsia="Times New Roman" w:hAnsi="Consolas" w:cs="Times New Roman"/>
+          <w:color w:val="000000"/>
+          <w:sz w:val="21"/>
+          <w:szCs w:val="21"/>
+          <w:lang w:eastAsia="pt-BR"/>
+        </w:rPr>
+        <w:t>) {</w:t>
+      </w:r>
+    </w:p>
+    <w:p>
+      <w:pPr>
+        <w:shd w:val="clear" w:color="auto" w:fill="FFFFFE"/>
+        <w:spacing w:after="0" w:line="285" w:lineRule="atLeast"/>
+        <w:rPr>
+          <w:rFonts w:ascii="Consolas" w:eastAsia="Times New Roman" w:hAnsi="Consolas" w:cs="Times New Roman"/>
+          <w:color w:val="000000"/>
+          <w:sz w:val="21"/>
+          <w:szCs w:val="21"/>
+          <w:lang w:eastAsia="pt-BR"/>
+        </w:rPr>
+      </w:pPr>
+    </w:p>
+    <w:p>
+      <w:pPr>
+        <w:shd w:val="clear" w:color="auto" w:fill="FFFFFE"/>
+        <w:spacing w:after="0" w:line="285" w:lineRule="atLeast"/>
+        <w:rPr>
+          <w:rFonts w:ascii="Consolas" w:eastAsia="Times New Roman" w:hAnsi="Consolas" w:cs="Times New Roman"/>
+          <w:color w:val="000000"/>
+          <w:sz w:val="21"/>
+          <w:szCs w:val="21"/>
+          <w:lang w:eastAsia="pt-BR"/>
+        </w:rPr>
+      </w:pPr>
+      <w:r>
+        <w:rPr>
+          <w:rFonts w:ascii="Consolas" w:eastAsia="Times New Roman" w:hAnsi="Consolas" w:cs="Times New Roman"/>
+          <w:color w:val="000000"/>
+          <w:sz w:val="21"/>
+          <w:szCs w:val="21"/>
+          <w:lang w:eastAsia="pt-BR"/>
+        </w:rPr>
+        <w:t>// define os pinos do componente módulo Joystick e o pino do botão (2)</w:t>
+      </w:r>
+    </w:p>
+    <w:p>
+      <w:pPr>
+        <w:shd w:val="clear" w:color="auto" w:fill="FFFFFE"/>
+        <w:spacing w:after="0" w:line="285" w:lineRule="atLeast"/>
+        <w:rPr>
+          <w:rFonts w:ascii="Consolas" w:eastAsia="Times New Roman" w:hAnsi="Consolas" w:cs="Times New Roman"/>
+          <w:color w:val="000000"/>
+          <w:sz w:val="21"/>
+          <w:szCs w:val="21"/>
+          <w:lang w:eastAsia="pt-BR"/>
+        </w:rPr>
+      </w:pPr>
+      <w:r>
+        <w:rPr>
+          <w:rFonts w:ascii="Consolas" w:eastAsia="Times New Roman" w:hAnsi="Consolas" w:cs="Times New Roman"/>
+          <w:color w:val="000000"/>
+          <w:sz w:val="21"/>
+          <w:szCs w:val="21"/>
+          <w:lang w:eastAsia="pt-BR"/>
+        </w:rPr>
+        <w:t xml:space="preserve">  </w:t>
+      </w:r>
+      <w:proofErr w:type="spellStart"/>
+      <w:proofErr w:type="gramStart"/>
+      <w:r>
+        <w:rPr>
+          <w:rFonts w:ascii="Consolas" w:eastAsia="Times New Roman" w:hAnsi="Consolas" w:cs="Times New Roman"/>
+          <w:color w:val="E97366"/>
+          <w:sz w:val="21"/>
+          <w:szCs w:val="21"/>
+          <w:lang w:eastAsia="pt-BR"/>
+        </w:rPr>
+        <w:t>pinMode</w:t>
+      </w:r>
+      <w:proofErr w:type="spellEnd"/>
+      <w:r>
+        <w:rPr>
+          <w:rFonts w:ascii="Consolas" w:eastAsia="Times New Roman" w:hAnsi="Consolas" w:cs="Times New Roman"/>
+          <w:color w:val="000000"/>
+          <w:sz w:val="21"/>
+          <w:szCs w:val="21"/>
+          <w:lang w:eastAsia="pt-BR"/>
+        </w:rPr>
+        <w:t>(</w:t>
+      </w:r>
+      <w:proofErr w:type="gramEnd"/>
+      <w:r>
+        <w:rPr>
+          <w:rFonts w:ascii="Consolas" w:eastAsia="Times New Roman" w:hAnsi="Consolas" w:cs="Times New Roman"/>
+          <w:color w:val="00979C"/>
+          <w:sz w:val="21"/>
+          <w:szCs w:val="21"/>
+          <w:lang w:eastAsia="pt-BR"/>
+        </w:rPr>
+        <w:t>A0</w:t>
+      </w:r>
+      <w:r>
+        <w:rPr>
+          <w:rFonts w:ascii="Consolas" w:eastAsia="Times New Roman" w:hAnsi="Consolas" w:cs="Times New Roman"/>
+          <w:color w:val="000000"/>
+          <w:sz w:val="21"/>
+          <w:szCs w:val="21"/>
+          <w:lang w:eastAsia="pt-BR"/>
+        </w:rPr>
+        <w:t xml:space="preserve">, </w:t>
+      </w:r>
+      <w:r>
+        <w:rPr>
+          <w:rFonts w:ascii="Consolas" w:eastAsia="Times New Roman" w:hAnsi="Consolas" w:cs="Times New Roman"/>
+          <w:color w:val="00979C"/>
+          <w:sz w:val="21"/>
+          <w:szCs w:val="21"/>
+          <w:lang w:eastAsia="pt-BR"/>
+        </w:rPr>
+        <w:t>INPUT</w:t>
+      </w:r>
+      <w:r>
+        <w:rPr>
+          <w:rFonts w:ascii="Consolas" w:eastAsia="Times New Roman" w:hAnsi="Consolas" w:cs="Times New Roman"/>
+          <w:color w:val="000000"/>
+          <w:sz w:val="21"/>
+          <w:szCs w:val="21"/>
+          <w:lang w:eastAsia="pt-BR"/>
+        </w:rPr>
+        <w:t>);</w:t>
+      </w:r>
+    </w:p>
+    <w:p>
+      <w:pPr>
+        <w:shd w:val="clear" w:color="auto" w:fill="FFFFFE"/>
+        <w:spacing w:after="0" w:line="285" w:lineRule="atLeast"/>
+        <w:rPr>
+          <w:rFonts w:ascii="Consolas" w:eastAsia="Times New Roman" w:hAnsi="Consolas" w:cs="Times New Roman"/>
+          <w:color w:val="000000"/>
+          <w:sz w:val="21"/>
+          <w:szCs w:val="21"/>
+          <w:lang w:eastAsia="pt-BR"/>
+        </w:rPr>
+      </w:pPr>
+      <w:r>
+        <w:rPr>
+          <w:rFonts w:ascii="Consolas" w:eastAsia="Times New Roman" w:hAnsi="Consolas" w:cs="Times New Roman"/>
+          <w:color w:val="000000"/>
+          <w:sz w:val="21"/>
+          <w:szCs w:val="21"/>
+          <w:lang w:eastAsia="pt-BR"/>
+        </w:rPr>
+        <w:lastRenderedPageBreak/>
+        <w:t xml:space="preserve">  </w:t>
+      </w:r>
+      <w:proofErr w:type="spellStart"/>
+      <w:proofErr w:type="gramStart"/>
+      <w:r>
+        <w:rPr>
+          <w:rFonts w:ascii="Consolas" w:eastAsia="Times New Roman" w:hAnsi="Consolas" w:cs="Times New Roman"/>
+          <w:color w:val="E97366"/>
+          <w:sz w:val="21"/>
+          <w:szCs w:val="21"/>
+          <w:lang w:eastAsia="pt-BR"/>
+        </w:rPr>
+        <w:t>pinMode</w:t>
+      </w:r>
+      <w:proofErr w:type="spellEnd"/>
+      <w:r>
+        <w:rPr>
+          <w:rFonts w:ascii="Consolas" w:eastAsia="Times New Roman" w:hAnsi="Consolas" w:cs="Times New Roman"/>
+          <w:color w:val="000000"/>
+          <w:sz w:val="21"/>
+          <w:szCs w:val="21"/>
+          <w:lang w:eastAsia="pt-BR"/>
+        </w:rPr>
+        <w:t>(</w:t>
+      </w:r>
+      <w:proofErr w:type="gramEnd"/>
+      <w:r>
+        <w:rPr>
+          <w:rFonts w:ascii="Consolas" w:eastAsia="Times New Roman" w:hAnsi="Consolas" w:cs="Times New Roman"/>
+          <w:color w:val="00979C"/>
+          <w:sz w:val="21"/>
+          <w:szCs w:val="21"/>
+          <w:lang w:eastAsia="pt-BR"/>
+        </w:rPr>
+        <w:t>A1</w:t>
+      </w:r>
+      <w:r>
+        <w:rPr>
+          <w:rFonts w:ascii="Consolas" w:eastAsia="Times New Roman" w:hAnsi="Consolas" w:cs="Times New Roman"/>
+          <w:color w:val="000000"/>
+          <w:sz w:val="21"/>
+          <w:szCs w:val="21"/>
+          <w:lang w:eastAsia="pt-BR"/>
+        </w:rPr>
+        <w:t xml:space="preserve">, </w:t>
+      </w:r>
+      <w:r>
+        <w:rPr>
+          <w:rFonts w:ascii="Consolas" w:eastAsia="Times New Roman" w:hAnsi="Consolas" w:cs="Times New Roman"/>
+          <w:color w:val="00979C"/>
+          <w:sz w:val="21"/>
+          <w:szCs w:val="21"/>
+          <w:lang w:eastAsia="pt-BR"/>
+        </w:rPr>
+        <w:t>INPUT</w:t>
+      </w:r>
+      <w:r>
+        <w:rPr>
+          <w:rFonts w:ascii="Consolas" w:eastAsia="Times New Roman" w:hAnsi="Consolas" w:cs="Times New Roman"/>
+          <w:color w:val="000000"/>
+          <w:sz w:val="21"/>
+          <w:szCs w:val="21"/>
+          <w:lang w:eastAsia="pt-BR"/>
+        </w:rPr>
+        <w:t>);</w:t>
+      </w:r>
+    </w:p>
+    <w:p>
+      <w:pPr>
+        <w:shd w:val="clear" w:color="auto" w:fill="FFFFFE"/>
+        <w:spacing w:after="0" w:line="285" w:lineRule="atLeast"/>
+        <w:rPr>
+          <w:rFonts w:ascii="Consolas" w:eastAsia="Times New Roman" w:hAnsi="Consolas" w:cs="Times New Roman"/>
+          <w:color w:val="000000"/>
+          <w:sz w:val="21"/>
+          <w:szCs w:val="21"/>
+          <w:lang w:eastAsia="pt-BR"/>
+        </w:rPr>
+      </w:pPr>
+      <w:r>
+        <w:rPr>
+          <w:rFonts w:ascii="Consolas" w:eastAsia="Times New Roman" w:hAnsi="Consolas" w:cs="Times New Roman"/>
+          <w:color w:val="000000"/>
+          <w:sz w:val="21"/>
+          <w:szCs w:val="21"/>
+          <w:lang w:eastAsia="pt-BR"/>
+        </w:rPr>
+        <w:t xml:space="preserve">  </w:t>
+      </w:r>
+      <w:proofErr w:type="spellStart"/>
+      <w:proofErr w:type="gramStart"/>
+      <w:r>
+        <w:rPr>
+          <w:rFonts w:ascii="Consolas" w:eastAsia="Times New Roman" w:hAnsi="Consolas" w:cs="Times New Roman"/>
+          <w:color w:val="E97366"/>
+          <w:sz w:val="21"/>
+          <w:szCs w:val="21"/>
+          <w:lang w:eastAsia="pt-BR"/>
+        </w:rPr>
+        <w:t>pinMode</w:t>
+      </w:r>
+      <w:proofErr w:type="spellEnd"/>
+      <w:r>
+        <w:rPr>
+          <w:rFonts w:ascii="Consolas" w:eastAsia="Times New Roman" w:hAnsi="Consolas" w:cs="Times New Roman"/>
+          <w:color w:val="000000"/>
+          <w:sz w:val="21"/>
+          <w:szCs w:val="21"/>
+          <w:lang w:eastAsia="pt-BR"/>
+        </w:rPr>
+        <w:t>(</w:t>
+      </w:r>
+      <w:proofErr w:type="gramEnd"/>
+      <w:r>
+        <w:rPr>
+          <w:rFonts w:ascii="Consolas" w:eastAsia="Times New Roman" w:hAnsi="Consolas" w:cs="Times New Roman"/>
+          <w:color w:val="098658"/>
+          <w:sz w:val="21"/>
+          <w:szCs w:val="21"/>
+          <w:lang w:eastAsia="pt-BR"/>
+        </w:rPr>
+        <w:t>2</w:t>
+      </w:r>
+      <w:r>
+        <w:rPr>
+          <w:rFonts w:ascii="Consolas" w:eastAsia="Times New Roman" w:hAnsi="Consolas" w:cs="Times New Roman"/>
+          <w:color w:val="000000"/>
+          <w:sz w:val="21"/>
+          <w:szCs w:val="21"/>
+          <w:lang w:eastAsia="pt-BR"/>
+        </w:rPr>
+        <w:t xml:space="preserve">, </w:t>
+      </w:r>
+      <w:r>
+        <w:rPr>
+          <w:rFonts w:ascii="Consolas" w:eastAsia="Times New Roman" w:hAnsi="Consolas" w:cs="Times New Roman"/>
+          <w:color w:val="00979C"/>
+          <w:sz w:val="21"/>
+          <w:szCs w:val="21"/>
+          <w:lang w:eastAsia="pt-BR"/>
+        </w:rPr>
+        <w:t>INPUT_PULLUP</w:t>
+      </w:r>
+      <w:r>
+        <w:rPr>
+          <w:rFonts w:ascii="Consolas" w:eastAsia="Times New Roman" w:hAnsi="Consolas" w:cs="Times New Roman"/>
+          <w:color w:val="000000"/>
+          <w:sz w:val="21"/>
+          <w:szCs w:val="21"/>
+          <w:lang w:eastAsia="pt-BR"/>
+        </w:rPr>
+        <w:t>);</w:t>
+      </w:r>
+    </w:p>
+    <w:p>
+      <w:pPr>
+        <w:shd w:val="clear" w:color="auto" w:fill="FFFFFE"/>
+        <w:spacing w:after="0" w:line="285" w:lineRule="atLeast"/>
+        <w:rPr>
+          <w:rFonts w:ascii="Consolas" w:eastAsia="Times New Roman" w:hAnsi="Consolas" w:cs="Times New Roman"/>
+          <w:color w:val="000000"/>
+          <w:sz w:val="21"/>
+          <w:szCs w:val="21"/>
+          <w:lang w:eastAsia="pt-BR"/>
+        </w:rPr>
+      </w:pPr>
+    </w:p>
+    <w:p>
+      <w:pPr>
+        <w:shd w:val="clear" w:color="auto" w:fill="FFFFFE"/>
+        <w:spacing w:after="0" w:line="285" w:lineRule="atLeast"/>
+        <w:rPr>
+          <w:rFonts w:ascii="Consolas" w:eastAsia="Times New Roman" w:hAnsi="Consolas" w:cs="Times New Roman"/>
+          <w:color w:val="000000"/>
+          <w:sz w:val="21"/>
+          <w:szCs w:val="21"/>
+          <w:lang w:eastAsia="pt-BR"/>
+        </w:rPr>
+      </w:pPr>
+      <w:r>
+        <w:rPr>
+          <w:rFonts w:ascii="Consolas" w:eastAsia="Times New Roman" w:hAnsi="Consolas" w:cs="Times New Roman"/>
+          <w:color w:val="000000"/>
+          <w:sz w:val="21"/>
+          <w:szCs w:val="21"/>
+          <w:lang w:eastAsia="pt-BR"/>
+        </w:rPr>
+        <w:t xml:space="preserve">  </w:t>
+      </w:r>
+      <w:proofErr w:type="spellStart"/>
+      <w:r>
+        <w:rPr>
+          <w:rFonts w:ascii="Consolas" w:eastAsia="Times New Roman" w:hAnsi="Consolas" w:cs="Times New Roman"/>
+          <w:color w:val="000000"/>
+          <w:sz w:val="21"/>
+          <w:szCs w:val="21"/>
+          <w:lang w:eastAsia="pt-BR"/>
+        </w:rPr>
+        <w:t>Joystick.</w:t>
+      </w:r>
+      <w:r>
+        <w:rPr>
+          <w:rFonts w:ascii="Consolas" w:eastAsia="Times New Roman" w:hAnsi="Consolas" w:cs="Times New Roman"/>
+          <w:color w:val="E97366"/>
+          <w:sz w:val="21"/>
+          <w:szCs w:val="21"/>
+          <w:lang w:eastAsia="pt-BR"/>
+        </w:rPr>
+        <w:t>begin</w:t>
+      </w:r>
+      <w:proofErr w:type="spellEnd"/>
+      <w:r>
+        <w:rPr>
+          <w:rFonts w:ascii="Consolas" w:eastAsia="Times New Roman" w:hAnsi="Consolas" w:cs="Times New Roman"/>
+          <w:color w:val="000000"/>
+          <w:sz w:val="21"/>
+          <w:szCs w:val="21"/>
+          <w:lang w:eastAsia="pt-BR"/>
+        </w:rPr>
+        <w:t>();</w:t>
+      </w:r>
+    </w:p>
+    <w:p>
+      <w:pPr>
+        <w:shd w:val="clear" w:color="auto" w:fill="FFFFFE"/>
+        <w:spacing w:after="0" w:line="285" w:lineRule="atLeast"/>
+        <w:rPr>
+          <w:rFonts w:ascii="Consolas" w:eastAsia="Times New Roman" w:hAnsi="Consolas" w:cs="Times New Roman"/>
+          <w:color w:val="000000"/>
+          <w:sz w:val="21"/>
+          <w:szCs w:val="21"/>
+          <w:lang w:eastAsia="pt-BR"/>
+        </w:rPr>
+      </w:pPr>
+      <w:r>
+        <w:rPr>
+          <w:rFonts w:ascii="Consolas" w:eastAsia="Times New Roman" w:hAnsi="Consolas" w:cs="Times New Roman"/>
+          <w:color w:val="000000"/>
+          <w:sz w:val="21"/>
+          <w:szCs w:val="21"/>
+          <w:lang w:eastAsia="pt-BR"/>
+        </w:rPr>
+        <w:t>}</w:t>
+      </w:r>
+    </w:p>
+    <w:p>
+      <w:pPr>
+        <w:shd w:val="clear" w:color="auto" w:fill="FFFFFE"/>
+        <w:spacing w:after="0" w:line="285" w:lineRule="atLeast"/>
+        <w:rPr>
+          <w:rFonts w:ascii="Consolas" w:eastAsia="Times New Roman" w:hAnsi="Consolas" w:cs="Times New Roman"/>
+          <w:color w:val="000000"/>
+          <w:sz w:val="21"/>
+          <w:szCs w:val="21"/>
+          <w:lang w:eastAsia="pt-BR"/>
+        </w:rPr>
+      </w:pPr>
+    </w:p>
+    <w:p>
+      <w:pPr>
+        <w:shd w:val="clear" w:color="auto" w:fill="FFFFFE"/>
+        <w:spacing w:after="0" w:line="285" w:lineRule="atLeast"/>
+        <w:rPr>
+          <w:rFonts w:ascii="Consolas" w:eastAsia="Times New Roman" w:hAnsi="Consolas" w:cs="Times New Roman"/>
+          <w:color w:val="000000"/>
+          <w:sz w:val="21"/>
+          <w:szCs w:val="21"/>
+          <w:lang w:eastAsia="pt-BR"/>
+        </w:rPr>
+      </w:pPr>
+      <w:r>
+        <w:rPr>
+          <w:rFonts w:ascii="Consolas" w:eastAsia="Times New Roman" w:hAnsi="Consolas" w:cs="Times New Roman"/>
+          <w:color w:val="000000"/>
+          <w:sz w:val="21"/>
+          <w:szCs w:val="21"/>
+          <w:lang w:eastAsia="pt-BR"/>
+        </w:rPr>
+        <w:t>// define o estado inicial do botão</w:t>
+      </w:r>
+      <w:r>
+        <w:rPr>
+          <w:rFonts w:ascii="Consolas" w:eastAsia="Times New Roman" w:hAnsi="Consolas" w:cs="Times New Roman"/>
+          <w:color w:val="000000"/>
+          <w:sz w:val="21"/>
+          <w:szCs w:val="21"/>
+          <w:lang w:eastAsia="pt-BR"/>
+        </w:rPr>
+        <w:t xml:space="preserve"> (não pressionado)</w:t>
+      </w:r>
+    </w:p>
+    <w:p>
+      <w:pPr>
+        <w:shd w:val="clear" w:color="auto" w:fill="FFFFFE"/>
+        <w:spacing w:after="0" w:line="285" w:lineRule="atLeast"/>
+        <w:rPr>
+          <w:rFonts w:ascii="Consolas" w:eastAsia="Times New Roman" w:hAnsi="Consolas" w:cs="Times New Roman"/>
+          <w:color w:val="000000"/>
+          <w:sz w:val="21"/>
+          <w:szCs w:val="21"/>
+          <w:lang w:eastAsia="pt-BR"/>
+        </w:rPr>
+      </w:pPr>
+      <w:proofErr w:type="spellStart"/>
+      <w:r>
+        <w:rPr>
+          <w:rFonts w:ascii="Consolas" w:eastAsia="Times New Roman" w:hAnsi="Consolas" w:cs="Times New Roman"/>
           <w:color w:val="0000FF"/>
           <w:sz w:val="21"/>
           <w:szCs w:val="21"/>
           <w:lang w:eastAsia="pt-BR"/>
         </w:rPr>
+        <w:t>int</w:t>
+      </w:r>
+      <w:proofErr w:type="spellEnd"/>
+      <w:r>
+        <w:rPr>
+          <w:rFonts w:ascii="Consolas" w:eastAsia="Times New Roman" w:hAnsi="Consolas" w:cs="Times New Roman"/>
+          <w:color w:val="000000"/>
+          <w:sz w:val="21"/>
+          <w:szCs w:val="21"/>
+          <w:lang w:eastAsia="pt-BR"/>
+        </w:rPr>
+        <w:t xml:space="preserve"> </w:t>
+      </w:r>
+      <w:proofErr w:type="spellStart"/>
+      <w:r>
+        <w:rPr>
+          <w:rFonts w:ascii="Consolas" w:eastAsia="Times New Roman" w:hAnsi="Consolas" w:cs="Times New Roman"/>
+          <w:color w:val="000000"/>
+          <w:sz w:val="21"/>
+          <w:szCs w:val="21"/>
+          <w:lang w:eastAsia="pt-BR"/>
+        </w:rPr>
+        <w:t>lastButtonState</w:t>
+      </w:r>
+      <w:proofErr w:type="spellEnd"/>
+      <w:r>
+        <w:rPr>
+          <w:rFonts w:ascii="Consolas" w:eastAsia="Times New Roman" w:hAnsi="Consolas" w:cs="Times New Roman"/>
+          <w:color w:val="000000"/>
+          <w:sz w:val="21"/>
+          <w:szCs w:val="21"/>
+          <w:lang w:eastAsia="pt-BR"/>
+        </w:rPr>
+        <w:t xml:space="preserve"> = </w:t>
+      </w:r>
+      <w:r>
+        <w:rPr>
+          <w:rFonts w:ascii="Consolas" w:eastAsia="Times New Roman" w:hAnsi="Consolas" w:cs="Times New Roman"/>
+          <w:color w:val="098658"/>
+          <w:sz w:val="21"/>
+          <w:szCs w:val="21"/>
+          <w:lang w:eastAsia="pt-BR"/>
+        </w:rPr>
+        <w:t>0</w:t>
+      </w:r>
+      <w:r>
+        <w:rPr>
+          <w:rFonts w:ascii="Consolas" w:eastAsia="Times New Roman" w:hAnsi="Consolas" w:cs="Times New Roman"/>
+          <w:color w:val="000000"/>
+          <w:sz w:val="21"/>
+          <w:szCs w:val="21"/>
+          <w:lang w:eastAsia="pt-BR"/>
+        </w:rPr>
+        <w:t>;</w:t>
+      </w:r>
+    </w:p>
+    <w:p>
+      <w:pPr>
+        <w:shd w:val="clear" w:color="auto" w:fill="FFFFFE"/>
+        <w:spacing w:after="0" w:line="285" w:lineRule="atLeast"/>
+        <w:rPr>
+          <w:rFonts w:ascii="Consolas" w:eastAsia="Times New Roman" w:hAnsi="Consolas" w:cs="Times New Roman"/>
+          <w:color w:val="000000"/>
+          <w:sz w:val="21"/>
+          <w:szCs w:val="21"/>
+          <w:lang w:eastAsia="pt-BR"/>
+        </w:rPr>
+      </w:pPr>
+    </w:p>
+    <w:p>
+      <w:pPr>
+        <w:shd w:val="clear" w:color="auto" w:fill="FFFFFE"/>
+        <w:spacing w:after="0" w:line="285" w:lineRule="atLeast"/>
+        <w:rPr>
+          <w:rFonts w:ascii="Consolas" w:eastAsia="Times New Roman" w:hAnsi="Consolas" w:cs="Times New Roman"/>
+          <w:color w:val="000000"/>
+          <w:sz w:val="21"/>
+          <w:szCs w:val="21"/>
+          <w:lang w:eastAsia="pt-BR"/>
+        </w:rPr>
+      </w:pPr>
+      <w:proofErr w:type="spellStart"/>
+      <w:r>
+        <w:rPr>
+          <w:rFonts w:ascii="Consolas" w:eastAsia="Times New Roman" w:hAnsi="Consolas" w:cs="Times New Roman"/>
+          <w:color w:val="0000FF"/>
+          <w:sz w:val="21"/>
+          <w:szCs w:val="21"/>
+          <w:lang w:eastAsia="pt-BR"/>
+        </w:rPr>
         <w:t>void</w:t>
+      </w:r>
+      <w:proofErr w:type="spellEnd"/>
+      <w:r>
+        <w:rPr>
+          <w:rFonts w:ascii="Consolas" w:eastAsia="Times New Roman" w:hAnsi="Consolas" w:cs="Times New Roman"/>
+          <w:color w:val="000000"/>
+          <w:sz w:val="21"/>
+          <w:szCs w:val="21"/>
+          <w:lang w:eastAsia="pt-BR"/>
+        </w:rPr>
+        <w:t xml:space="preserve"> </w:t>
+      </w:r>
+      <w:proofErr w:type="gramStart"/>
+      <w:r>
+        <w:rPr>
+          <w:rFonts w:ascii="Consolas" w:eastAsia="Times New Roman" w:hAnsi="Consolas" w:cs="Times New Roman"/>
+          <w:color w:val="5E6D03"/>
+          <w:sz w:val="21"/>
+          <w:szCs w:val="21"/>
+          <w:lang w:eastAsia="pt-BR"/>
+        </w:rPr>
+        <w:t>loop</w:t>
+      </w:r>
+      <w:r>
+        <w:rPr>
+          <w:rFonts w:ascii="Consolas" w:eastAsia="Times New Roman" w:hAnsi="Consolas" w:cs="Times New Roman"/>
+          <w:color w:val="000000"/>
+          <w:sz w:val="21"/>
+          <w:szCs w:val="21"/>
+          <w:lang w:eastAsia="pt-BR"/>
+        </w:rPr>
+        <w:t>(</w:t>
+      </w:r>
+      <w:proofErr w:type="gramEnd"/>
+      <w:r>
+        <w:rPr>
+          <w:rFonts w:ascii="Consolas" w:eastAsia="Times New Roman" w:hAnsi="Consolas" w:cs="Times New Roman"/>
+          <w:color w:val="000000"/>
+          <w:sz w:val="21"/>
+          <w:szCs w:val="21"/>
+          <w:lang w:eastAsia="pt-BR"/>
+        </w:rPr>
+        <w:t>) {</w:t>
+      </w:r>
+    </w:p>
+    <w:p>
+      <w:pPr>
+        <w:shd w:val="clear" w:color="auto" w:fill="FFFFFE"/>
+        <w:spacing w:after="0" w:line="285" w:lineRule="atLeast"/>
+        <w:rPr>
+          <w:rFonts w:ascii="Consolas" w:eastAsia="Times New Roman" w:hAnsi="Consolas" w:cs="Times New Roman"/>
+          <w:color w:val="000000"/>
+          <w:sz w:val="21"/>
+          <w:szCs w:val="21"/>
+          <w:lang w:eastAsia="pt-BR"/>
+        </w:rPr>
+      </w:pPr>
+    </w:p>
+    <w:p>
+      <w:pPr>
+        <w:shd w:val="clear" w:color="auto" w:fill="FFFFFE"/>
+        <w:spacing w:after="0" w:line="285" w:lineRule="atLeast"/>
+        <w:rPr>
+          <w:rFonts w:ascii="Consolas" w:eastAsia="Times New Roman" w:hAnsi="Consolas" w:cs="Times New Roman"/>
+          <w:color w:val="000000"/>
+          <w:sz w:val="21"/>
+          <w:szCs w:val="21"/>
+          <w:lang w:eastAsia="pt-BR"/>
+        </w:rPr>
+      </w:pPr>
+      <w:r>
+        <w:rPr>
+          <w:rFonts w:ascii="Consolas" w:eastAsia="Times New Roman" w:hAnsi="Consolas" w:cs="Times New Roman"/>
+          <w:color w:val="000000"/>
+          <w:sz w:val="21"/>
+          <w:szCs w:val="21"/>
+          <w:lang w:eastAsia="pt-BR"/>
+        </w:rPr>
+        <w:t xml:space="preserve">// lê a posição vertical (y) do joystick </w:t>
+      </w:r>
+    </w:p>
+    <w:p>
+      <w:pPr>
+        <w:shd w:val="clear" w:color="auto" w:fill="FFFFFE"/>
+        <w:spacing w:after="0" w:line="285" w:lineRule="atLeast"/>
+        <w:rPr>
+          <w:rFonts w:ascii="Consolas" w:eastAsia="Times New Roman" w:hAnsi="Consolas" w:cs="Times New Roman"/>
+          <w:color w:val="000000"/>
+          <w:sz w:val="21"/>
+          <w:szCs w:val="21"/>
+          <w:lang w:eastAsia="pt-BR"/>
+        </w:rPr>
+      </w:pPr>
+      <w:r>
+        <w:rPr>
+          <w:rFonts w:ascii="Consolas" w:eastAsia="Times New Roman" w:hAnsi="Consolas" w:cs="Times New Roman"/>
+          <w:color w:val="000000"/>
+          <w:sz w:val="21"/>
+          <w:szCs w:val="21"/>
+          <w:lang w:eastAsia="pt-BR"/>
+        </w:rPr>
+        <w:t xml:space="preserve">  </w:t>
+      </w:r>
+      <w:proofErr w:type="spellStart"/>
+      <w:r>
+        <w:rPr>
+          <w:rFonts w:ascii="Consolas" w:eastAsia="Times New Roman" w:hAnsi="Consolas" w:cs="Times New Roman"/>
+          <w:color w:val="000000"/>
+          <w:sz w:val="21"/>
+          <w:szCs w:val="21"/>
+          <w:lang w:eastAsia="pt-BR"/>
+        </w:rPr>
+        <w:t>Joystick.setRyAxis</w:t>
+      </w:r>
+      <w:proofErr w:type="spellEnd"/>
+      <w:r>
+        <w:rPr>
+          <w:rFonts w:ascii="Consolas" w:eastAsia="Times New Roman" w:hAnsi="Consolas" w:cs="Times New Roman"/>
+          <w:color w:val="000000"/>
+          <w:sz w:val="21"/>
+          <w:szCs w:val="21"/>
+          <w:lang w:eastAsia="pt-BR"/>
+        </w:rPr>
+        <w:t>(</w:t>
+      </w:r>
+      <w:proofErr w:type="spellStart"/>
+      <w:r>
+        <w:rPr>
+          <w:rFonts w:ascii="Consolas" w:eastAsia="Times New Roman" w:hAnsi="Consolas" w:cs="Times New Roman"/>
+          <w:color w:val="E97366"/>
+          <w:sz w:val="21"/>
+          <w:szCs w:val="21"/>
+          <w:lang w:eastAsia="pt-BR"/>
+        </w:rPr>
+        <w:t>map</w:t>
+      </w:r>
+      <w:proofErr w:type="spellEnd"/>
+      <w:r>
+        <w:rPr>
+          <w:rFonts w:ascii="Consolas" w:eastAsia="Times New Roman" w:hAnsi="Consolas" w:cs="Times New Roman"/>
+          <w:color w:val="000000"/>
+          <w:sz w:val="21"/>
+          <w:szCs w:val="21"/>
+          <w:lang w:eastAsia="pt-BR"/>
+        </w:rPr>
+        <w:t>(</w:t>
+      </w:r>
+      <w:proofErr w:type="spellStart"/>
+      <w:r>
+        <w:rPr>
+          <w:rFonts w:ascii="Consolas" w:eastAsia="Times New Roman" w:hAnsi="Consolas" w:cs="Times New Roman"/>
+          <w:color w:val="E97366"/>
+          <w:sz w:val="21"/>
+          <w:szCs w:val="21"/>
+          <w:lang w:eastAsia="pt-BR"/>
+        </w:rPr>
+        <w:t>analogRead</w:t>
+      </w:r>
+      <w:proofErr w:type="spellEnd"/>
+      <w:r>
+        <w:rPr>
+          <w:rFonts w:ascii="Consolas" w:eastAsia="Times New Roman" w:hAnsi="Consolas" w:cs="Times New Roman"/>
+          <w:color w:val="000000"/>
+          <w:sz w:val="21"/>
+          <w:szCs w:val="21"/>
+          <w:lang w:eastAsia="pt-BR"/>
+        </w:rPr>
+        <w:t>(</w:t>
+      </w:r>
+      <w:r>
+        <w:rPr>
+          <w:rFonts w:ascii="Consolas" w:eastAsia="Times New Roman" w:hAnsi="Consolas" w:cs="Times New Roman"/>
+          <w:color w:val="00979C"/>
+          <w:sz w:val="21"/>
+          <w:szCs w:val="21"/>
+          <w:lang w:eastAsia="pt-BR"/>
+        </w:rPr>
+        <w:t>A0</w:t>
+      </w:r>
+      <w:r>
+        <w:rPr>
+          <w:rFonts w:ascii="Consolas" w:eastAsia="Times New Roman" w:hAnsi="Consolas" w:cs="Times New Roman"/>
+          <w:color w:val="000000"/>
+          <w:sz w:val="21"/>
+          <w:szCs w:val="21"/>
+          <w:lang w:eastAsia="pt-BR"/>
+        </w:rPr>
+        <w:t xml:space="preserve">), </w:t>
+      </w:r>
+      <w:r>
+        <w:rPr>
+          <w:rFonts w:ascii="Consolas" w:eastAsia="Times New Roman" w:hAnsi="Consolas" w:cs="Times New Roman"/>
+          <w:color w:val="098658"/>
+          <w:sz w:val="21"/>
+          <w:szCs w:val="21"/>
+          <w:lang w:eastAsia="pt-BR"/>
+        </w:rPr>
+        <w:t>0</w:t>
+      </w:r>
+      <w:r>
+        <w:rPr>
+          <w:rFonts w:ascii="Consolas" w:eastAsia="Times New Roman" w:hAnsi="Consolas" w:cs="Times New Roman"/>
+          <w:color w:val="000000"/>
+          <w:sz w:val="21"/>
+          <w:szCs w:val="21"/>
+          <w:lang w:eastAsia="pt-BR"/>
+        </w:rPr>
+        <w:t xml:space="preserve">, </w:t>
+      </w:r>
+      <w:r>
+        <w:rPr>
+          <w:rFonts w:ascii="Consolas" w:eastAsia="Times New Roman" w:hAnsi="Consolas" w:cs="Times New Roman"/>
+          <w:color w:val="098658"/>
+          <w:sz w:val="21"/>
+          <w:szCs w:val="21"/>
+          <w:lang w:eastAsia="pt-BR"/>
+        </w:rPr>
+        <w:t>1023</w:t>
+      </w:r>
+      <w:r>
+        <w:rPr>
+          <w:rFonts w:ascii="Consolas" w:eastAsia="Times New Roman" w:hAnsi="Consolas" w:cs="Times New Roman"/>
+          <w:color w:val="000000"/>
+          <w:sz w:val="21"/>
+          <w:szCs w:val="21"/>
+          <w:lang w:eastAsia="pt-BR"/>
+        </w:rPr>
+        <w:t xml:space="preserve">, </w:t>
+      </w:r>
+      <w:r>
+        <w:rPr>
+          <w:rFonts w:ascii="Consolas" w:eastAsia="Times New Roman" w:hAnsi="Consolas" w:cs="Times New Roman"/>
+          <w:color w:val="098658"/>
+          <w:sz w:val="21"/>
+          <w:szCs w:val="21"/>
+          <w:lang w:eastAsia="pt-BR"/>
+        </w:rPr>
+        <w:t>0</w:t>
+      </w:r>
+      <w:r>
+        <w:rPr>
+          <w:rFonts w:ascii="Consolas" w:eastAsia="Times New Roman" w:hAnsi="Consolas" w:cs="Times New Roman"/>
+          <w:color w:val="000000"/>
+          <w:sz w:val="21"/>
+          <w:szCs w:val="21"/>
+          <w:lang w:eastAsia="pt-BR"/>
+        </w:rPr>
+        <w:t xml:space="preserve">, </w:t>
+      </w:r>
+      <w:r>
+        <w:rPr>
+          <w:rFonts w:ascii="Consolas" w:eastAsia="Times New Roman" w:hAnsi="Consolas" w:cs="Times New Roman"/>
+          <w:color w:val="098658"/>
+          <w:sz w:val="21"/>
+          <w:szCs w:val="21"/>
+          <w:lang w:eastAsia="pt-BR"/>
+        </w:rPr>
+        <w:t>1023</w:t>
+      </w:r>
+      <w:r>
+        <w:rPr>
+          <w:rFonts w:ascii="Consolas" w:eastAsia="Times New Roman" w:hAnsi="Consolas" w:cs="Times New Roman"/>
+          <w:color w:val="000000"/>
+          <w:sz w:val="21"/>
+          <w:szCs w:val="21"/>
+          <w:lang w:eastAsia="pt-BR"/>
+        </w:rPr>
+        <w:t>));</w:t>
+      </w:r>
+    </w:p>
+    <w:p>
+      <w:pPr>
+        <w:shd w:val="clear" w:color="auto" w:fill="FFFFFE"/>
+        <w:spacing w:after="0" w:line="285" w:lineRule="atLeast"/>
+        <w:rPr>
+          <w:rFonts w:ascii="Consolas" w:eastAsia="Times New Roman" w:hAnsi="Consolas" w:cs="Times New Roman"/>
+          <w:color w:val="000000"/>
+          <w:sz w:val="21"/>
+          <w:szCs w:val="21"/>
+          <w:lang w:eastAsia="pt-BR"/>
+        </w:rPr>
+      </w:pPr>
+    </w:p>
+    <w:p>
+      <w:pPr>
+        <w:shd w:val="clear" w:color="auto" w:fill="FFFFFE"/>
+        <w:spacing w:after="0" w:line="285" w:lineRule="atLeast"/>
+        <w:rPr>
+          <w:rFonts w:ascii="Consolas" w:eastAsia="Times New Roman" w:hAnsi="Consolas" w:cs="Times New Roman"/>
+          <w:color w:val="000000"/>
+          <w:sz w:val="21"/>
+          <w:szCs w:val="21"/>
+          <w:lang w:eastAsia="pt-BR"/>
+        </w:rPr>
+      </w:pPr>
+      <w:r>
+        <w:rPr>
+          <w:rFonts w:ascii="Consolas" w:eastAsia="Times New Roman" w:hAnsi="Consolas" w:cs="Times New Roman"/>
+          <w:color w:val="000000"/>
+          <w:sz w:val="21"/>
+          <w:szCs w:val="21"/>
+          <w:lang w:eastAsia="pt-BR"/>
+        </w:rPr>
+        <w:t xml:space="preserve">// lê a posição horizontal (x) do joystick </w:t>
+      </w:r>
+    </w:p>
+    <w:p>
+      <w:pPr>
+        <w:shd w:val="clear" w:color="auto" w:fill="FFFFFE"/>
+        <w:spacing w:after="0" w:line="285" w:lineRule="atLeast"/>
+        <w:rPr>
+          <w:rFonts w:ascii="Consolas" w:eastAsia="Times New Roman" w:hAnsi="Consolas" w:cs="Times New Roman"/>
+          <w:color w:val="000000"/>
+          <w:sz w:val="21"/>
+          <w:szCs w:val="21"/>
+          <w:lang w:eastAsia="pt-BR"/>
+        </w:rPr>
+      </w:pPr>
+      <w:r>
+        <w:rPr>
+          <w:rFonts w:ascii="Consolas" w:eastAsia="Times New Roman" w:hAnsi="Consolas" w:cs="Times New Roman"/>
+          <w:color w:val="000000"/>
+          <w:sz w:val="21"/>
+          <w:szCs w:val="21"/>
+          <w:lang w:eastAsia="pt-BR"/>
+        </w:rPr>
+        <w:t xml:space="preserve">  </w:t>
+      </w:r>
+      <w:proofErr w:type="spellStart"/>
+      <w:r>
+        <w:rPr>
+          <w:rFonts w:ascii="Consolas" w:eastAsia="Times New Roman" w:hAnsi="Consolas" w:cs="Times New Roman"/>
+          <w:color w:val="000000"/>
+          <w:sz w:val="21"/>
+          <w:szCs w:val="21"/>
+          <w:lang w:eastAsia="pt-BR"/>
+        </w:rPr>
+        <w:t>Joystick.setRxAxis</w:t>
+      </w:r>
+      <w:proofErr w:type="spellEnd"/>
+      <w:r>
+        <w:rPr>
+          <w:rFonts w:ascii="Consolas" w:eastAsia="Times New Roman" w:hAnsi="Consolas" w:cs="Times New Roman"/>
+          <w:color w:val="000000"/>
+          <w:sz w:val="21"/>
+          <w:szCs w:val="21"/>
+          <w:lang w:eastAsia="pt-BR"/>
+        </w:rPr>
+        <w:t>(</w:t>
+      </w:r>
+      <w:proofErr w:type="spellStart"/>
+      <w:r>
+        <w:rPr>
+          <w:rFonts w:ascii="Consolas" w:eastAsia="Times New Roman" w:hAnsi="Consolas" w:cs="Times New Roman"/>
+          <w:color w:val="E97366"/>
+          <w:sz w:val="21"/>
+          <w:szCs w:val="21"/>
+          <w:lang w:eastAsia="pt-BR"/>
+        </w:rPr>
+        <w:t>map</w:t>
+      </w:r>
+      <w:proofErr w:type="spellEnd"/>
+      <w:r>
+        <w:rPr>
+          <w:rFonts w:ascii="Consolas" w:eastAsia="Times New Roman" w:hAnsi="Consolas" w:cs="Times New Roman"/>
+          <w:color w:val="000000"/>
+          <w:sz w:val="21"/>
+          <w:szCs w:val="21"/>
+          <w:lang w:eastAsia="pt-BR"/>
+        </w:rPr>
+        <w:t>(</w:t>
+      </w:r>
+      <w:proofErr w:type="spellStart"/>
+      <w:r>
+        <w:rPr>
+          <w:rFonts w:ascii="Consolas" w:eastAsia="Times New Roman" w:hAnsi="Consolas" w:cs="Times New Roman"/>
+          <w:color w:val="E97366"/>
+          <w:sz w:val="21"/>
+          <w:szCs w:val="21"/>
+          <w:lang w:eastAsia="pt-BR"/>
+        </w:rPr>
+        <w:t>analogRead</w:t>
+      </w:r>
+      <w:proofErr w:type="spellEnd"/>
+      <w:r>
+        <w:rPr>
+          <w:rFonts w:ascii="Consolas" w:eastAsia="Times New Roman" w:hAnsi="Consolas" w:cs="Times New Roman"/>
+          <w:color w:val="000000"/>
+          <w:sz w:val="21"/>
+          <w:szCs w:val="21"/>
+          <w:lang w:eastAsia="pt-BR"/>
+        </w:rPr>
+        <w:t>(</w:t>
+      </w:r>
+      <w:r>
+        <w:rPr>
+          <w:rFonts w:ascii="Consolas" w:eastAsia="Times New Roman" w:hAnsi="Consolas" w:cs="Times New Roman"/>
+          <w:color w:val="00979C"/>
+          <w:sz w:val="21"/>
+          <w:szCs w:val="21"/>
+          <w:lang w:eastAsia="pt-BR"/>
+        </w:rPr>
+        <w:t>A1</w:t>
+      </w:r>
+      <w:r>
+        <w:rPr>
+          <w:rFonts w:ascii="Consolas" w:eastAsia="Times New Roman" w:hAnsi="Consolas" w:cs="Times New Roman"/>
+          <w:color w:val="000000"/>
+          <w:sz w:val="21"/>
+          <w:szCs w:val="21"/>
+          <w:lang w:eastAsia="pt-BR"/>
+        </w:rPr>
+        <w:t xml:space="preserve">), </w:t>
+      </w:r>
+      <w:r>
+        <w:rPr>
+          <w:rFonts w:ascii="Consolas" w:eastAsia="Times New Roman" w:hAnsi="Consolas" w:cs="Times New Roman"/>
+          <w:color w:val="098658"/>
+          <w:sz w:val="21"/>
+          <w:szCs w:val="21"/>
+          <w:lang w:eastAsia="pt-BR"/>
+        </w:rPr>
+        <w:t>0</w:t>
+      </w:r>
+      <w:r>
+        <w:rPr>
+          <w:rFonts w:ascii="Consolas" w:eastAsia="Times New Roman" w:hAnsi="Consolas" w:cs="Times New Roman"/>
+          <w:color w:val="000000"/>
+          <w:sz w:val="21"/>
+          <w:szCs w:val="21"/>
+          <w:lang w:eastAsia="pt-BR"/>
+        </w:rPr>
+        <w:t xml:space="preserve">, </w:t>
+      </w:r>
+      <w:r>
+        <w:rPr>
+          <w:rFonts w:ascii="Consolas" w:eastAsia="Times New Roman" w:hAnsi="Consolas" w:cs="Times New Roman"/>
+          <w:color w:val="098658"/>
+          <w:sz w:val="21"/>
+          <w:szCs w:val="21"/>
+          <w:lang w:eastAsia="pt-BR"/>
+        </w:rPr>
+        <w:t>1023</w:t>
+      </w:r>
+      <w:r>
+        <w:rPr>
+          <w:rFonts w:ascii="Consolas" w:eastAsia="Times New Roman" w:hAnsi="Consolas" w:cs="Times New Roman"/>
+          <w:color w:val="000000"/>
+          <w:sz w:val="21"/>
+          <w:szCs w:val="21"/>
+          <w:lang w:eastAsia="pt-BR"/>
+        </w:rPr>
+        <w:t xml:space="preserve">, </w:t>
+      </w:r>
+      <w:r>
+        <w:rPr>
+          <w:rFonts w:ascii="Consolas" w:eastAsia="Times New Roman" w:hAnsi="Consolas" w:cs="Times New Roman"/>
+          <w:color w:val="098658"/>
+          <w:sz w:val="21"/>
+          <w:szCs w:val="21"/>
+          <w:lang w:eastAsia="pt-BR"/>
+        </w:rPr>
+        <w:t>0</w:t>
+      </w:r>
+      <w:r>
+        <w:rPr>
+          <w:rFonts w:ascii="Consolas" w:eastAsia="Times New Roman" w:hAnsi="Consolas" w:cs="Times New Roman"/>
+          <w:color w:val="000000"/>
+          <w:sz w:val="21"/>
+          <w:szCs w:val="21"/>
+          <w:lang w:eastAsia="pt-BR"/>
+        </w:rPr>
+        <w:t xml:space="preserve">, </w:t>
+      </w:r>
+      <w:r>
+        <w:rPr>
+          <w:rFonts w:ascii="Consolas" w:eastAsia="Times New Roman" w:hAnsi="Consolas" w:cs="Times New Roman"/>
+          <w:color w:val="098658"/>
+          <w:sz w:val="21"/>
+          <w:szCs w:val="21"/>
+          <w:lang w:eastAsia="pt-BR"/>
+        </w:rPr>
+        <w:t>1023</w:t>
+      </w:r>
+      <w:r>
+        <w:rPr>
+          <w:rFonts w:ascii="Consolas" w:eastAsia="Times New Roman" w:hAnsi="Consolas" w:cs="Times New Roman"/>
+          <w:color w:val="000000"/>
+          <w:sz w:val="21"/>
+          <w:szCs w:val="21"/>
+          <w:lang w:eastAsia="pt-BR"/>
+        </w:rPr>
+        <w:t>));</w:t>
+      </w:r>
+    </w:p>
+    <w:p>
+      <w:pPr>
+        <w:shd w:val="clear" w:color="auto" w:fill="FFFFFE"/>
+        <w:spacing w:after="0" w:line="285" w:lineRule="atLeast"/>
+        <w:rPr>
+          <w:rFonts w:ascii="Consolas" w:eastAsia="Times New Roman" w:hAnsi="Consolas" w:cs="Times New Roman"/>
+          <w:color w:val="000000"/>
+          <w:sz w:val="21"/>
+          <w:szCs w:val="21"/>
+          <w:lang w:eastAsia="pt-BR"/>
+        </w:rPr>
+      </w:pPr>
+    </w:p>
+    <w:p>
+      <w:pPr>
+        <w:shd w:val="clear" w:color="auto" w:fill="FFFFFE"/>
+        <w:spacing w:after="0" w:line="285" w:lineRule="atLeast"/>
+        <w:rPr>
+          <w:rFonts w:ascii="Consolas" w:eastAsia="Times New Roman" w:hAnsi="Consolas" w:cs="Times New Roman"/>
+          <w:color w:val="000000"/>
+          <w:sz w:val="21"/>
+          <w:szCs w:val="21"/>
+          <w:lang w:eastAsia="pt-BR"/>
+        </w:rPr>
+      </w:pPr>
+      <w:r>
+        <w:rPr>
+          <w:rFonts w:ascii="Consolas" w:eastAsia="Times New Roman" w:hAnsi="Consolas" w:cs="Times New Roman"/>
+          <w:color w:val="000000"/>
+          <w:sz w:val="21"/>
+          <w:szCs w:val="21"/>
+          <w:lang w:eastAsia="pt-BR"/>
+        </w:rPr>
+        <w:t>// lê o estado atual do botão e inverte a lógica para 0 = solto e 1 = pressionado</w:t>
+      </w:r>
+    </w:p>
+    <w:p>
+      <w:pPr>
+        <w:shd w:val="clear" w:color="auto" w:fill="FFFFFE"/>
+        <w:spacing w:after="0" w:line="285" w:lineRule="atLeast"/>
+        <w:rPr>
+          <w:rFonts w:ascii="Consolas" w:eastAsia="Times New Roman" w:hAnsi="Consolas" w:cs="Times New Roman"/>
+          <w:color w:val="000000"/>
+          <w:sz w:val="21"/>
+          <w:szCs w:val="21"/>
+          <w:lang w:eastAsia="pt-BR"/>
+        </w:rPr>
+      </w:pPr>
+      <w:r>
+        <w:rPr>
+          <w:rFonts w:ascii="Consolas" w:eastAsia="Times New Roman" w:hAnsi="Consolas" w:cs="Times New Roman"/>
+          <w:color w:val="000000"/>
+          <w:sz w:val="21"/>
+          <w:szCs w:val="21"/>
+          <w:lang w:eastAsia="pt-BR"/>
+        </w:rPr>
+        <w:t xml:space="preserve">  </w:t>
+      </w:r>
+      <w:proofErr w:type="spellStart"/>
+      <w:r>
+        <w:rPr>
+          <w:rFonts w:ascii="Consolas" w:eastAsia="Times New Roman" w:hAnsi="Consolas" w:cs="Times New Roman"/>
+          <w:color w:val="0000FF"/>
+          <w:sz w:val="21"/>
+          <w:szCs w:val="21"/>
+          <w:lang w:eastAsia="pt-BR"/>
+        </w:rPr>
+        <w:t>int</w:t>
+      </w:r>
+      <w:proofErr w:type="spellEnd"/>
+      <w:r>
+        <w:rPr>
+          <w:rFonts w:ascii="Consolas" w:eastAsia="Times New Roman" w:hAnsi="Consolas" w:cs="Times New Roman"/>
+          <w:color w:val="000000"/>
+          <w:sz w:val="21"/>
+          <w:szCs w:val="21"/>
+          <w:lang w:eastAsia="pt-BR"/>
+        </w:rPr>
+        <w:t xml:space="preserve"> </w:t>
+      </w:r>
+      <w:proofErr w:type="spellStart"/>
+      <w:r>
+        <w:rPr>
+          <w:rFonts w:ascii="Consolas" w:eastAsia="Times New Roman" w:hAnsi="Consolas" w:cs="Times New Roman"/>
+          <w:color w:val="000000"/>
+          <w:sz w:val="21"/>
+          <w:szCs w:val="21"/>
+          <w:lang w:eastAsia="pt-BR"/>
+        </w:rPr>
+        <w:t>currentButtonState</w:t>
+      </w:r>
+      <w:proofErr w:type="spellEnd"/>
+      <w:r>
+        <w:rPr>
+          <w:rFonts w:ascii="Consolas" w:eastAsia="Times New Roman" w:hAnsi="Consolas" w:cs="Times New Roman"/>
+          <w:color w:val="000000"/>
+          <w:sz w:val="21"/>
+          <w:szCs w:val="21"/>
+          <w:lang w:eastAsia="pt-BR"/>
+        </w:rPr>
+        <w:t xml:space="preserve"> </w:t>
+      </w:r>
+      <w:proofErr w:type="gramStart"/>
+      <w:r>
+        <w:rPr>
+          <w:rFonts w:ascii="Consolas" w:eastAsia="Times New Roman" w:hAnsi="Consolas" w:cs="Times New Roman"/>
+          <w:color w:val="000000"/>
+          <w:sz w:val="21"/>
+          <w:szCs w:val="21"/>
+          <w:lang w:eastAsia="pt-BR"/>
+        </w:rPr>
+        <w:t>= !</w:t>
+      </w:r>
+      <w:proofErr w:type="spellStart"/>
+      <w:r>
+        <w:rPr>
+          <w:rFonts w:ascii="Consolas" w:eastAsia="Times New Roman" w:hAnsi="Consolas" w:cs="Times New Roman"/>
+          <w:color w:val="E97366"/>
+          <w:sz w:val="21"/>
+          <w:szCs w:val="21"/>
+          <w:lang w:eastAsia="pt-BR"/>
+        </w:rPr>
+        <w:t>digitalRead</w:t>
       </w:r>
       <w:proofErr w:type="spellEnd"/>
       <w:proofErr w:type="gramEnd"/>
@@ -1389,27 +2580,27 @@
           <w:szCs w:val="21"/>
           <w:lang w:eastAsia="pt-BR"/>
         </w:rPr>
-        <w:t xml:space="preserve"> </w:t>
-      </w:r>
-      <w:r>
-        <w:rPr>
-          <w:rFonts w:ascii="Consolas" w:eastAsia="Times New Roman" w:hAnsi="Consolas" w:cs="Times New Roman"/>
-          <w:color w:val="5E6D03"/>
-          <w:sz w:val="21"/>
-          <w:szCs w:val="21"/>
-          <w:lang w:eastAsia="pt-BR"/>
-        </w:rPr>
-        <w:t>setup</w:t>
-      </w:r>
-      <w:r>
-        <w:rPr>
-          <w:rFonts w:ascii="Consolas" w:eastAsia="Times New Roman" w:hAnsi="Consolas" w:cs="Times New Roman"/>
-          <w:color w:val="000000"/>
-          <w:sz w:val="21"/>
-          <w:szCs w:val="21"/>
-          <w:lang w:eastAsia="pt-BR"/>
-        </w:rPr>
-        <w:t>() {</w:t>
+        <w:t>(</w:t>
+      </w:r>
+      <w:r>
+        <w:rPr>
+          <w:rFonts w:ascii="Consolas" w:eastAsia="Times New Roman" w:hAnsi="Consolas" w:cs="Times New Roman"/>
+          <w:color w:val="098658"/>
+          <w:sz w:val="21"/>
+          <w:szCs w:val="21"/>
+          <w:lang w:eastAsia="pt-BR"/>
+        </w:rPr>
+        <w:t>2</w:t>
+      </w:r>
+      <w:r>
+        <w:rPr>
+          <w:rFonts w:ascii="Consolas" w:eastAsia="Times New Roman" w:hAnsi="Consolas" w:cs="Times New Roman"/>
+          <w:color w:val="000000"/>
+          <w:sz w:val="21"/>
+          <w:szCs w:val="21"/>
+          <w:lang w:eastAsia="pt-BR"/>
+        </w:rPr>
+        <w:t>);</w:t>
       </w:r>
     </w:p>
     <w:p>
@@ -1445,7 +2636,7 @@
           <w:szCs w:val="21"/>
           <w:lang w:eastAsia="pt-BR"/>
         </w:rPr>
-        <w:t>// define os pinos do componente módulo Joystick e o pino do botão (2)</w:t>
+        <w:t>// atualiza o botão se o estado mudou</w:t>
       </w:r>
     </w:p>
     <w:p>
@@ -1471,16 +2662,38 @@
         <w:t xml:space="preserve">  </w:t>
       </w:r>
       <w:proofErr w:type="spellStart"/>
+      <w:r>
+        <w:rPr>
+          <w:rFonts w:ascii="Consolas" w:eastAsia="Times New Roman" w:hAnsi="Consolas" w:cs="Times New Roman"/>
+          <w:color w:val="0000FF"/>
+          <w:sz w:val="21"/>
+          <w:szCs w:val="21"/>
+          <w:lang w:eastAsia="pt-BR"/>
+        </w:rPr>
+        <w:t>if</w:t>
+      </w:r>
+      <w:proofErr w:type="spellEnd"/>
+      <w:r>
+        <w:rPr>
+          <w:rFonts w:ascii="Consolas" w:eastAsia="Times New Roman" w:hAnsi="Consolas" w:cs="Times New Roman"/>
+          <w:color w:val="000000"/>
+          <w:sz w:val="21"/>
+          <w:szCs w:val="21"/>
+          <w:lang w:eastAsia="pt-BR"/>
+        </w:rPr>
+        <w:t xml:space="preserve"> (</w:t>
+      </w:r>
+      <w:proofErr w:type="spellStart"/>
       <w:proofErr w:type="gramStart"/>
       <w:r>
         <w:rPr>
           <w:rFonts w:ascii="Consolas" w:eastAsia="Times New Roman" w:hAnsi="Consolas" w:cs="Times New Roman"/>
-          <w:color w:val="E97366"/>
-          <w:sz w:val="21"/>
-          <w:szCs w:val="21"/>
-          <w:lang w:eastAsia="pt-BR"/>
-        </w:rPr>
-        <w:t>pinMode</w:t>
+          <w:color w:val="000000"/>
+          <w:sz w:val="21"/>
+          <w:szCs w:val="21"/>
+          <w:lang w:eastAsia="pt-BR"/>
+        </w:rPr>
+        <w:t>currentButtonState</w:t>
       </w:r>
       <w:proofErr w:type="spellEnd"/>
       <w:r>
@@ -1491,48 +2704,40 @@
           <w:szCs w:val="21"/>
           <w:lang w:eastAsia="pt-BR"/>
         </w:rPr>
-        <w:t>(</w:t>
+        <w:t xml:space="preserve"> !</w:t>
       </w:r>
       <w:proofErr w:type="gramEnd"/>
       <w:r>
         <w:rPr>
           <w:rFonts w:ascii="Consolas" w:eastAsia="Times New Roman" w:hAnsi="Consolas" w:cs="Times New Roman"/>
-          <w:color w:val="00979C"/>
-          <w:sz w:val="21"/>
-          <w:szCs w:val="21"/>
-          <w:lang w:eastAsia="pt-BR"/>
-        </w:rPr>
-        <w:t>A0</w:t>
-      </w:r>
-      <w:r>
-        <w:rPr>
-          <w:rFonts w:ascii="Consolas" w:eastAsia="Times New Roman" w:hAnsi="Consolas" w:cs="Times New Roman"/>
-          <w:color w:val="000000"/>
-          <w:sz w:val="21"/>
-          <w:szCs w:val="21"/>
-          <w:lang w:eastAsia="pt-BR"/>
-        </w:rPr>
-        <w:t xml:space="preserve">, </w:t>
-      </w:r>
-      <w:r>
-        <w:rPr>
-          <w:rFonts w:ascii="Consolas" w:eastAsia="Times New Roman" w:hAnsi="Consolas" w:cs="Times New Roman"/>
-          <w:color w:val="00979C"/>
-          <w:sz w:val="21"/>
-          <w:szCs w:val="21"/>
-          <w:lang w:eastAsia="pt-BR"/>
-        </w:rPr>
-        <w:t>INPUT</w:t>
-      </w:r>
-      <w:r>
-        <w:rPr>
-          <w:rFonts w:ascii="Consolas" w:eastAsia="Times New Roman" w:hAnsi="Consolas" w:cs="Times New Roman"/>
-          <w:color w:val="000000"/>
-          <w:sz w:val="21"/>
-          <w:szCs w:val="21"/>
-          <w:lang w:eastAsia="pt-BR"/>
-        </w:rPr>
-        <w:t>);</w:t>
+          <w:color w:val="000000"/>
+          <w:sz w:val="21"/>
+          <w:szCs w:val="21"/>
+          <w:lang w:eastAsia="pt-BR"/>
+        </w:rPr>
+        <w:t xml:space="preserve">= </w:t>
+      </w:r>
+      <w:proofErr w:type="spellStart"/>
+      <w:r>
+        <w:rPr>
+          <w:rFonts w:ascii="Consolas" w:eastAsia="Times New Roman" w:hAnsi="Consolas" w:cs="Times New Roman"/>
+          <w:color w:val="000000"/>
+          <w:sz w:val="21"/>
+          <w:szCs w:val="21"/>
+          <w:lang w:eastAsia="pt-BR"/>
+        </w:rPr>
+        <w:t>lastButtonState</w:t>
+      </w:r>
+      <w:proofErr w:type="spellEnd"/>
+      <w:r>
+        <w:rPr>
+          <w:rFonts w:ascii="Consolas" w:eastAsia="Times New Roman" w:hAnsi="Consolas" w:cs="Times New Roman"/>
+          <w:color w:val="000000"/>
+          <w:sz w:val="21"/>
+          <w:szCs w:val="21"/>
+          <w:lang w:eastAsia="pt-BR"/>
+        </w:rPr>
+        <w:t>)</w:t>
       </w:r>
     </w:p>
     <w:p>
@@ -1555,72 +2760,7 @@
           <w:szCs w:val="21"/>
           <w:lang w:eastAsia="pt-BR"/>
         </w:rPr>
-        <w:lastRenderedPageBreak/>
-        <w:t xml:space="preserve">  </w:t>
-      </w:r>
-      <w:proofErr w:type="spellStart"/>
-      <w:proofErr w:type="gramStart"/>
-      <w:r>
-        <w:rPr>
-          <w:rFonts w:ascii="Consolas" w:eastAsia="Times New Roman" w:hAnsi="Consolas" w:cs="Times New Roman"/>
-          <w:color w:val="E97366"/>
-          <w:sz w:val="21"/>
-          <w:szCs w:val="21"/>
-          <w:lang w:eastAsia="pt-BR"/>
-        </w:rPr>
-        <w:t>pinMode</w:t>
-      </w:r>
-      <w:proofErr w:type="spellEnd"/>
-      <w:r>
-        <w:rPr>
-          <w:rFonts w:ascii="Consolas" w:eastAsia="Times New Roman" w:hAnsi="Consolas" w:cs="Times New Roman"/>
-          <w:color w:val="000000"/>
-          <w:sz w:val="21"/>
-          <w:szCs w:val="21"/>
-          <w:lang w:eastAsia="pt-BR"/>
-        </w:rPr>
-        <w:t>(</w:t>
-      </w:r>
-      <w:proofErr w:type="gramEnd"/>
-      <w:r>
-        <w:rPr>
-          <w:rFonts w:ascii="Consolas" w:eastAsia="Times New Roman" w:hAnsi="Consolas" w:cs="Times New Roman"/>
-          <w:color w:val="00979C"/>
-          <w:sz w:val="21"/>
-          <w:szCs w:val="21"/>
-          <w:lang w:eastAsia="pt-BR"/>
-        </w:rPr>
-        <w:t>A1</w:t>
-      </w:r>
-      <w:r>
-        <w:rPr>
-          <w:rFonts w:ascii="Consolas" w:eastAsia="Times New Roman" w:hAnsi="Consolas" w:cs="Times New Roman"/>
-          <w:color w:val="000000"/>
-          <w:sz w:val="21"/>
-          <w:szCs w:val="21"/>
-          <w:lang w:eastAsia="pt-BR"/>
-        </w:rPr>
-        <w:t xml:space="preserve">, </w:t>
-      </w:r>
-      <w:r>
-        <w:rPr>
-          <w:rFonts w:ascii="Consolas" w:eastAsia="Times New Roman" w:hAnsi="Consolas" w:cs="Times New Roman"/>
-          <w:color w:val="00979C"/>
-          <w:sz w:val="21"/>
-          <w:szCs w:val="21"/>
-          <w:lang w:eastAsia="pt-BR"/>
-        </w:rPr>
-        <w:t>INPUT</w:t>
-      </w:r>
-      <w:r>
-        <w:rPr>
-          <w:rFonts w:ascii="Consolas" w:eastAsia="Times New Roman" w:hAnsi="Consolas" w:cs="Times New Roman"/>
-          <w:color w:val="000000"/>
-          <w:sz w:val="21"/>
-          <w:szCs w:val="21"/>
-          <w:lang w:eastAsia="pt-BR"/>
-        </w:rPr>
-        <w:t>);</w:t>
+        <w:t>  {</w:t>
       </w:r>
     </w:p>
     <w:p>
@@ -1643,19 +2783,18 @@
           <w:szCs w:val="21"/>
           <w:lang w:eastAsia="pt-BR"/>
         </w:rPr>
-        <w:t xml:space="preserve">  </w:t>
+        <w:t xml:space="preserve">    </w:t>
       </w:r>
       <w:proofErr w:type="spellStart"/>
-      <w:proofErr w:type="gramStart"/>
-      <w:r>
-        <w:rPr>
-          <w:rFonts w:ascii="Consolas" w:eastAsia="Times New Roman" w:hAnsi="Consolas" w:cs="Times New Roman"/>
-          <w:color w:val="E97366"/>
-          <w:sz w:val="21"/>
-          <w:szCs w:val="21"/>
-          <w:lang w:eastAsia="pt-BR"/>
-        </w:rPr>
-        <w:t>pinMode</w:t>
+      <w:r>
+        <w:rPr>
+          <w:rFonts w:ascii="Consolas" w:eastAsia="Times New Roman" w:hAnsi="Consolas" w:cs="Times New Roman"/>
+          <w:color w:val="000000"/>
+          <w:sz w:val="21"/>
+          <w:szCs w:val="21"/>
+          <w:lang w:eastAsia="pt-BR"/>
+        </w:rPr>
+        <w:t>Joystick.setButton</w:t>
       </w:r>
       <w:proofErr w:type="spellEnd"/>
       <w:r>
@@ -1668,7 +2807,6 @@
         </w:rPr>
         <w:t>(</w:t>
       </w:r>
-      <w:proofErr w:type="gramEnd"/>
       <w:r>
         <w:rPr>
           <w:rFonts w:ascii="Consolas" w:eastAsia="Times New Roman" w:hAnsi="Consolas" w:cs="Times New Roman"/>
@@ -1677,7 +2815,7 @@
           <w:szCs w:val="21"/>
           <w:lang w:eastAsia="pt-BR"/>
         </w:rPr>
-        <w:t>2</w:t>
+        <w:t>0</w:t>
       </w:r>
       <w:r>
         <w:rPr>
@@ -1689,16 +2827,18 @@
         </w:rPr>
         <w:t xml:space="preserve">, </w:t>
       </w:r>
-      <w:r>
-        <w:rPr>
-          <w:rFonts w:ascii="Consolas" w:eastAsia="Times New Roman" w:hAnsi="Consolas" w:cs="Times New Roman"/>
-          <w:color w:val="00979C"/>
-          <w:sz w:val="21"/>
-          <w:szCs w:val="21"/>
-          <w:lang w:eastAsia="pt-BR"/>
-        </w:rPr>
-        <w:t>INPUT_PULLUP</w:t>
-      </w:r>
+      <w:proofErr w:type="spellStart"/>
+      <w:r>
+        <w:rPr>
+          <w:rFonts w:ascii="Consolas" w:eastAsia="Times New Roman" w:hAnsi="Consolas" w:cs="Times New Roman"/>
+          <w:color w:val="000000"/>
+          <w:sz w:val="21"/>
+          <w:szCs w:val="21"/>
+          <w:lang w:eastAsia="pt-BR"/>
+        </w:rPr>
+        <w:t>currentButtonState</w:t>
+      </w:r>
+      <w:proofErr w:type="spellEnd"/>
       <w:r>
         <w:rPr>
           <w:rFonts w:ascii="Consolas" w:eastAsia="Times New Roman" w:hAnsi="Consolas" w:cs="Times New Roman"/>
@@ -1722,6 +2862,60 @@
           <w:lang w:eastAsia="pt-BR"/>
         </w:rPr>
       </w:pPr>
+      <w:r>
+        <w:rPr>
+          <w:rFonts w:ascii="Consolas" w:eastAsia="Times New Roman" w:hAnsi="Consolas" w:cs="Times New Roman"/>
+          <w:color w:val="000000"/>
+          <w:sz w:val="21"/>
+          <w:szCs w:val="21"/>
+          <w:lang w:eastAsia="pt-BR"/>
+        </w:rPr>
+        <w:t xml:space="preserve">    </w:t>
+      </w:r>
+      <w:proofErr w:type="spellStart"/>
+      <w:r>
+        <w:rPr>
+          <w:rFonts w:ascii="Consolas" w:eastAsia="Times New Roman" w:hAnsi="Consolas" w:cs="Times New Roman"/>
+          <w:color w:val="000000"/>
+          <w:sz w:val="21"/>
+          <w:szCs w:val="21"/>
+          <w:lang w:eastAsia="pt-BR"/>
+        </w:rPr>
+        <w:t>lastButtonState</w:t>
+      </w:r>
+      <w:proofErr w:type="spellEnd"/>
+      <w:r>
+        <w:rPr>
+          <w:rFonts w:ascii="Consolas" w:eastAsia="Times New Roman" w:hAnsi="Consolas" w:cs="Times New Roman"/>
+          <w:color w:val="000000"/>
+          <w:sz w:val="21"/>
+          <w:szCs w:val="21"/>
+          <w:lang w:eastAsia="pt-BR"/>
+        </w:rPr>
+        <w:t xml:space="preserve"> = </w:t>
+      </w:r>
+      <w:proofErr w:type="spellStart"/>
+      <w:r>
+        <w:rPr>
+          <w:rFonts w:ascii="Consolas" w:eastAsia="Times New Roman" w:hAnsi="Consolas" w:cs="Times New Roman"/>
+          <w:color w:val="000000"/>
+          <w:sz w:val="21"/>
+          <w:szCs w:val="21"/>
+          <w:lang w:eastAsia="pt-BR"/>
+        </w:rPr>
+        <w:t>currentButtonState</w:t>
+      </w:r>
+      <w:proofErr w:type="spellEnd"/>
+      <w:r>
+        <w:rPr>
+          <w:rFonts w:ascii="Consolas" w:eastAsia="Times New Roman" w:hAnsi="Consolas" w:cs="Times New Roman"/>
+          <w:color w:val="000000"/>
+          <w:sz w:val="21"/>
+          <w:szCs w:val="21"/>
+          <w:lang w:eastAsia="pt-BR"/>
+        </w:rPr>
+        <w:t>;</w:t>
+      </w:r>
     </w:p>
     <w:p>
       <w:pPr>
@@ -1743,39 +2937,7 @@
           <w:szCs w:val="21"/>
           <w:lang w:eastAsia="pt-BR"/>
         </w:rPr>
-        <w:t xml:space="preserve">  </w:t>
-      </w:r>
-      <w:proofErr w:type="spellStart"/>
-      <w:r>
-        <w:rPr>
-          <w:rFonts w:ascii="Consolas" w:eastAsia="Times New Roman" w:hAnsi="Consolas" w:cs="Times New Roman"/>
-          <w:color w:val="000000"/>
-          <w:sz w:val="21"/>
-          <w:szCs w:val="21"/>
-          <w:lang w:eastAsia="pt-BR"/>
-        </w:rPr>
-        <w:t>Joystick.</w:t>
-      </w:r>
-      <w:r>
-        <w:rPr>
-          <w:rFonts w:ascii="Consolas" w:eastAsia="Times New Roman" w:hAnsi="Consolas" w:cs="Times New Roman"/>
-          <w:color w:val="E97366"/>
-          <w:sz w:val="21"/>
-          <w:szCs w:val="21"/>
-          <w:lang w:eastAsia="pt-BR"/>
-        </w:rPr>
-        <w:t>begin</w:t>
-      </w:r>
-      <w:proofErr w:type="spellEnd"/>
-      <w:r>
-        <w:rPr>
-          <w:rFonts w:ascii="Consolas" w:eastAsia="Times New Roman" w:hAnsi="Consolas" w:cs="Times New Roman"/>
-          <w:color w:val="000000"/>
-          <w:sz w:val="21"/>
-          <w:szCs w:val="21"/>
-          <w:lang w:eastAsia="pt-BR"/>
-        </w:rPr>
-        <w:t>();</w:t>
+        <w:t>  }</w:t>
       </w:r>
     </w:p>
     <w:p>
@@ -1790,16 +2952,6 @@
           <w:lang w:eastAsia="pt-BR"/>
         </w:rPr>
       </w:pPr>
-      <w:r>
-        <w:rPr>
-          <w:rFonts w:ascii="Consolas" w:eastAsia="Times New Roman" w:hAnsi="Consolas" w:cs="Times New Roman"/>
-          <w:color w:val="000000"/>
-          <w:sz w:val="21"/>
-          <w:szCs w:val="21"/>
-          <w:lang w:eastAsia="pt-BR"/>
-        </w:rPr>
-        <w:t>}</w:t>
-      </w:r>
     </w:p>
     <w:p>
       <w:pPr>
@@ -1813,1167 +2965,27 @@
           <w:lang w:eastAsia="pt-BR"/>
         </w:rPr>
       </w:pPr>
-    </w:p>
-    <w:p>
-      <w:pPr>
-        <w:shd w:val="clear" w:color="auto" w:fill="FFFFFE"/>
-        <w:spacing w:after="0" w:line="285" w:lineRule="atLeast"/>
-        <w:rPr>
-          <w:rFonts w:ascii="Consolas" w:eastAsia="Times New Roman" w:hAnsi="Consolas" w:cs="Times New Roman"/>
-          <w:color w:val="000000"/>
-          <w:sz w:val="21"/>
-          <w:szCs w:val="21"/>
-          <w:lang w:eastAsia="pt-BR"/>
-        </w:rPr>
-      </w:pPr>
-      <w:r>
-        <w:rPr>
-          <w:rFonts w:ascii="Consolas" w:eastAsia="Times New Roman" w:hAnsi="Consolas" w:cs="Times New Roman"/>
-          <w:color w:val="000000"/>
-          <w:sz w:val="21"/>
-          <w:szCs w:val="21"/>
-          <w:lang w:eastAsia="pt-BR"/>
-        </w:rPr>
-        <w:t>// define o estado inicial do botão</w:t>
-      </w:r>
-      <w:r>
-        <w:rPr>
-          <w:rFonts w:ascii="Consolas" w:eastAsia="Times New Roman" w:hAnsi="Consolas" w:cs="Times New Roman"/>
-          <w:color w:val="000000"/>
-          <w:sz w:val="21"/>
-          <w:szCs w:val="21"/>
-          <w:lang w:eastAsia="pt-BR"/>
-        </w:rPr>
-        <w:t xml:space="preserve"> (não pressionado)</w:t>
-      </w:r>
-    </w:p>
-    <w:p>
-      <w:pPr>
-        <w:shd w:val="clear" w:color="auto" w:fill="FFFFFE"/>
-        <w:spacing w:after="0" w:line="285" w:lineRule="atLeast"/>
-        <w:rPr>
-          <w:rFonts w:ascii="Consolas" w:eastAsia="Times New Roman" w:hAnsi="Consolas" w:cs="Times New Roman"/>
-          <w:color w:val="000000"/>
-          <w:sz w:val="21"/>
-          <w:szCs w:val="21"/>
-          <w:lang w:eastAsia="pt-BR"/>
-        </w:rPr>
-      </w:pPr>
-      <w:proofErr w:type="spellStart"/>
+      <w:r>
+        <w:rPr>
+          <w:rFonts w:ascii="Consolas" w:eastAsia="Times New Roman" w:hAnsi="Consolas" w:cs="Times New Roman"/>
+          <w:color w:val="000000"/>
+          <w:sz w:val="21"/>
+          <w:szCs w:val="21"/>
+          <w:lang w:eastAsia="pt-BR"/>
+        </w:rPr>
+        <w:t xml:space="preserve">  </w:t>
+      </w:r>
       <w:proofErr w:type="gramStart"/>
       <w:r>
         <w:rPr>
           <w:rFonts w:ascii="Consolas" w:eastAsia="Times New Roman" w:hAnsi="Consolas" w:cs="Times New Roman"/>
-          <w:color w:val="0000FF"/>
-          <w:sz w:val="21"/>
-          <w:szCs w:val="21"/>
-          <w:lang w:eastAsia="pt-BR"/>
-        </w:rPr>
-        <w:t>int</w:t>
-      </w:r>
-      <w:proofErr w:type="spellEnd"/>
-      <w:proofErr w:type="gramEnd"/>
-      <w:r>
-        <w:rPr>
-          <w:rFonts w:ascii="Consolas" w:eastAsia="Times New Roman" w:hAnsi="Consolas" w:cs="Times New Roman"/>
-          <w:color w:val="000000"/>
-          <w:sz w:val="21"/>
-          <w:szCs w:val="21"/>
-          <w:lang w:eastAsia="pt-BR"/>
-        </w:rPr>
-        <w:t xml:space="preserve"> </w:t>
-      </w:r>
-      <w:proofErr w:type="spellStart"/>
-      <w:r>
-        <w:rPr>
-          <w:rFonts w:ascii="Consolas" w:eastAsia="Times New Roman" w:hAnsi="Consolas" w:cs="Times New Roman"/>
-          <w:color w:val="000000"/>
-          <w:sz w:val="21"/>
-          <w:szCs w:val="21"/>
-          <w:lang w:eastAsia="pt-BR"/>
-        </w:rPr>
-        <w:t>lastButtonState</w:t>
-      </w:r>
-      <w:proofErr w:type="spellEnd"/>
-      <w:r>
-        <w:rPr>
-          <w:rFonts w:ascii="Consolas" w:eastAsia="Times New Roman" w:hAnsi="Consolas" w:cs="Times New Roman"/>
-          <w:color w:val="000000"/>
-          <w:sz w:val="21"/>
-          <w:szCs w:val="21"/>
-          <w:lang w:eastAsia="pt-BR"/>
-        </w:rPr>
-        <w:t xml:space="preserve"> = </w:t>
-      </w:r>
-      <w:r>
-        <w:rPr>
-          <w:rFonts w:ascii="Consolas" w:eastAsia="Times New Roman" w:hAnsi="Consolas" w:cs="Times New Roman"/>
-          <w:color w:val="098658"/>
-          <w:sz w:val="21"/>
-          <w:szCs w:val="21"/>
-          <w:lang w:eastAsia="pt-BR"/>
-        </w:rPr>
-        <w:t>0</w:t>
-      </w:r>
-      <w:r>
-        <w:rPr>
-          <w:rFonts w:ascii="Consolas" w:eastAsia="Times New Roman" w:hAnsi="Consolas" w:cs="Times New Roman"/>
-          <w:color w:val="000000"/>
-          <w:sz w:val="21"/>
-          <w:szCs w:val="21"/>
-          <w:lang w:eastAsia="pt-BR"/>
-        </w:rPr>
-        <w:t>;</w:t>
-      </w:r>
-    </w:p>
-    <w:p>
-      <w:pPr>
-        <w:shd w:val="clear" w:color="auto" w:fill="FFFFFE"/>
-        <w:spacing w:after="0" w:line="285" w:lineRule="atLeast"/>
-        <w:rPr>
-          <w:rFonts w:ascii="Consolas" w:eastAsia="Times New Roman" w:hAnsi="Consolas" w:cs="Times New Roman"/>
-          <w:color w:val="000000"/>
-          <w:sz w:val="21"/>
-          <w:szCs w:val="21"/>
-          <w:lang w:eastAsia="pt-BR"/>
-        </w:rPr>
-      </w:pPr>
-    </w:p>
-    <w:p>
-      <w:pPr>
-        <w:shd w:val="clear" w:color="auto" w:fill="FFFFFE"/>
-        <w:spacing w:after="0" w:line="285" w:lineRule="atLeast"/>
-        <w:rPr>
-          <w:rFonts w:ascii="Consolas" w:eastAsia="Times New Roman" w:hAnsi="Consolas" w:cs="Times New Roman"/>
-          <w:color w:val="000000"/>
-          <w:sz w:val="21"/>
-          <w:szCs w:val="21"/>
-          <w:lang w:eastAsia="pt-BR"/>
-        </w:rPr>
-      </w:pPr>
-      <w:proofErr w:type="spellStart"/>
-      <w:proofErr w:type="gramStart"/>
-      <w:r>
-        <w:rPr>
-          <w:rFonts w:ascii="Consolas" w:eastAsia="Times New Roman" w:hAnsi="Consolas" w:cs="Times New Roman"/>
-          <w:color w:val="0000FF"/>
-          <w:sz w:val="21"/>
-          <w:szCs w:val="21"/>
-          <w:lang w:eastAsia="pt-BR"/>
-        </w:rPr>
-        <w:t>void</w:t>
-      </w:r>
-      <w:proofErr w:type="spellEnd"/>
-      <w:proofErr w:type="gramEnd"/>
-      <w:r>
-        <w:rPr>
-          <w:rFonts w:ascii="Consolas" w:eastAsia="Times New Roman" w:hAnsi="Consolas" w:cs="Times New Roman"/>
-          <w:color w:val="000000"/>
-          <w:sz w:val="21"/>
-          <w:szCs w:val="21"/>
-          <w:lang w:eastAsia="pt-BR"/>
-        </w:rPr>
-        <w:t xml:space="preserve"> </w:t>
-      </w:r>
-      <w:r>
-        <w:rPr>
-          <w:rFonts w:ascii="Consolas" w:eastAsia="Times New Roman" w:hAnsi="Consolas" w:cs="Times New Roman"/>
-          <w:color w:val="5E6D03"/>
-          <w:sz w:val="21"/>
-          <w:szCs w:val="21"/>
-          <w:lang w:eastAsia="pt-BR"/>
-        </w:rPr>
-        <w:t>loop</w:t>
-      </w:r>
-      <w:r>
-        <w:rPr>
-          <w:rFonts w:ascii="Consolas" w:eastAsia="Times New Roman" w:hAnsi="Consolas" w:cs="Times New Roman"/>
-          <w:color w:val="000000"/>
-          <w:sz w:val="21"/>
-          <w:szCs w:val="21"/>
-          <w:lang w:eastAsia="pt-BR"/>
-        </w:rPr>
-        <w:t>() {</w:t>
-      </w:r>
-    </w:p>
-    <w:p>
-      <w:pPr>
-        <w:shd w:val="clear" w:color="auto" w:fill="FFFFFE"/>
-        <w:spacing w:after="0" w:line="285" w:lineRule="atLeast"/>
-        <w:rPr>
-          <w:rFonts w:ascii="Consolas" w:eastAsia="Times New Roman" w:hAnsi="Consolas" w:cs="Times New Roman"/>
-          <w:color w:val="000000"/>
-          <w:sz w:val="21"/>
-          <w:szCs w:val="21"/>
-          <w:lang w:eastAsia="pt-BR"/>
-        </w:rPr>
-      </w:pPr>
-    </w:p>
-    <w:p>
-      <w:pPr>
-        <w:shd w:val="clear" w:color="auto" w:fill="FFFFFE"/>
-        <w:spacing w:after="0" w:line="285" w:lineRule="atLeast"/>
-        <w:rPr>
-          <w:rFonts w:ascii="Consolas" w:eastAsia="Times New Roman" w:hAnsi="Consolas" w:cs="Times New Roman"/>
-          <w:color w:val="000000"/>
-          <w:sz w:val="21"/>
-          <w:szCs w:val="21"/>
-          <w:lang w:eastAsia="pt-BR"/>
-        </w:rPr>
-      </w:pPr>
-      <w:r>
-        <w:rPr>
-          <w:rFonts w:ascii="Consolas" w:eastAsia="Times New Roman" w:hAnsi="Consolas" w:cs="Times New Roman"/>
-          <w:color w:val="000000"/>
-          <w:sz w:val="21"/>
-          <w:szCs w:val="21"/>
-          <w:lang w:eastAsia="pt-BR"/>
-        </w:rPr>
-        <w:t xml:space="preserve">// lê a posição vertical (y) do joystick </w:t>
-      </w:r>
-    </w:p>
-    <w:p>
-      <w:pPr>
-        <w:shd w:val="clear" w:color="auto" w:fill="FFFFFE"/>
-        <w:spacing w:after="0" w:line="285" w:lineRule="atLeast"/>
-        <w:rPr>
-          <w:rFonts w:ascii="Consolas" w:eastAsia="Times New Roman" w:hAnsi="Consolas" w:cs="Times New Roman"/>
-          <w:color w:val="000000"/>
-          <w:sz w:val="21"/>
-          <w:szCs w:val="21"/>
-          <w:lang w:eastAsia="pt-BR"/>
-        </w:rPr>
-      </w:pPr>
-      <w:r>
-        <w:rPr>
-          <w:rFonts w:ascii="Consolas" w:eastAsia="Times New Roman" w:hAnsi="Consolas" w:cs="Times New Roman"/>
-          <w:color w:val="000000"/>
-          <w:sz w:val="21"/>
-          <w:szCs w:val="21"/>
-          <w:lang w:eastAsia="pt-BR"/>
-        </w:rPr>
-        <w:t xml:space="preserve">  </w:t>
-      </w:r>
-      <w:proofErr w:type="spellStart"/>
-      <w:r>
-        <w:rPr>
-          <w:rFonts w:ascii="Consolas" w:eastAsia="Times New Roman" w:hAnsi="Consolas" w:cs="Times New Roman"/>
-          <w:color w:val="000000"/>
-          <w:sz w:val="21"/>
-          <w:szCs w:val="21"/>
-          <w:lang w:eastAsia="pt-BR"/>
-        </w:rPr>
-        <w:t>Joystick.setRyAxis</w:t>
-      </w:r>
-      <w:proofErr w:type="spellEnd"/>
-      <w:r>
-        <w:rPr>
-          <w:rFonts w:ascii="Consolas" w:eastAsia="Times New Roman" w:hAnsi="Consolas" w:cs="Times New Roman"/>
-          <w:color w:val="000000"/>
-          <w:sz w:val="21"/>
-          <w:szCs w:val="21"/>
-          <w:lang w:eastAsia="pt-BR"/>
-        </w:rPr>
-        <w:t>(</w:t>
-      </w:r>
-      <w:proofErr w:type="spellStart"/>
-      <w:proofErr w:type="gramStart"/>
-      <w:r>
-        <w:rPr>
-          <w:rFonts w:ascii="Consolas" w:eastAsia="Times New Roman" w:hAnsi="Consolas" w:cs="Times New Roman"/>
           <w:color w:val="E97366"/>
           <w:sz w:val="21"/>
           <w:szCs w:val="21"/>
           <w:lang w:eastAsia="pt-BR"/>
         </w:rPr>
-        <w:t>map</w:t>
-      </w:r>
-      <w:proofErr w:type="spellEnd"/>
-      <w:r>
-        <w:rPr>
-          <w:rFonts w:ascii="Consolas" w:eastAsia="Times New Roman" w:hAnsi="Consolas" w:cs="Times New Roman"/>
-          <w:color w:val="000000"/>
-          <w:sz w:val="21"/>
-          <w:szCs w:val="21"/>
-          <w:lang w:eastAsia="pt-BR"/>
-        </w:rPr>
-        <w:t>(</w:t>
-      </w:r>
-      <w:proofErr w:type="spellStart"/>
-      <w:proofErr w:type="gramEnd"/>
-      <w:r>
-        <w:rPr>
-          <w:rFonts w:ascii="Consolas" w:eastAsia="Times New Roman" w:hAnsi="Consolas" w:cs="Times New Roman"/>
-          <w:color w:val="E97366"/>
-          <w:sz w:val="21"/>
-          <w:szCs w:val="21"/>
-          <w:lang w:eastAsia="pt-BR"/>
-        </w:rPr>
-        <w:t>analogRead</w:t>
-      </w:r>
-      <w:proofErr w:type="spellEnd"/>
-      <w:r>
-        <w:rPr>
-          <w:rFonts w:ascii="Consolas" w:eastAsia="Times New Roman" w:hAnsi="Consolas" w:cs="Times New Roman"/>
-          <w:color w:val="000000"/>
-          <w:sz w:val="21"/>
-          <w:szCs w:val="21"/>
-          <w:lang w:eastAsia="pt-BR"/>
-        </w:rPr>
-        <w:t>(</w:t>
-      </w:r>
-      <w:r>
-        <w:rPr>
-          <w:rFonts w:ascii="Consolas" w:eastAsia="Times New Roman" w:hAnsi="Consolas" w:cs="Times New Roman"/>
-          <w:color w:val="00979C"/>
-          <w:sz w:val="21"/>
-          <w:szCs w:val="21"/>
-          <w:lang w:eastAsia="pt-BR"/>
-        </w:rPr>
-        <w:t>A0</w:t>
-      </w:r>
-      <w:r>
-        <w:rPr>
-          <w:rFonts w:ascii="Consolas" w:eastAsia="Times New Roman" w:hAnsi="Consolas" w:cs="Times New Roman"/>
-          <w:color w:val="000000"/>
-          <w:sz w:val="21"/>
-          <w:szCs w:val="21"/>
-          <w:lang w:eastAsia="pt-BR"/>
-        </w:rPr>
-        <w:t xml:space="preserve">), </w:t>
-      </w:r>
-      <w:r>
-        <w:rPr>
-          <w:rFonts w:ascii="Consolas" w:eastAsia="Times New Roman" w:hAnsi="Consolas" w:cs="Times New Roman"/>
-          <w:color w:val="098658"/>
-          <w:sz w:val="21"/>
-          <w:szCs w:val="21"/>
-          <w:lang w:eastAsia="pt-BR"/>
-        </w:rPr>
-        <w:t>0</w:t>
-      </w:r>
-      <w:r>
-        <w:rPr>
-          <w:rFonts w:ascii="Consolas" w:eastAsia="Times New Roman" w:hAnsi="Consolas" w:cs="Times New Roman"/>
-          <w:color w:val="000000"/>
-          <w:sz w:val="21"/>
-          <w:szCs w:val="21"/>
-          <w:lang w:eastAsia="pt-BR"/>
-        </w:rPr>
-        <w:t xml:space="preserve">, </w:t>
-      </w:r>
-      <w:r>
-        <w:rPr>
-          <w:rFonts w:ascii="Consolas" w:eastAsia="Times New Roman" w:hAnsi="Consolas" w:cs="Times New Roman"/>
-          <w:color w:val="098658"/>
-          <w:sz w:val="21"/>
-          <w:szCs w:val="21"/>
-          <w:lang w:eastAsia="pt-BR"/>
-        </w:rPr>
-        <w:t>1023</w:t>
-      </w:r>
-      <w:r>
-        <w:rPr>
-          <w:rFonts w:ascii="Consolas" w:eastAsia="Times New Roman" w:hAnsi="Consolas" w:cs="Times New Roman"/>
-          <w:color w:val="000000"/>
-          <w:sz w:val="21"/>
-          <w:szCs w:val="21"/>
-          <w:lang w:eastAsia="pt-BR"/>
-        </w:rPr>
-        <w:t xml:space="preserve">, </w:t>
-      </w:r>
-      <w:r>
-        <w:rPr>
-          <w:rFonts w:ascii="Consolas" w:eastAsia="Times New Roman" w:hAnsi="Consolas" w:cs="Times New Roman"/>
-          <w:color w:val="098658"/>
-          <w:sz w:val="21"/>
-          <w:szCs w:val="21"/>
-          <w:lang w:eastAsia="pt-BR"/>
-        </w:rPr>
-        <w:t>0</w:t>
-      </w:r>
-      <w:r>
-        <w:rPr>
-          <w:rFonts w:ascii="Consolas" w:eastAsia="Times New Roman" w:hAnsi="Consolas" w:cs="Times New Roman"/>
-          <w:color w:val="000000"/>
-          <w:sz w:val="21"/>
-          <w:szCs w:val="21"/>
-          <w:lang w:eastAsia="pt-BR"/>
-        </w:rPr>
-        <w:t xml:space="preserve">, </w:t>
-      </w:r>
-      <w:r>
-        <w:rPr>
-          <w:rFonts w:ascii="Consolas" w:eastAsia="Times New Roman" w:hAnsi="Consolas" w:cs="Times New Roman"/>
-          <w:color w:val="098658"/>
-          <w:sz w:val="21"/>
-          <w:szCs w:val="21"/>
-          <w:lang w:eastAsia="pt-BR"/>
-        </w:rPr>
-        <w:t>1023</w:t>
-      </w:r>
-      <w:r>
-        <w:rPr>
-          <w:rFonts w:ascii="Consolas" w:eastAsia="Times New Roman" w:hAnsi="Consolas" w:cs="Times New Roman"/>
-          <w:color w:val="000000"/>
-          <w:sz w:val="21"/>
-          <w:szCs w:val="21"/>
-          <w:lang w:eastAsia="pt-BR"/>
-        </w:rPr>
-        <w:t>));</w:t>
-      </w:r>
-    </w:p>
-    <w:p>
-      <w:pPr>
-        <w:shd w:val="clear" w:color="auto" w:fill="FFFFFE"/>
-        <w:spacing w:after="0" w:line="285" w:lineRule="atLeast"/>
-        <w:rPr>
-          <w:rFonts w:ascii="Consolas" w:eastAsia="Times New Roman" w:hAnsi="Consolas" w:cs="Times New Roman"/>
-          <w:color w:val="000000"/>
-          <w:sz w:val="21"/>
-          <w:szCs w:val="21"/>
-          <w:lang w:eastAsia="pt-BR"/>
-        </w:rPr>
-      </w:pPr>
-    </w:p>
-    <w:p>
-      <w:pPr>
-        <w:shd w:val="clear" w:color="auto" w:fill="FFFFFE"/>
-        <w:spacing w:after="0" w:line="285" w:lineRule="atLeast"/>
-        <w:rPr>
-          <w:rFonts w:ascii="Consolas" w:eastAsia="Times New Roman" w:hAnsi="Consolas" w:cs="Times New Roman"/>
-          <w:color w:val="000000"/>
-          <w:sz w:val="21"/>
-          <w:szCs w:val="21"/>
-          <w:lang w:eastAsia="pt-BR"/>
-        </w:rPr>
-      </w:pPr>
-      <w:r>
-        <w:rPr>
-          <w:rFonts w:ascii="Consolas" w:eastAsia="Times New Roman" w:hAnsi="Consolas" w:cs="Times New Roman"/>
-          <w:color w:val="000000"/>
-          <w:sz w:val="21"/>
-          <w:szCs w:val="21"/>
-          <w:lang w:eastAsia="pt-BR"/>
-        </w:rPr>
-        <w:t xml:space="preserve">// lê a posição horizontal (x) do joystick </w:t>
-      </w:r>
-    </w:p>
-    <w:p>
-      <w:pPr>
-        <w:shd w:val="clear" w:color="auto" w:fill="FFFFFE"/>
-        <w:spacing w:after="0" w:line="285" w:lineRule="atLeast"/>
-        <w:rPr>
-          <w:rFonts w:ascii="Consolas" w:eastAsia="Times New Roman" w:hAnsi="Consolas" w:cs="Times New Roman"/>
-          <w:color w:val="000000"/>
-          <w:sz w:val="21"/>
-          <w:szCs w:val="21"/>
-          <w:lang w:eastAsia="pt-BR"/>
-        </w:rPr>
-      </w:pPr>
-      <w:r>
-        <w:rPr>
-          <w:rFonts w:ascii="Consolas" w:eastAsia="Times New Roman" w:hAnsi="Consolas" w:cs="Times New Roman"/>
-          <w:color w:val="000000"/>
-          <w:sz w:val="21"/>
-          <w:szCs w:val="21"/>
-          <w:lang w:eastAsia="pt-BR"/>
-        </w:rPr>
-        <w:t xml:space="preserve">  </w:t>
-      </w:r>
-      <w:proofErr w:type="spellStart"/>
-      <w:r>
-        <w:rPr>
-          <w:rFonts w:ascii="Consolas" w:eastAsia="Times New Roman" w:hAnsi="Consolas" w:cs="Times New Roman"/>
-          <w:color w:val="000000"/>
-          <w:sz w:val="21"/>
-          <w:szCs w:val="21"/>
-          <w:lang w:eastAsia="pt-BR"/>
-        </w:rPr>
-        <w:t>Joystick.setRxAxis</w:t>
-      </w:r>
-      <w:proofErr w:type="spellEnd"/>
-      <w:r>
-        <w:rPr>
-          <w:rFonts w:ascii="Consolas" w:eastAsia="Times New Roman" w:hAnsi="Consolas" w:cs="Times New Roman"/>
-          <w:color w:val="000000"/>
-          <w:sz w:val="21"/>
-          <w:szCs w:val="21"/>
-          <w:lang w:eastAsia="pt-BR"/>
-        </w:rPr>
-        <w:t>(</w:t>
-      </w:r>
-      <w:proofErr w:type="spellStart"/>
-      <w:proofErr w:type="gramStart"/>
-      <w:r>
-        <w:rPr>
-          <w:rFonts w:ascii="Consolas" w:eastAsia="Times New Roman" w:hAnsi="Consolas" w:cs="Times New Roman"/>
-          <w:color w:val="E97366"/>
-          <w:sz w:val="21"/>
-          <w:szCs w:val="21"/>
-          <w:lang w:eastAsia="pt-BR"/>
-        </w:rPr>
-        <w:t>map</w:t>
-      </w:r>
-      <w:proofErr w:type="spellEnd"/>
-      <w:r>
-        <w:rPr>
-          <w:rFonts w:ascii="Consolas" w:eastAsia="Times New Roman" w:hAnsi="Consolas" w:cs="Times New Roman"/>
-          <w:color w:val="000000"/>
-          <w:sz w:val="21"/>
-          <w:szCs w:val="21"/>
-          <w:lang w:eastAsia="pt-BR"/>
-        </w:rPr>
-        <w:t>(</w:t>
-      </w:r>
-      <w:proofErr w:type="spellStart"/>
-      <w:proofErr w:type="gramEnd"/>
-      <w:r>
-        <w:rPr>
-          <w:rFonts w:ascii="Consolas" w:eastAsia="Times New Roman" w:hAnsi="Consolas" w:cs="Times New Roman"/>
-          <w:color w:val="E97366"/>
-          <w:sz w:val="21"/>
-          <w:szCs w:val="21"/>
-          <w:lang w:eastAsia="pt-BR"/>
-        </w:rPr>
-        <w:t>analogRead</w:t>
-      </w:r>
-      <w:proofErr w:type="spellEnd"/>
-      <w:r>
-        <w:rPr>
-          <w:rFonts w:ascii="Consolas" w:eastAsia="Times New Roman" w:hAnsi="Consolas" w:cs="Times New Roman"/>
-          <w:color w:val="000000"/>
-          <w:sz w:val="21"/>
-          <w:szCs w:val="21"/>
-          <w:lang w:eastAsia="pt-BR"/>
-        </w:rPr>
-        <w:t>(</w:t>
-      </w:r>
-      <w:r>
-        <w:rPr>
-          <w:rFonts w:ascii="Consolas" w:eastAsia="Times New Roman" w:hAnsi="Consolas" w:cs="Times New Roman"/>
-          <w:color w:val="00979C"/>
-          <w:sz w:val="21"/>
-          <w:szCs w:val="21"/>
-          <w:lang w:eastAsia="pt-BR"/>
-        </w:rPr>
-        <w:t>A1</w:t>
-      </w:r>
-      <w:r>
-        <w:rPr>
-          <w:rFonts w:ascii="Consolas" w:eastAsia="Times New Roman" w:hAnsi="Consolas" w:cs="Times New Roman"/>
-          <w:color w:val="000000"/>
-          <w:sz w:val="21"/>
-          <w:szCs w:val="21"/>
-          <w:lang w:eastAsia="pt-BR"/>
-        </w:rPr>
-        <w:t xml:space="preserve">), </w:t>
-      </w:r>
-      <w:r>
-        <w:rPr>
-          <w:rFonts w:ascii="Consolas" w:eastAsia="Times New Roman" w:hAnsi="Consolas" w:cs="Times New Roman"/>
-          <w:color w:val="098658"/>
-          <w:sz w:val="21"/>
-          <w:szCs w:val="21"/>
-          <w:lang w:eastAsia="pt-BR"/>
-        </w:rPr>
-        <w:t>0</w:t>
-      </w:r>
-      <w:r>
-        <w:rPr>
-          <w:rFonts w:ascii="Consolas" w:eastAsia="Times New Roman" w:hAnsi="Consolas" w:cs="Times New Roman"/>
-          <w:color w:val="000000"/>
-          <w:sz w:val="21"/>
-          <w:szCs w:val="21"/>
-          <w:lang w:eastAsia="pt-BR"/>
-        </w:rPr>
-        <w:t xml:space="preserve">, </w:t>
-      </w:r>
-      <w:r>
-        <w:rPr>
-          <w:rFonts w:ascii="Consolas" w:eastAsia="Times New Roman" w:hAnsi="Consolas" w:cs="Times New Roman"/>
-          <w:color w:val="098658"/>
-          <w:sz w:val="21"/>
-          <w:szCs w:val="21"/>
-          <w:lang w:eastAsia="pt-BR"/>
-        </w:rPr>
-        <w:t>1023</w:t>
-      </w:r>
-      <w:r>
-        <w:rPr>
-          <w:rFonts w:ascii="Consolas" w:eastAsia="Times New Roman" w:hAnsi="Consolas" w:cs="Times New Roman"/>
-          <w:color w:val="000000"/>
-          <w:sz w:val="21"/>
-          <w:szCs w:val="21"/>
-          <w:lang w:eastAsia="pt-BR"/>
-        </w:rPr>
-        <w:t xml:space="preserve">, </w:t>
-      </w:r>
-      <w:r>
-        <w:rPr>
-          <w:rFonts w:ascii="Consolas" w:eastAsia="Times New Roman" w:hAnsi="Consolas" w:cs="Times New Roman"/>
-          <w:color w:val="098658"/>
-          <w:sz w:val="21"/>
-          <w:szCs w:val="21"/>
-          <w:lang w:eastAsia="pt-BR"/>
-        </w:rPr>
-        <w:t>0</w:t>
-      </w:r>
-      <w:r>
-        <w:rPr>
-          <w:rFonts w:ascii="Consolas" w:eastAsia="Times New Roman" w:hAnsi="Consolas" w:cs="Times New Roman"/>
-          <w:color w:val="000000"/>
-          <w:sz w:val="21"/>
-          <w:szCs w:val="21"/>
-          <w:lang w:eastAsia="pt-BR"/>
-        </w:rPr>
-        <w:t xml:space="preserve">, </w:t>
-      </w:r>
-      <w:r>
-        <w:rPr>
-          <w:rFonts w:ascii="Consolas" w:eastAsia="Times New Roman" w:hAnsi="Consolas" w:cs="Times New Roman"/>
-          <w:color w:val="098658"/>
-          <w:sz w:val="21"/>
-          <w:szCs w:val="21"/>
-          <w:lang w:eastAsia="pt-BR"/>
-        </w:rPr>
-        <w:t>1023</w:t>
-      </w:r>
-      <w:r>
-        <w:rPr>
-          <w:rFonts w:ascii="Consolas" w:eastAsia="Times New Roman" w:hAnsi="Consolas" w:cs="Times New Roman"/>
-          <w:color w:val="000000"/>
-          <w:sz w:val="21"/>
-          <w:szCs w:val="21"/>
-          <w:lang w:eastAsia="pt-BR"/>
-        </w:rPr>
-        <w:t>));</w:t>
-      </w:r>
-    </w:p>
-    <w:p>
-      <w:pPr>
-        <w:shd w:val="clear" w:color="auto" w:fill="FFFFFE"/>
-        <w:spacing w:after="0" w:line="285" w:lineRule="atLeast"/>
-        <w:rPr>
-          <w:rFonts w:ascii="Consolas" w:eastAsia="Times New Roman" w:hAnsi="Consolas" w:cs="Times New Roman"/>
-          <w:color w:val="000000"/>
-          <w:sz w:val="21"/>
-          <w:szCs w:val="21"/>
-          <w:lang w:eastAsia="pt-BR"/>
-        </w:rPr>
-      </w:pPr>
-    </w:p>
-    <w:p>
-      <w:pPr>
-        <w:shd w:val="clear" w:color="auto" w:fill="FFFFFE"/>
-        <w:spacing w:after="0" w:line="285" w:lineRule="atLeast"/>
-        <w:rPr>
-          <w:rFonts w:ascii="Consolas" w:eastAsia="Times New Roman" w:hAnsi="Consolas" w:cs="Times New Roman"/>
-          <w:color w:val="000000"/>
-          <w:sz w:val="21"/>
-          <w:szCs w:val="21"/>
-          <w:lang w:eastAsia="pt-BR"/>
-        </w:rPr>
-      </w:pPr>
-      <w:r>
-        <w:rPr>
-          <w:rFonts w:ascii="Consolas" w:eastAsia="Times New Roman" w:hAnsi="Consolas" w:cs="Times New Roman"/>
-          <w:color w:val="000000"/>
-          <w:sz w:val="21"/>
-          <w:szCs w:val="21"/>
-          <w:lang w:eastAsia="pt-BR"/>
-        </w:rPr>
-        <w:t>// lê o estado atual do botão e inverte a lógica para 0 = solto e 1 = pressionado</w:t>
-      </w:r>
-    </w:p>
-    <w:p>
-      <w:pPr>
-        <w:shd w:val="clear" w:color="auto" w:fill="FFFFFE"/>
-        <w:spacing w:after="0" w:line="285" w:lineRule="atLeast"/>
-        <w:rPr>
-          <w:rFonts w:ascii="Consolas" w:eastAsia="Times New Roman" w:hAnsi="Consolas" w:cs="Times New Roman"/>
-          <w:color w:val="000000"/>
-          <w:sz w:val="21"/>
-          <w:szCs w:val="21"/>
-          <w:lang w:eastAsia="pt-BR"/>
-        </w:rPr>
-      </w:pPr>
-      <w:r>
-        <w:rPr>
-          <w:rFonts w:ascii="Consolas" w:eastAsia="Times New Roman" w:hAnsi="Consolas" w:cs="Times New Roman"/>
-          <w:color w:val="000000"/>
-          <w:sz w:val="21"/>
-          <w:szCs w:val="21"/>
-          <w:lang w:eastAsia="pt-BR"/>
-        </w:rPr>
-        <w:t xml:space="preserve">  </w:t>
-      </w:r>
-      <w:proofErr w:type="spellStart"/>
-      <w:proofErr w:type="gramStart"/>
-      <w:r>
-        <w:rPr>
-          <w:rFonts w:ascii="Consolas" w:eastAsia="Times New Roman" w:hAnsi="Consolas" w:cs="Times New Roman"/>
-          <w:color w:val="0000FF"/>
-          <w:sz w:val="21"/>
-          <w:szCs w:val="21"/>
-          <w:lang w:eastAsia="pt-BR"/>
-        </w:rPr>
-        <w:t>int</w:t>
-      </w:r>
-      <w:proofErr w:type="spellEnd"/>
-      <w:proofErr w:type="gramEnd"/>
-      <w:r>
-        <w:rPr>
-          <w:rFonts w:ascii="Consolas" w:eastAsia="Times New Roman" w:hAnsi="Consolas" w:cs="Times New Roman"/>
-          <w:color w:val="000000"/>
-          <w:sz w:val="21"/>
-          <w:szCs w:val="21"/>
-          <w:lang w:eastAsia="pt-BR"/>
-        </w:rPr>
-        <w:t xml:space="preserve"> </w:t>
-      </w:r>
-      <w:proofErr w:type="spellStart"/>
-      <w:r>
-        <w:rPr>
-          <w:rFonts w:ascii="Consolas" w:eastAsia="Times New Roman" w:hAnsi="Consolas" w:cs="Times New Roman"/>
-          <w:color w:val="000000"/>
-          <w:sz w:val="21"/>
-          <w:szCs w:val="21"/>
-          <w:lang w:eastAsia="pt-BR"/>
-        </w:rPr>
-        <w:t>currentButtonState</w:t>
-      </w:r>
-      <w:proofErr w:type="spellEnd"/>
-      <w:r>
-        <w:rPr>
-          <w:rFonts w:ascii="Consolas" w:eastAsia="Times New Roman" w:hAnsi="Consolas" w:cs="Times New Roman"/>
-          <w:color w:val="000000"/>
-          <w:sz w:val="21"/>
-          <w:szCs w:val="21"/>
-          <w:lang w:eastAsia="pt-BR"/>
-        </w:rPr>
-        <w:t xml:space="preserve"> = !</w:t>
-      </w:r>
-      <w:proofErr w:type="spellStart"/>
-      <w:r>
-        <w:rPr>
-          <w:rFonts w:ascii="Consolas" w:eastAsia="Times New Roman" w:hAnsi="Consolas" w:cs="Times New Roman"/>
-          <w:color w:val="E97366"/>
-          <w:sz w:val="21"/>
-          <w:szCs w:val="21"/>
-          <w:lang w:eastAsia="pt-BR"/>
-        </w:rPr>
-        <w:t>digitalRead</w:t>
-      </w:r>
-      <w:proofErr w:type="spellEnd"/>
-      <w:r>
-        <w:rPr>
-          <w:rFonts w:ascii="Consolas" w:eastAsia="Times New Roman" w:hAnsi="Consolas" w:cs="Times New Roman"/>
-          <w:color w:val="000000"/>
-          <w:sz w:val="21"/>
-          <w:szCs w:val="21"/>
-          <w:lang w:eastAsia="pt-BR"/>
-        </w:rPr>
-        <w:t>(</w:t>
-      </w:r>
-      <w:r>
-        <w:rPr>
-          <w:rFonts w:ascii="Consolas" w:eastAsia="Times New Roman" w:hAnsi="Consolas" w:cs="Times New Roman"/>
-          <w:color w:val="098658"/>
-          <w:sz w:val="21"/>
-          <w:szCs w:val="21"/>
-          <w:lang w:eastAsia="pt-BR"/>
-        </w:rPr>
-        <w:t>2</w:t>
-      </w:r>
-      <w:r>
-        <w:rPr>
-          <w:rFonts w:ascii="Consolas" w:eastAsia="Times New Roman" w:hAnsi="Consolas" w:cs="Times New Roman"/>
-          <w:color w:val="000000"/>
-          <w:sz w:val="21"/>
-          <w:szCs w:val="21"/>
-          <w:lang w:eastAsia="pt-BR"/>
-        </w:rPr>
-        <w:t>);</w:t>
-      </w:r>
-    </w:p>
-    <w:p>
-      <w:pPr>
-        <w:shd w:val="clear" w:color="auto" w:fill="FFFFFE"/>
-        <w:spacing w:after="0" w:line="285" w:lineRule="atLeast"/>
-        <w:rPr>
-          <w:rFonts w:ascii="Consolas" w:eastAsia="Times New Roman" w:hAnsi="Consolas" w:cs="Times New Roman"/>
-          <w:color w:val="000000"/>
-          <w:sz w:val="21"/>
-          <w:szCs w:val="21"/>
-          <w:lang w:eastAsia="pt-BR"/>
-        </w:rPr>
-      </w:pPr>
-    </w:p>
-    <w:p>
-      <w:pPr>
-        <w:shd w:val="clear" w:color="auto" w:fill="FFFFFE"/>
-        <w:spacing w:after="0" w:line="285" w:lineRule="atLeast"/>
-        <w:rPr>
-          <w:rFonts w:ascii="Consolas" w:eastAsia="Times New Roman" w:hAnsi="Consolas" w:cs="Times New Roman"/>
-          <w:color w:val="000000"/>
-          <w:sz w:val="21"/>
-          <w:szCs w:val="21"/>
-          <w:lang w:eastAsia="pt-BR"/>
-        </w:rPr>
-      </w:pPr>
-      <w:r>
-        <w:rPr>
-          <w:rFonts w:ascii="Consolas" w:eastAsia="Times New Roman" w:hAnsi="Consolas" w:cs="Times New Roman"/>
-          <w:color w:val="000000"/>
-          <w:sz w:val="21"/>
-          <w:szCs w:val="21"/>
-          <w:lang w:eastAsia="pt-BR"/>
-        </w:rPr>
-        <w:t>// atualiza o botão se o estado mudou</w:t>
-      </w:r>
-    </w:p>
-    <w:p>
-      <w:pPr>
-        <w:shd w:val="clear" w:color="auto" w:fill="FFFFFE"/>
-        <w:spacing w:after="0" w:line="285" w:lineRule="atLeast"/>
-        <w:rPr>
-          <w:rFonts w:ascii="Consolas" w:eastAsia="Times New Roman" w:hAnsi="Consolas" w:cs="Times New Roman"/>
-          <w:color w:val="000000"/>
-          <w:sz w:val="21"/>
-          <w:szCs w:val="21"/>
-          <w:lang w:eastAsia="pt-BR"/>
-        </w:rPr>
-      </w:pPr>
-      <w:r>
-        <w:rPr>
-          <w:rFonts w:ascii="Consolas" w:eastAsia="Times New Roman" w:hAnsi="Consolas" w:cs="Times New Roman"/>
-          <w:color w:val="000000"/>
-          <w:sz w:val="21"/>
-          <w:szCs w:val="21"/>
-          <w:lang w:eastAsia="pt-BR"/>
-        </w:rPr>
-        <w:t xml:space="preserve">  </w:t>
-      </w:r>
-      <w:proofErr w:type="spellStart"/>
-      <w:proofErr w:type="gramStart"/>
-      <w:r>
-        <w:rPr>
-          <w:rFonts w:ascii="Consolas" w:eastAsia="Times New Roman" w:hAnsi="Consolas" w:cs="Times New Roman"/>
-          <w:color w:val="0000FF"/>
-          <w:sz w:val="21"/>
-          <w:szCs w:val="21"/>
-          <w:lang w:eastAsia="pt-BR"/>
-        </w:rPr>
-        <w:t>if</w:t>
-      </w:r>
-      <w:proofErr w:type="spellEnd"/>
-      <w:proofErr w:type="gramEnd"/>
-      <w:r>
-        <w:rPr>
-          <w:rFonts w:ascii="Consolas" w:eastAsia="Times New Roman" w:hAnsi="Consolas" w:cs="Times New Roman"/>
-          <w:color w:val="000000"/>
-          <w:sz w:val="21"/>
-          <w:szCs w:val="21"/>
-          <w:lang w:eastAsia="pt-BR"/>
-        </w:rPr>
-        <w:t xml:space="preserve"> (</w:t>
-      </w:r>
-      <w:proofErr w:type="spellStart"/>
-      <w:r>
-        <w:rPr>
-          <w:rFonts w:ascii="Consolas" w:eastAsia="Times New Roman" w:hAnsi="Consolas" w:cs="Times New Roman"/>
-          <w:color w:val="000000"/>
-          <w:sz w:val="21"/>
-          <w:szCs w:val="21"/>
-          <w:lang w:eastAsia="pt-BR"/>
-        </w:rPr>
-        <w:t>currentButtonState</w:t>
-      </w:r>
-      <w:proofErr w:type="spellEnd"/>
-      <w:r>
-        <w:rPr>
-          <w:rFonts w:ascii="Consolas" w:eastAsia="Times New Roman" w:hAnsi="Consolas" w:cs="Times New Roman"/>
-          <w:color w:val="000000"/>
-          <w:sz w:val="21"/>
-          <w:szCs w:val="21"/>
-          <w:lang w:eastAsia="pt-BR"/>
-        </w:rPr>
-        <w:t xml:space="preserve"> != </w:t>
-      </w:r>
-      <w:proofErr w:type="spellStart"/>
-      <w:r>
-        <w:rPr>
-          <w:rFonts w:ascii="Consolas" w:eastAsia="Times New Roman" w:hAnsi="Consolas" w:cs="Times New Roman"/>
-          <w:color w:val="000000"/>
-          <w:sz w:val="21"/>
-          <w:szCs w:val="21"/>
-          <w:lang w:eastAsia="pt-BR"/>
-        </w:rPr>
-        <w:t>lastButtonState</w:t>
-      </w:r>
-      <w:proofErr w:type="spellEnd"/>
-      <w:r>
-        <w:rPr>
-          <w:rFonts w:ascii="Consolas" w:eastAsia="Times New Roman" w:hAnsi="Consolas" w:cs="Times New Roman"/>
-          <w:color w:val="000000"/>
-          <w:sz w:val="21"/>
-          <w:szCs w:val="21"/>
-          <w:lang w:eastAsia="pt-BR"/>
-        </w:rPr>
-        <w:t>)</w:t>
-      </w:r>
-    </w:p>
-    <w:p>
-      <w:pPr>
-        <w:shd w:val="clear" w:color="auto" w:fill="FFFFFE"/>
-        <w:spacing w:after="0" w:line="285" w:lineRule="atLeast"/>
-        <w:rPr>
-          <w:rFonts w:ascii="Consolas" w:eastAsia="Times New Roman" w:hAnsi="Consolas" w:cs="Times New Roman"/>
-          <w:color w:val="000000"/>
-          <w:sz w:val="21"/>
-          <w:szCs w:val="21"/>
-          <w:lang w:eastAsia="pt-BR"/>
-        </w:rPr>
-      </w:pPr>
-      <w:r>
-        <w:rPr>
-          <w:rFonts w:ascii="Consolas" w:eastAsia="Times New Roman" w:hAnsi="Consolas" w:cs="Times New Roman"/>
-          <w:color w:val="000000"/>
-          <w:sz w:val="21"/>
-          <w:szCs w:val="21"/>
-          <w:lang w:eastAsia="pt-BR"/>
-        </w:rPr>
-        <w:t>  {</w:t>
-      </w:r>
-    </w:p>
-    <w:p>
-      <w:pPr>
-        <w:shd w:val="clear" w:color="auto" w:fill="FFFFFE"/>
-        <w:spacing w:after="0" w:line="285" w:lineRule="atLeast"/>
-        <w:rPr>
-          <w:rFonts w:ascii="Consolas" w:eastAsia="Times New Roman" w:hAnsi="Consolas" w:cs="Times New Roman"/>
-          <w:color w:val="000000"/>
-          <w:sz w:val="21"/>
-          <w:szCs w:val="21"/>
-          <w:lang w:eastAsia="pt-BR"/>
-        </w:rPr>
-      </w:pPr>
-      <w:r>
-        <w:rPr>
-          <w:rFonts w:ascii="Consolas" w:eastAsia="Times New Roman" w:hAnsi="Consolas" w:cs="Times New Roman"/>
-          <w:color w:val="000000"/>
-          <w:sz w:val="21"/>
-          <w:szCs w:val="21"/>
-          <w:lang w:eastAsia="pt-BR"/>
-        </w:rPr>
-        <w:t xml:space="preserve">    </w:t>
-      </w:r>
-      <w:proofErr w:type="spellStart"/>
-      <w:r>
-        <w:rPr>
-          <w:rFonts w:ascii="Consolas" w:eastAsia="Times New Roman" w:hAnsi="Consolas" w:cs="Times New Roman"/>
-          <w:color w:val="000000"/>
-          <w:sz w:val="21"/>
-          <w:szCs w:val="21"/>
-          <w:lang w:eastAsia="pt-BR"/>
-        </w:rPr>
-        <w:t>Joystick.setButton</w:t>
-      </w:r>
-      <w:proofErr w:type="spellEnd"/>
-      <w:r>
-        <w:rPr>
-          <w:rFonts w:ascii="Consolas" w:eastAsia="Times New Roman" w:hAnsi="Consolas" w:cs="Times New Roman"/>
-          <w:color w:val="000000"/>
-          <w:sz w:val="21"/>
-          <w:szCs w:val="21"/>
-          <w:lang w:eastAsia="pt-BR"/>
-        </w:rPr>
-        <w:t>(</w:t>
-      </w:r>
-      <w:r>
-        <w:rPr>
-          <w:rFonts w:ascii="Consolas" w:eastAsia="Times New Roman" w:hAnsi="Consolas" w:cs="Times New Roman"/>
-          <w:color w:val="098658"/>
-          <w:sz w:val="21"/>
-          <w:szCs w:val="21"/>
-          <w:lang w:eastAsia="pt-BR"/>
-        </w:rPr>
-        <w:t>0</w:t>
-      </w:r>
-      <w:r>
-        <w:rPr>
-          <w:rFonts w:ascii="Consolas" w:eastAsia="Times New Roman" w:hAnsi="Consolas" w:cs="Times New Roman"/>
-          <w:color w:val="000000"/>
-          <w:sz w:val="21"/>
-          <w:szCs w:val="21"/>
-          <w:lang w:eastAsia="pt-BR"/>
-        </w:rPr>
-        <w:t xml:space="preserve">, </w:t>
-      </w:r>
-      <w:proofErr w:type="spellStart"/>
-      <w:r>
-        <w:rPr>
-          <w:rFonts w:ascii="Consolas" w:eastAsia="Times New Roman" w:hAnsi="Consolas" w:cs="Times New Roman"/>
-          <w:color w:val="000000"/>
-          <w:sz w:val="21"/>
-          <w:szCs w:val="21"/>
-          <w:lang w:eastAsia="pt-BR"/>
-        </w:rPr>
-        <w:t>currentButtonState</w:t>
-      </w:r>
-      <w:proofErr w:type="spellEnd"/>
-      <w:r>
-        <w:rPr>
-          <w:rFonts w:ascii="Consolas" w:eastAsia="Times New Roman" w:hAnsi="Consolas" w:cs="Times New Roman"/>
-          <w:color w:val="000000"/>
-          <w:sz w:val="21"/>
-          <w:szCs w:val="21"/>
-          <w:lang w:eastAsia="pt-BR"/>
-        </w:rPr>
-        <w:t>);</w:t>
-      </w:r>
-    </w:p>
-    <w:p>
-      <w:pPr>
-        <w:shd w:val="clear" w:color="auto" w:fill="FFFFFE"/>
-        <w:spacing w:after="0" w:line="285" w:lineRule="atLeast"/>
-        <w:rPr>
-          <w:rFonts w:ascii="Consolas" w:eastAsia="Times New Roman" w:hAnsi="Consolas" w:cs="Times New Roman"/>
-          <w:color w:val="000000"/>
-          <w:sz w:val="21"/>
-          <w:szCs w:val="21"/>
-          <w:lang w:eastAsia="pt-BR"/>
-        </w:rPr>
-      </w:pPr>
-      <w:r>
-        <w:rPr>
-          <w:rFonts w:ascii="Consolas" w:eastAsia="Times New Roman" w:hAnsi="Consolas" w:cs="Times New Roman"/>
-          <w:color w:val="000000"/>
-          <w:sz w:val="21"/>
-          <w:szCs w:val="21"/>
-          <w:lang w:eastAsia="pt-BR"/>
-        </w:rPr>
-        <w:t xml:space="preserve">    </w:t>
-      </w:r>
-      <w:proofErr w:type="spellStart"/>
-      <w:proofErr w:type="gramStart"/>
-      <w:r>
-        <w:rPr>
-          <w:rFonts w:ascii="Consolas" w:eastAsia="Times New Roman" w:hAnsi="Consolas" w:cs="Times New Roman"/>
-          <w:color w:val="000000"/>
-          <w:sz w:val="21"/>
-          <w:szCs w:val="21"/>
-          <w:lang w:eastAsia="pt-BR"/>
-        </w:rPr>
-        <w:t>lastButtonState</w:t>
-      </w:r>
-      <w:proofErr w:type="spellEnd"/>
-      <w:proofErr w:type="gramEnd"/>
-      <w:r>
-        <w:rPr>
-          <w:rFonts w:ascii="Consolas" w:eastAsia="Times New Roman" w:hAnsi="Consolas" w:cs="Times New Roman"/>
-          <w:color w:val="000000"/>
-          <w:sz w:val="21"/>
-          <w:szCs w:val="21"/>
-          <w:lang w:eastAsia="pt-BR"/>
-        </w:rPr>
-        <w:t xml:space="preserve"> = </w:t>
-      </w:r>
-      <w:proofErr w:type="spellStart"/>
-      <w:r>
-        <w:rPr>
-          <w:rFonts w:ascii="Consolas" w:eastAsia="Times New Roman" w:hAnsi="Consolas" w:cs="Times New Roman"/>
-          <w:color w:val="000000"/>
-          <w:sz w:val="21"/>
-          <w:szCs w:val="21"/>
-          <w:lang w:eastAsia="pt-BR"/>
-        </w:rPr>
-        <w:t>currentButtonState</w:t>
-      </w:r>
-      <w:proofErr w:type="spellEnd"/>
-      <w:r>
-        <w:rPr>
-          <w:rFonts w:ascii="Consolas" w:eastAsia="Times New Roman" w:hAnsi="Consolas" w:cs="Times New Roman"/>
-          <w:color w:val="000000"/>
-          <w:sz w:val="21"/>
-          <w:szCs w:val="21"/>
-          <w:lang w:eastAsia="pt-BR"/>
-        </w:rPr>
-        <w:t>;</w:t>
-      </w:r>
-    </w:p>
-    <w:p>
-      <w:pPr>
-        <w:shd w:val="clear" w:color="auto" w:fill="FFFFFE"/>
-        <w:spacing w:after="0" w:line="285" w:lineRule="atLeast"/>
-        <w:rPr>
-          <w:rFonts w:ascii="Consolas" w:eastAsia="Times New Roman" w:hAnsi="Consolas" w:cs="Times New Roman"/>
-          <w:color w:val="000000"/>
-          <w:sz w:val="21"/>
-          <w:szCs w:val="21"/>
-          <w:lang w:eastAsia="pt-BR"/>
-        </w:rPr>
-      </w:pPr>
-      <w:r>
-        <w:rPr>
-          <w:rFonts w:ascii="Consolas" w:eastAsia="Times New Roman" w:hAnsi="Consolas" w:cs="Times New Roman"/>
-          <w:color w:val="000000"/>
-          <w:sz w:val="21"/>
-          <w:szCs w:val="21"/>
-          <w:lang w:eastAsia="pt-BR"/>
-        </w:rPr>
-        <w:t>  }</w:t>
-      </w:r>
-    </w:p>
-    <w:p>
-      <w:pPr>
-        <w:shd w:val="clear" w:color="auto" w:fill="FFFFFE"/>
-        <w:spacing w:after="0" w:line="285" w:lineRule="atLeast"/>
-        <w:rPr>
-          <w:rFonts w:ascii="Consolas" w:eastAsia="Times New Roman" w:hAnsi="Consolas" w:cs="Times New Roman"/>
-          <w:color w:val="000000"/>
-          <w:sz w:val="21"/>
-          <w:szCs w:val="21"/>
-          <w:lang w:eastAsia="pt-BR"/>
-        </w:rPr>
-      </w:pPr>
-    </w:p>
-    <w:p>
-      <w:pPr>
-        <w:shd w:val="clear" w:color="auto" w:fill="FFFFFE"/>
-        <w:spacing w:after="0" w:line="285" w:lineRule="atLeast"/>
-        <w:rPr>
-          <w:rFonts w:ascii="Consolas" w:eastAsia="Times New Roman" w:hAnsi="Consolas" w:cs="Times New Roman"/>
-          <w:color w:val="000000"/>
-          <w:sz w:val="21"/>
-          <w:szCs w:val="21"/>
-          <w:lang w:eastAsia="pt-BR"/>
-        </w:rPr>
-      </w:pPr>
-      <w:r>
-        <w:rPr>
-          <w:rFonts w:ascii="Consolas" w:eastAsia="Times New Roman" w:hAnsi="Consolas" w:cs="Times New Roman"/>
-          <w:color w:val="000000"/>
-          <w:sz w:val="21"/>
-          <w:szCs w:val="21"/>
-          <w:lang w:eastAsia="pt-BR"/>
-        </w:rPr>
-        <w:t xml:space="preserve">  </w:t>
-      </w:r>
-      <w:proofErr w:type="spellStart"/>
-      <w:proofErr w:type="gramStart"/>
-      <w:r>
-        <w:rPr>
-          <w:rFonts w:ascii="Consolas" w:eastAsia="Times New Roman" w:hAnsi="Consolas" w:cs="Times New Roman"/>
-          <w:color w:val="E97366"/>
-          <w:sz w:val="21"/>
-          <w:szCs w:val="21"/>
-          <w:lang w:eastAsia="pt-BR"/>
-        </w:rPr>
         <w:t>delay</w:t>
       </w:r>
-      <w:proofErr w:type="spellEnd"/>
       <w:r>
         <w:rPr>
           <w:rFonts w:ascii="Consolas" w:eastAsia="Times New Roman" w:hAnsi="Consolas" w:cs="Times New Roman"/>
@@ -3148,6 +3160,7 @@
         <w:rPr>
           <w:b/>
           <w:bCs/>
+          <w:noProof/>
           <w:szCs w:val="24"/>
         </w:rPr>
         <w:lastRenderedPageBreak/>
@@ -3215,6 +3228,7 @@
         <w:rPr>
           <w:b/>
           <w:bCs/>
+          <w:noProof/>
           <w:szCs w:val="24"/>
         </w:rPr>
         <w:drawing>
@@ -3287,12 +3301,11 @@
           <w:szCs w:val="24"/>
         </w:rPr>
       </w:pPr>
-      <w:bookmarkStart w:id="0" w:name="_GoBack"/>
-      <w:bookmarkEnd w:id="0"/>
-      <w:r>
-        <w:rPr>
-          <w:b/>
-          <w:bCs/>
+      <w:r>
+        <w:rPr>
+          <w:b/>
+          <w:bCs/>
+          <w:noProof/>
           <w:szCs w:val="24"/>
         </w:rPr>
         <w:drawing>
@@ -3369,6 +3382,7 @@
         <w:rPr>
           <w:b/>
           <w:bCs/>
+          <w:noProof/>
           <w:szCs w:val="24"/>
         </w:rPr>
         <w:lastRenderedPageBreak/>
@@ -3436,6 +3450,7 @@
         <w:rPr>
           <w:b/>
           <w:bCs/>
+          <w:noProof/>
           <w:szCs w:val="24"/>
         </w:rPr>
         <w:drawing>
@@ -3502,6 +3517,7 @@
         <w:rPr>
           <w:b/>
           <w:bCs/>
+          <w:noProof/>
           <w:szCs w:val="24"/>
         </w:rPr>
         <w:drawing>
@@ -3568,6 +3584,7 @@
         <w:rPr>
           <w:b/>
           <w:bCs/>
+          <w:noProof/>
           <w:szCs w:val="24"/>
         </w:rPr>
         <w:lastRenderedPageBreak/>
@@ -3635,6 +3652,7 @@
         <w:rPr>
           <w:b/>
           <w:bCs/>
+          <w:noProof/>
           <w:szCs w:val="24"/>
         </w:rPr>
         <w:drawing>
@@ -3701,6 +3719,7 @@
         <w:rPr>
           <w:b/>
           <w:bCs/>
+          <w:noProof/>
           <w:szCs w:val="24"/>
         </w:rPr>
         <w:drawing>
@@ -3754,6 +3773,599 @@
         </w:drawing>
       </w:r>
     </w:p>
+    <w:p>
+      <w:pPr>
+        <w:spacing w:line="360" w:lineRule="auto"/>
+        <w:rPr>
+          <w:b/>
+          <w:bCs/>
+          <w:szCs w:val="24"/>
+        </w:rPr>
+      </w:pPr>
+    </w:p>
+    <w:p>
+      <w:pPr>
+        <w:spacing w:line="360" w:lineRule="auto"/>
+        <w:rPr>
+          <w:b/>
+          <w:bCs/>
+          <w:szCs w:val="24"/>
+        </w:rPr>
+      </w:pPr>
+    </w:p>
+    <w:p>
+      <w:pPr>
+        <w:spacing w:line="360" w:lineRule="auto"/>
+        <w:rPr>
+          <w:b/>
+          <w:bCs/>
+          <w:szCs w:val="24"/>
+        </w:rPr>
+      </w:pPr>
+      <w:r>
+        <w:rPr>
+          <w:b/>
+          <w:bCs/>
+          <w:szCs w:val="24"/>
+        </w:rPr>
+        <w:lastRenderedPageBreak/>
+        <w:t xml:space="preserve">INFORMAÇÕES NO FORMATO DE TABELA </w:t>
+      </w:r>
+    </w:p>
+    <w:p>
+      <w:pPr>
+        <w:spacing w:line="360" w:lineRule="auto"/>
+        <w:rPr>
+          <w:b/>
+          <w:bCs/>
+          <w:szCs w:val="24"/>
+        </w:rPr>
+      </w:pPr>
+    </w:p>
+    <w:tbl>
+      <w:tblPr>
+        <w:tblStyle w:val="TabeladeGrade6Colorida-nfase5"/>
+        <w:tblW w:w="0" w:type="auto"/>
+        <w:tblLook w:val="04A0" w:firstRow="1" w:lastRow="0" w:firstColumn="1" w:lastColumn="0" w:noHBand="0" w:noVBand="1"/>
+      </w:tblPr>
+      <w:tblGrid>
+        <w:gridCol w:w="1696"/>
+        <w:gridCol w:w="2834"/>
+        <w:gridCol w:w="2265"/>
+        <w:gridCol w:w="2266"/>
+      </w:tblGrid>
+      <w:tr>
+        <w:trPr>
+          <w:cnfStyle w:val="100000000000" w:firstRow="1" w:lastRow="0" w:firstColumn="0" w:lastColumn="0" w:oddVBand="0" w:evenVBand="0" w:oddHBand="0" w:evenHBand="0" w:firstRowFirstColumn="0" w:firstRowLastColumn="0" w:lastRowFirstColumn="0" w:lastRowLastColumn="0"/>
+        </w:trPr>
+        <w:tc>
+          <w:tcPr>
+            <w:cnfStyle w:val="001000000000" w:firstRow="0" w:lastRow="0" w:firstColumn="1" w:lastColumn="0" w:oddVBand="0" w:evenVBand="0" w:oddHBand="0" w:evenHBand="0" w:firstRowFirstColumn="0" w:firstRowLastColumn="0" w:lastRowFirstColumn="0" w:lastRowLastColumn="0"/>
+            <w:tcW w:w="1696" w:type="dxa"/>
+          </w:tcPr>
+          <w:p>
+            <w:pPr>
+              <w:spacing w:line="360" w:lineRule="auto"/>
+              <w:jc w:val="center"/>
+              <w:rPr>
+                <w:szCs w:val="24"/>
+              </w:rPr>
+            </w:pPr>
+            <w:r>
+              <w:rPr>
+                <w:color w:val="auto"/>
+                <w:szCs w:val="24"/>
+              </w:rPr>
+              <w:t>Quantidade</w:t>
+            </w:r>
+          </w:p>
+        </w:tc>
+        <w:tc>
+          <w:tcPr>
+            <w:tcW w:w="2834" w:type="dxa"/>
+          </w:tcPr>
+          <w:p>
+            <w:pPr>
+              <w:spacing w:line="360" w:lineRule="auto"/>
+              <w:jc w:val="center"/>
+              <w:cnfStyle w:val="100000000000" w:firstRow="1" w:lastRow="0" w:firstColumn="0" w:lastColumn="0" w:oddVBand="0" w:evenVBand="0" w:oddHBand="0" w:evenHBand="0" w:firstRowFirstColumn="0" w:firstRowLastColumn="0" w:lastRowFirstColumn="0" w:lastRowLastColumn="0"/>
+              <w:rPr>
+                <w:b w:val="0"/>
+                <w:bCs w:val="0"/>
+                <w:szCs w:val="24"/>
+              </w:rPr>
+            </w:pPr>
+            <w:r>
+              <w:rPr>
+                <w:color w:val="auto"/>
+                <w:szCs w:val="24"/>
+              </w:rPr>
+              <w:t>Item</w:t>
+            </w:r>
+          </w:p>
+        </w:tc>
+        <w:tc>
+          <w:tcPr>
+            <w:tcW w:w="2265" w:type="dxa"/>
+          </w:tcPr>
+          <w:p>
+            <w:pPr>
+              <w:spacing w:line="360" w:lineRule="auto"/>
+              <w:jc w:val="center"/>
+              <w:cnfStyle w:val="100000000000" w:firstRow="1" w:lastRow="0" w:firstColumn="0" w:lastColumn="0" w:oddVBand="0" w:evenVBand="0" w:oddHBand="0" w:evenHBand="0" w:firstRowFirstColumn="0" w:firstRowLastColumn="0" w:lastRowFirstColumn="0" w:lastRowLastColumn="0"/>
+              <w:rPr>
+                <w:b w:val="0"/>
+                <w:bCs w:val="0"/>
+                <w:szCs w:val="24"/>
+              </w:rPr>
+            </w:pPr>
+            <w:r>
+              <w:rPr>
+                <w:color w:val="auto"/>
+                <w:szCs w:val="24"/>
+              </w:rPr>
+              <w:t>Valor Unitário</w:t>
+            </w:r>
+          </w:p>
+        </w:tc>
+        <w:tc>
+          <w:tcPr>
+            <w:tcW w:w="2266" w:type="dxa"/>
+          </w:tcPr>
+          <w:p>
+            <w:pPr>
+              <w:spacing w:line="360" w:lineRule="auto"/>
+              <w:jc w:val="center"/>
+              <w:cnfStyle w:val="100000000000" w:firstRow="1" w:lastRow="0" w:firstColumn="0" w:lastColumn="0" w:oddVBand="0" w:evenVBand="0" w:oddHBand="0" w:evenHBand="0" w:firstRowFirstColumn="0" w:firstRowLastColumn="0" w:lastRowFirstColumn="0" w:lastRowLastColumn="0"/>
+              <w:rPr>
+                <w:b w:val="0"/>
+                <w:bCs w:val="0"/>
+                <w:szCs w:val="24"/>
+              </w:rPr>
+            </w:pPr>
+            <w:r>
+              <w:rPr>
+                <w:color w:val="auto"/>
+                <w:szCs w:val="24"/>
+              </w:rPr>
+              <w:t>Valor Total</w:t>
+            </w:r>
+          </w:p>
+        </w:tc>
+      </w:tr>
+      <w:tr>
+        <w:trPr>
+          <w:cnfStyle w:val="000000100000" w:firstRow="0" w:lastRow="0" w:firstColumn="0" w:lastColumn="0" w:oddVBand="0" w:evenVBand="0" w:oddHBand="1" w:evenHBand="0" w:firstRowFirstColumn="0" w:firstRowLastColumn="0" w:lastRowFirstColumn="0" w:lastRowLastColumn="0"/>
+        </w:trPr>
+        <w:tc>
+          <w:tcPr>
+            <w:cnfStyle w:val="001000000000" w:firstRow="0" w:lastRow="0" w:firstColumn="1" w:lastColumn="0" w:oddVBand="0" w:evenVBand="0" w:oddHBand="0" w:evenHBand="0" w:firstRowFirstColumn="0" w:firstRowLastColumn="0" w:lastRowFirstColumn="0" w:lastRowLastColumn="0"/>
+            <w:tcW w:w="1696" w:type="dxa"/>
+          </w:tcPr>
+          <w:p>
+            <w:pPr>
+              <w:spacing w:line="360" w:lineRule="auto"/>
+              <w:rPr>
+                <w:szCs w:val="24"/>
+              </w:rPr>
+            </w:pPr>
+            <w:r>
+              <w:rPr>
+                <w:szCs w:val="24"/>
+              </w:rPr>
+              <w:t>1</w:t>
+            </w:r>
+          </w:p>
+        </w:tc>
+        <w:tc>
+          <w:tcPr>
+            <w:tcW w:w="2834" w:type="dxa"/>
+          </w:tcPr>
+          <w:p>
+            <w:pPr>
+              <w:spacing w:line="360" w:lineRule="auto"/>
+              <w:cnfStyle w:val="000000100000" w:firstRow="0" w:lastRow="0" w:firstColumn="0" w:lastColumn="0" w:oddVBand="0" w:evenVBand="0" w:oddHBand="1" w:evenHBand="0" w:firstRowFirstColumn="0" w:firstRowLastColumn="0" w:lastRowFirstColumn="0" w:lastRowLastColumn="0"/>
+              <w:rPr>
+                <w:b/>
+                <w:bCs/>
+                <w:szCs w:val="24"/>
+              </w:rPr>
+            </w:pPr>
+            <w:r>
+              <w:rPr>
+                <w:b/>
+                <w:bCs/>
+                <w:szCs w:val="24"/>
+              </w:rPr>
+              <w:t>Arduino Uno R3</w:t>
+            </w:r>
+          </w:p>
+        </w:tc>
+        <w:tc>
+          <w:tcPr>
+            <w:tcW w:w="2265" w:type="dxa"/>
+          </w:tcPr>
+          <w:p>
+            <w:pPr>
+              <w:spacing w:line="360" w:lineRule="auto"/>
+              <w:cnfStyle w:val="000000100000" w:firstRow="0" w:lastRow="0" w:firstColumn="0" w:lastColumn="0" w:oddVBand="0" w:evenVBand="0" w:oddHBand="1" w:evenHBand="0" w:firstRowFirstColumn="0" w:firstRowLastColumn="0" w:lastRowFirstColumn="0" w:lastRowLastColumn="0"/>
+              <w:rPr>
+                <w:b/>
+                <w:bCs/>
+                <w:szCs w:val="24"/>
+              </w:rPr>
+            </w:pPr>
+            <w:r>
+              <w:rPr>
+                <w:b/>
+                <w:bCs/>
+                <w:szCs w:val="24"/>
+              </w:rPr>
+              <w:t>62,40 (via pix)</w:t>
+            </w:r>
+          </w:p>
+        </w:tc>
+        <w:tc>
+          <w:tcPr>
+            <w:tcW w:w="2266" w:type="dxa"/>
+          </w:tcPr>
+          <w:p>
+            <w:pPr>
+              <w:spacing w:line="360" w:lineRule="auto"/>
+              <w:cnfStyle w:val="000000100000" w:firstRow="0" w:lastRow="0" w:firstColumn="0" w:lastColumn="0" w:oddVBand="0" w:evenVBand="0" w:oddHBand="1" w:evenHBand="0" w:firstRowFirstColumn="0" w:firstRowLastColumn="0" w:lastRowFirstColumn="0" w:lastRowLastColumn="0"/>
+              <w:rPr>
+                <w:b/>
+                <w:bCs/>
+                <w:szCs w:val="24"/>
+              </w:rPr>
+            </w:pPr>
+            <w:r>
+              <w:rPr>
+                <w:b/>
+                <w:bCs/>
+                <w:szCs w:val="24"/>
+              </w:rPr>
+              <w:t>62,40</w:t>
+            </w:r>
+          </w:p>
+        </w:tc>
+      </w:tr>
+      <w:tr>
+        <w:tc>
+          <w:tcPr>
+            <w:cnfStyle w:val="001000000000" w:firstRow="0" w:lastRow="0" w:firstColumn="1" w:lastColumn="0" w:oddVBand="0" w:evenVBand="0" w:oddHBand="0" w:evenHBand="0" w:firstRowFirstColumn="0" w:firstRowLastColumn="0" w:lastRowFirstColumn="0" w:lastRowLastColumn="0"/>
+            <w:tcW w:w="1696" w:type="dxa"/>
+          </w:tcPr>
+          <w:p>
+            <w:pPr>
+              <w:spacing w:line="360" w:lineRule="auto"/>
+              <w:rPr>
+                <w:szCs w:val="24"/>
+              </w:rPr>
+            </w:pPr>
+            <w:r>
+              <w:rPr>
+                <w:szCs w:val="24"/>
+              </w:rPr>
+              <w:t>1</w:t>
+            </w:r>
+          </w:p>
+        </w:tc>
+        <w:tc>
+          <w:tcPr>
+            <w:tcW w:w="2834" w:type="dxa"/>
+          </w:tcPr>
+          <w:p>
+            <w:pPr>
+              <w:spacing w:line="360" w:lineRule="auto"/>
+              <w:cnfStyle w:val="000000000000" w:firstRow="0" w:lastRow="0" w:firstColumn="0" w:lastColumn="0" w:oddVBand="0" w:evenVBand="0" w:oddHBand="0" w:evenHBand="0" w:firstRowFirstColumn="0" w:firstRowLastColumn="0" w:lastRowFirstColumn="0" w:lastRowLastColumn="0"/>
+              <w:rPr>
+                <w:b/>
+                <w:bCs/>
+                <w:szCs w:val="24"/>
+              </w:rPr>
+            </w:pPr>
+            <w:r>
+              <w:rPr>
+                <w:b/>
+                <w:bCs/>
+                <w:szCs w:val="24"/>
+              </w:rPr>
+              <w:t xml:space="preserve">Controle </w:t>
+            </w:r>
+            <w:proofErr w:type="spellStart"/>
+            <w:r>
+              <w:rPr>
+                <w:b/>
+                <w:bCs/>
+                <w:szCs w:val="24"/>
+              </w:rPr>
+              <w:t>BatPad</w:t>
+            </w:r>
+            <w:proofErr w:type="spellEnd"/>
+          </w:p>
+        </w:tc>
+        <w:tc>
+          <w:tcPr>
+            <w:tcW w:w="2265" w:type="dxa"/>
+          </w:tcPr>
+          <w:p>
+            <w:pPr>
+              <w:spacing w:line="360" w:lineRule="auto"/>
+              <w:cnfStyle w:val="000000000000" w:firstRow="0" w:lastRow="0" w:firstColumn="0" w:lastColumn="0" w:oddVBand="0" w:evenVBand="0" w:oddHBand="0" w:evenHBand="0" w:firstRowFirstColumn="0" w:firstRowLastColumn="0" w:lastRowFirstColumn="0" w:lastRowLastColumn="0"/>
+              <w:rPr>
+                <w:b/>
+                <w:bCs/>
+                <w:szCs w:val="24"/>
+              </w:rPr>
+            </w:pPr>
+            <w:r>
+              <w:rPr>
+                <w:b/>
+                <w:bCs/>
+                <w:szCs w:val="24"/>
+              </w:rPr>
+              <w:t>47,31 (via pix)</w:t>
+            </w:r>
+          </w:p>
+        </w:tc>
+        <w:tc>
+          <w:tcPr>
+            <w:tcW w:w="2266" w:type="dxa"/>
+          </w:tcPr>
+          <w:p>
+            <w:pPr>
+              <w:spacing w:line="360" w:lineRule="auto"/>
+              <w:cnfStyle w:val="000000000000" w:firstRow="0" w:lastRow="0" w:firstColumn="0" w:lastColumn="0" w:oddVBand="0" w:evenVBand="0" w:oddHBand="0" w:evenHBand="0" w:firstRowFirstColumn="0" w:firstRowLastColumn="0" w:lastRowFirstColumn="0" w:lastRowLastColumn="0"/>
+              <w:rPr>
+                <w:b/>
+                <w:bCs/>
+                <w:szCs w:val="24"/>
+              </w:rPr>
+            </w:pPr>
+            <w:r>
+              <w:rPr>
+                <w:b/>
+                <w:bCs/>
+                <w:szCs w:val="24"/>
+              </w:rPr>
+              <w:t>47,31</w:t>
+            </w:r>
+          </w:p>
+        </w:tc>
+      </w:tr>
+      <w:tr>
+        <w:trPr>
+          <w:cnfStyle w:val="000000100000" w:firstRow="0" w:lastRow="0" w:firstColumn="0" w:lastColumn="0" w:oddVBand="0" w:evenVBand="0" w:oddHBand="1" w:evenHBand="0" w:firstRowFirstColumn="0" w:firstRowLastColumn="0" w:lastRowFirstColumn="0" w:lastRowLastColumn="0"/>
+        </w:trPr>
+        <w:tc>
+          <w:tcPr>
+            <w:cnfStyle w:val="001000000000" w:firstRow="0" w:lastRow="0" w:firstColumn="1" w:lastColumn="0" w:oddVBand="0" w:evenVBand="0" w:oddHBand="0" w:evenHBand="0" w:firstRowFirstColumn="0" w:firstRowLastColumn="0" w:lastRowFirstColumn="0" w:lastRowLastColumn="0"/>
+            <w:tcW w:w="1696" w:type="dxa"/>
+          </w:tcPr>
+          <w:p>
+            <w:pPr>
+              <w:spacing w:line="360" w:lineRule="auto"/>
+              <w:rPr>
+                <w:szCs w:val="24"/>
+              </w:rPr>
+            </w:pPr>
+            <w:r>
+              <w:rPr>
+                <w:szCs w:val="24"/>
+              </w:rPr>
+              <w:t>1</w:t>
+            </w:r>
+          </w:p>
+        </w:tc>
+        <w:tc>
+          <w:tcPr>
+            <w:tcW w:w="2834" w:type="dxa"/>
+          </w:tcPr>
+          <w:p>
+            <w:pPr>
+              <w:spacing w:line="360" w:lineRule="auto"/>
+              <w:cnfStyle w:val="000000100000" w:firstRow="0" w:lastRow="0" w:firstColumn="0" w:lastColumn="0" w:oddVBand="0" w:evenVBand="0" w:oddHBand="1" w:evenHBand="0" w:firstRowFirstColumn="0" w:firstRowLastColumn="0" w:lastRowFirstColumn="0" w:lastRowLastColumn="0"/>
+              <w:rPr>
+                <w:b/>
+                <w:bCs/>
+                <w:szCs w:val="24"/>
+              </w:rPr>
+            </w:pPr>
+            <w:r>
+              <w:rPr>
+                <w:b/>
+                <w:bCs/>
+                <w:szCs w:val="24"/>
+              </w:rPr>
+              <w:t>*Kit Jumper Macho x Fêmea (‘opcional’)</w:t>
+            </w:r>
+          </w:p>
+        </w:tc>
+        <w:tc>
+          <w:tcPr>
+            <w:tcW w:w="2265" w:type="dxa"/>
+          </w:tcPr>
+          <w:p>
+            <w:pPr>
+              <w:spacing w:line="360" w:lineRule="auto"/>
+              <w:cnfStyle w:val="000000100000" w:firstRow="0" w:lastRow="0" w:firstColumn="0" w:lastColumn="0" w:oddVBand="0" w:evenVBand="0" w:oddHBand="1" w:evenHBand="0" w:firstRowFirstColumn="0" w:firstRowLastColumn="0" w:lastRowFirstColumn="0" w:lastRowLastColumn="0"/>
+              <w:rPr>
+                <w:b/>
+                <w:bCs/>
+                <w:szCs w:val="24"/>
+              </w:rPr>
+            </w:pPr>
+            <w:r>
+              <w:rPr>
+                <w:b/>
+                <w:bCs/>
+                <w:szCs w:val="24"/>
+              </w:rPr>
+              <w:t>6,46 (via pix)</w:t>
+            </w:r>
+          </w:p>
+        </w:tc>
+        <w:tc>
+          <w:tcPr>
+            <w:tcW w:w="2266" w:type="dxa"/>
+          </w:tcPr>
+          <w:p>
+            <w:pPr>
+              <w:spacing w:line="360" w:lineRule="auto"/>
+              <w:cnfStyle w:val="000000100000" w:firstRow="0" w:lastRow="0" w:firstColumn="0" w:lastColumn="0" w:oddVBand="0" w:evenVBand="0" w:oddHBand="1" w:evenHBand="0" w:firstRowFirstColumn="0" w:firstRowLastColumn="0" w:lastRowFirstColumn="0" w:lastRowLastColumn="0"/>
+              <w:rPr>
+                <w:b/>
+                <w:bCs/>
+                <w:szCs w:val="24"/>
+              </w:rPr>
+            </w:pPr>
+            <w:r>
+              <w:rPr>
+                <w:b/>
+                <w:bCs/>
+                <w:szCs w:val="24"/>
+              </w:rPr>
+              <w:t>6,46</w:t>
+            </w:r>
+          </w:p>
+        </w:tc>
+      </w:tr>
+      <w:tr>
+        <w:tc>
+          <w:tcPr>
+            <w:cnfStyle w:val="001000000000" w:firstRow="0" w:lastRow="0" w:firstColumn="1" w:lastColumn="0" w:oddVBand="0" w:evenVBand="0" w:oddHBand="0" w:evenHBand="0" w:firstRowFirstColumn="0" w:firstRowLastColumn="0" w:lastRowFirstColumn="0" w:lastRowLastColumn="0"/>
+            <w:tcW w:w="1696" w:type="dxa"/>
+          </w:tcPr>
+          <w:p>
+            <w:pPr>
+              <w:spacing w:line="360" w:lineRule="auto"/>
+              <w:rPr>
+                <w:szCs w:val="24"/>
+              </w:rPr>
+            </w:pPr>
+          </w:p>
+        </w:tc>
+        <w:tc>
+          <w:tcPr>
+            <w:tcW w:w="2834" w:type="dxa"/>
+          </w:tcPr>
+          <w:p>
+            <w:pPr>
+              <w:spacing w:line="360" w:lineRule="auto"/>
+              <w:cnfStyle w:val="000000000000" w:firstRow="0" w:lastRow="0" w:firstColumn="0" w:lastColumn="0" w:oddVBand="0" w:evenVBand="0" w:oddHBand="0" w:evenHBand="0" w:firstRowFirstColumn="0" w:firstRowLastColumn="0" w:lastRowFirstColumn="0" w:lastRowLastColumn="0"/>
+              <w:rPr>
+                <w:b/>
+                <w:bCs/>
+                <w:szCs w:val="24"/>
+              </w:rPr>
+            </w:pPr>
+          </w:p>
+        </w:tc>
+        <w:tc>
+          <w:tcPr>
+            <w:tcW w:w="2265" w:type="dxa"/>
+          </w:tcPr>
+          <w:p>
+            <w:pPr>
+              <w:spacing w:line="360" w:lineRule="auto"/>
+              <w:cnfStyle w:val="000000000000" w:firstRow="0" w:lastRow="0" w:firstColumn="0" w:lastColumn="0" w:oddVBand="0" w:evenVBand="0" w:oddHBand="0" w:evenHBand="0" w:firstRowFirstColumn="0" w:firstRowLastColumn="0" w:lastRowFirstColumn="0" w:lastRowLastColumn="0"/>
+              <w:rPr>
+                <w:b/>
+                <w:bCs/>
+                <w:szCs w:val="24"/>
+              </w:rPr>
+            </w:pPr>
+            <w:r>
+              <w:rPr>
+                <w:b/>
+                <w:bCs/>
+                <w:szCs w:val="24"/>
+              </w:rPr>
+              <w:t>Total:</w:t>
+            </w:r>
+          </w:p>
+        </w:tc>
+        <w:tc>
+          <w:tcPr>
+            <w:tcW w:w="2266" w:type="dxa"/>
+          </w:tcPr>
+          <w:p>
+            <w:pPr>
+              <w:spacing w:line="360" w:lineRule="auto"/>
+              <w:cnfStyle w:val="000000000000" w:firstRow="0" w:lastRow="0" w:firstColumn="0" w:lastColumn="0" w:oddVBand="0" w:evenVBand="0" w:oddHBand="0" w:evenHBand="0" w:firstRowFirstColumn="0" w:firstRowLastColumn="0" w:lastRowFirstColumn="0" w:lastRowLastColumn="0"/>
+              <w:rPr>
+                <w:b/>
+                <w:bCs/>
+                <w:szCs w:val="24"/>
+              </w:rPr>
+            </w:pPr>
+            <w:r>
+              <w:rPr>
+                <w:b/>
+                <w:bCs/>
+                <w:szCs w:val="24"/>
+              </w:rPr>
+              <w:t>116,17</w:t>
+            </w:r>
+          </w:p>
+        </w:tc>
+      </w:tr>
+    </w:tbl>
+    <w:p>
+      <w:pPr>
+        <w:spacing w:line="360" w:lineRule="auto"/>
+        <w:rPr>
+          <w:b/>
+          <w:bCs/>
+          <w:szCs w:val="24"/>
+        </w:rPr>
+      </w:pPr>
+    </w:p>
+    <w:p>
+      <w:pPr>
+        <w:spacing w:line="360" w:lineRule="auto"/>
+        <w:rPr>
+          <w:b/>
+          <w:bCs/>
+          <w:szCs w:val="24"/>
+        </w:rPr>
+      </w:pPr>
+      <w:r>
+        <w:rPr>
+          <w:b/>
+          <w:bCs/>
+          <w:szCs w:val="24"/>
+        </w:rPr>
+        <w:t xml:space="preserve">* Esse Kit Jumper pode ser opcional porque o </w:t>
+      </w:r>
+      <w:proofErr w:type="spellStart"/>
+      <w:r>
+        <w:rPr>
+          <w:b/>
+          <w:bCs/>
+          <w:szCs w:val="24"/>
+        </w:rPr>
+        <w:t>BatPad</w:t>
+      </w:r>
+      <w:proofErr w:type="spellEnd"/>
+      <w:r>
+        <w:rPr>
+          <w:b/>
+          <w:bCs/>
+          <w:szCs w:val="24"/>
+        </w:rPr>
+        <w:t xml:space="preserve"> já vem com os jumpers </w:t>
+      </w:r>
+      <w:r>
+        <w:rPr>
+          <w:b/>
+          <w:bCs/>
+          <w:szCs w:val="24"/>
+        </w:rPr>
+        <w:t>para os joysticks, no entanto eles são Fêmea x Fêmea.</w:t>
+      </w:r>
+    </w:p>
     <w:sectPr>
       <w:pgSz w:w="11906" w:h="16838"/>
       <w:pgMar w:top="1701" w:right="1134" w:bottom="1134" w:left="1701" w:header="709" w:footer="709" w:gutter="0"/>
@@ -3765,7 +4377,7 @@
 </file>
 
 <file path=word/numbering.xml><?xml version="1.0" encoding="utf-8"?>
-<w:numbering xmlns:wpc="http://schemas.microsoft.com/office/word/2010/wordprocessingCanvas" xmlns:cx="http://schemas.microsoft.com/office/drawing/2014/chartex" xmlns:cx1="http://schemas.microsoft.com/office/drawing/2015/9/8/chartex" xmlns:mc="http://schemas.openxmlformats.org/markup-compatibility/2006" xmlns:o="urn:schemas-microsoft-com:office:office" xmlns:r="http://schemas.openxmlformats.org/officeDocument/2006/relationships" xmlns:m="http://schemas.openxmlformats.org/officeDocument/2006/math" xmlns:v="urn:schemas-microsoft-com:vml" xmlns:wp14="http://schemas.microsoft.com/office/word/2010/wordprocessingDrawing" xmlns:wp="http://schemas.openxmlformats.org/drawingml/2006/wordprocessingDrawing" xmlns:w10="urn:schemas-microsoft-com:office:word" xmlns:w="http://schemas.openxmlformats.org/wordprocessingml/2006/main" xmlns:w14="http://schemas.microsoft.com/office/word/2010/wordml" xmlns:w15="http://schemas.microsoft.com/office/word/2012/wordml" xmlns:w16se="http://schemas.microsoft.com/office/word/2015/wordml/symex" xmlns:wpg="http://schemas.microsoft.com/office/word/2010/wordprocessingGroup" xmlns:wpi="http://schemas.microsoft.com/office/word/2010/wordprocessingInk" xmlns:wne="http://schemas.microsoft.com/office/word/2006/wordml" xmlns:wps="http://schemas.microsoft.com/office/word/2010/wordprocessingShape" mc:Ignorable="w14 w15 w16se wp14">
+<w:numbering xmlns:wpc="http://schemas.microsoft.com/office/word/2010/wordprocessingCanvas" xmlns:cx="http://schemas.microsoft.com/office/drawing/2014/chartex" xmlns:cx1="http://schemas.microsoft.com/office/drawing/2015/9/8/chartex" xmlns:cx2="http://schemas.microsoft.com/office/drawing/2015/10/21/chartex" xmlns:cx3="http://schemas.microsoft.com/office/drawing/2016/5/9/chartex" xmlns:cx4="http://schemas.microsoft.com/office/drawing/2016/5/10/chartex" xmlns:cx5="http://schemas.microsoft.com/office/drawing/2016/5/11/chartex" xmlns:cx6="http://schemas.microsoft.com/office/drawing/2016/5/12/chartex" xmlns:cx7="http://schemas.microsoft.com/office/drawing/2016/5/13/chartex" xmlns:cx8="http://schemas.microsoft.com/office/drawing/2016/5/14/chartex" xmlns:mc="http://schemas.openxmlformats.org/markup-compatibility/2006" xmlns:aink="http://schemas.microsoft.com/office/drawing/2016/ink" xmlns:am3d="http://schemas.microsoft.com/office/drawing/2017/model3d" xmlns:o="urn:schemas-microsoft-com:office:office" xmlns:oel="http://schemas.microsoft.com/office/2019/extlst" xmlns:r="http://schemas.openxmlformats.org/officeDocument/2006/relationships" xmlns:m="http://schemas.openxmlformats.org/officeDocument/2006/math" xmlns:v="urn:schemas-microsoft-com:vml" xmlns:wp14="http://schemas.microsoft.com/office/word/2010/wordprocessingDrawing" xmlns:wp="http://schemas.openxmlformats.org/drawingml/2006/wordprocessingDrawing" xmlns:w10="urn:schemas-microsoft-com:office:word" xmlns:w="http://schemas.openxmlformats.org/wordprocessingml/2006/main" xmlns:w14="http://schemas.microsoft.com/office/word/2010/wordml" xmlns:w15="http://schemas.microsoft.com/office/word/2012/wordml" xmlns:w16cex="http://schemas.microsoft.com/office/word/2018/wordml/cex" xmlns:w16cid="http://schemas.microsoft.com/office/word/2016/wordml/cid" xmlns:w16="http://schemas.microsoft.com/office/word/2018/wordml" xmlns:w16du="http://schemas.microsoft.com/office/word/2023/wordml/word16du" xmlns:w16sdtdh="http://schemas.microsoft.com/office/word/2020/wordml/sdtdatahash" xmlns:w16sdtfl="http://schemas.microsoft.com/office/word/2024/wordml/sdtformatlock" xmlns:w16se="http://schemas.microsoft.com/office/word/2015/wordml/symex" xmlns:wpg="http://schemas.microsoft.com/office/word/2010/wordprocessingGroup" xmlns:wpi="http://schemas.microsoft.com/office/word/2010/wordprocessingInk" xmlns:wne="http://schemas.microsoft.com/office/word/2006/wordml" xmlns:wps="http://schemas.microsoft.com/office/word/2010/wordprocessingShape" mc:Ignorable="w14 w15 w16se w16cid w16 w16cex w16sdtdh w16sdtfl w16du wp14">
   <w:abstractNum w:abstractNumId="0" w15:restartNumberingAfterBreak="0">
     <w:nsid w:val="24076717"/>
     <w:multiLevelType w:val="hybridMultilevel"/>
@@ -4081,20 +4693,20 @@
       </w:pPr>
     </w:lvl>
   </w:abstractNum>
-  <w:num w:numId="1">
+  <w:num w:numId="1" w16cid:durableId="608895088">
     <w:abstractNumId w:val="2"/>
   </w:num>
-  <w:num w:numId="2">
+  <w:num w:numId="2" w16cid:durableId="26878089">
     <w:abstractNumId w:val="1"/>
   </w:num>
-  <w:num w:numId="3">
+  <w:num w:numId="3" w16cid:durableId="1890023094">
     <w:abstractNumId w:val="0"/>
   </w:num>
 </w:numbering>
 </file>
 
 <file path=word/styles.xml><?xml version="1.0" encoding="utf-8"?>
-<w:styles xmlns:mc="http://schemas.openxmlformats.org/markup-compatibility/2006" xmlns:r="http://schemas.openxmlformats.org/officeDocument/2006/relationships" xmlns:w="http://schemas.openxmlformats.org/wordprocessingml/2006/main" xmlns:w14="http://schemas.microsoft.com/office/word/2010/wordml" xmlns:w15="http://schemas.microsoft.com/office/word/2012/wordml" xmlns:w16se="http://schemas.microsoft.com/office/word/2015/wordml/symex" mc:Ignorable="w14 w15 w16se">
+<w:styles xmlns:mc="http://schemas.openxmlformats.org/markup-compatibility/2006" xmlns:r="http://schemas.openxmlformats.org/officeDocument/2006/relationships" xmlns:w="http://schemas.openxmlformats.org/wordprocessingml/2006/main" xmlns:w14="http://schemas.microsoft.com/office/word/2010/wordml" xmlns:w15="http://schemas.microsoft.com/office/word/2012/wordml" xmlns:w16cex="http://schemas.microsoft.com/office/word/2018/wordml/cex" xmlns:w16cid="http://schemas.microsoft.com/office/word/2016/wordml/cid" xmlns:w16="http://schemas.microsoft.com/office/word/2018/wordml" xmlns:w16du="http://schemas.microsoft.com/office/word/2023/wordml/word16du" xmlns:w16sdtdh="http://schemas.microsoft.com/office/word/2020/wordml/sdtdatahash" xmlns:w16sdtfl="http://schemas.microsoft.com/office/word/2024/wordml/sdtformatlock" xmlns:w16se="http://schemas.microsoft.com/office/word/2015/wordml/symex" mc:Ignorable="w14 w15 w16se w16cid w16 w16cex w16sdtdh w16sdtfl w16du">
   <w:docDefaults>
     <w:rPrDefault>
       <w:rPr>
@@ -4110,7 +4722,7 @@
       </w:pPr>
     </w:pPrDefault>
   </w:docDefaults>
-  <w:latentStyles w:defLockedState="0" w:defUIPriority="99" w:defSemiHidden="0" w:defUnhideWhenUsed="0" w:defQFormat="0" w:count="371">
+  <w:latentStyles w:defLockedState="0" w:defUIPriority="99" w:defSemiHidden="0" w:defUnhideWhenUsed="0" w:defQFormat="0" w:count="376">
     <w:lsdException w:name="Normal" w:uiPriority="0" w:qFormat="1"/>
     <w:lsdException w:name="heading 1" w:uiPriority="9" w:qFormat="1"/>
     <w:lsdException w:name="heading 2" w:semiHidden="1" w:uiPriority="9" w:unhideWhenUsed="1" w:qFormat="1"/>
@@ -4482,6 +5094,11 @@
     <w:lsdException w:name="List Table 5 Dark Accent 6" w:uiPriority="50"/>
     <w:lsdException w:name="List Table 6 Colorful Accent 6" w:uiPriority="51"/>
     <w:lsdException w:name="List Table 7 Colorful Accent 6" w:uiPriority="52"/>
+    <w:lsdException w:name="Mention" w:semiHidden="1" w:unhideWhenUsed="1"/>
+    <w:lsdException w:name="Smart Hyperlink" w:semiHidden="1" w:unhideWhenUsed="1"/>
+    <w:lsdException w:name="Hashtag" w:semiHidden="1" w:unhideWhenUsed="1"/>
+    <w:lsdException w:name="Unresolved Mention" w:semiHidden="1" w:unhideWhenUsed="1"/>
+    <w:lsdException w:name="Smart Link" w:semiHidden="1" w:unhideWhenUsed="1"/>
   </w:latentStyles>
   <w:style w:type="paragraph" w:default="1" w:styleId="Normal">
     <w:name w:val="Normal"/>
@@ -4556,8 +5173,8 @@
       <w:u w:val="single"/>
     </w:rPr>
   </w:style>
-  <w:style w:type="character" w:customStyle="1" w:styleId="UnresolvedMention">
-    <w:name w:val="Unresolved Mention"/>
+  <w:style w:type="character" w:customStyle="1" w:styleId="MenoPendente1">
+    <w:name w:val="Menção Pendente1"/>
     <w:basedOn w:val="Fontepargpadro"/>
     <w:uiPriority w:val="99"/>
     <w:semiHidden/>
@@ -4567,6 +5184,217 @@
       <w:color w:val="605E5C"/>
       <w:shd w:val="clear" w:color="auto" w:fill="E1DFDD"/>
     </w:rPr>
+  </w:style>
+  <w:style w:type="table" w:styleId="SimplesTabela1">
+    <w:name w:val="Plain Table 1"/>
+    <w:basedOn w:val="Tabelanormal"/>
+    <w:uiPriority w:val="41"/>
+    <w:rsid w:val="004146B4"/>
+    <w:pPr>
+      <w:spacing w:after="0" w:line="240" w:lineRule="auto"/>
+    </w:pPr>
+    <w:tblPr>
+      <w:tblStyleRowBandSize w:val="1"/>
+      <w:tblStyleColBandSize w:val="1"/>
+      <w:tblBorders>
+        <w:top w:val="single" w:sz="4" w:space="0" w:color="BFBFBF" w:themeColor="background1" w:themeShade="BF"/>
+        <w:left w:val="single" w:sz="4" w:space="0" w:color="BFBFBF" w:themeColor="background1" w:themeShade="BF"/>
+        <w:bottom w:val="single" w:sz="4" w:space="0" w:color="BFBFBF" w:themeColor="background1" w:themeShade="BF"/>
+        <w:right w:val="single" w:sz="4" w:space="0" w:color="BFBFBF" w:themeColor="background1" w:themeShade="BF"/>
+        <w:insideH w:val="single" w:sz="4" w:space="0" w:color="BFBFBF" w:themeColor="background1" w:themeShade="BF"/>
+        <w:insideV w:val="single" w:sz="4" w:space="0" w:color="BFBFBF" w:themeColor="background1" w:themeShade="BF"/>
+      </w:tblBorders>
+    </w:tblPr>
+    <w:tblStylePr w:type="firstRow">
+      <w:rPr>
+        <w:b/>
+        <w:bCs/>
+      </w:rPr>
+    </w:tblStylePr>
+    <w:tblStylePr w:type="lastRow">
+      <w:rPr>
+        <w:b/>
+        <w:bCs/>
+      </w:rPr>
+      <w:tblPr/>
+      <w:tcPr>
+        <w:tcBorders>
+          <w:top w:val="double" w:sz="4" w:space="0" w:color="BFBFBF" w:themeColor="background1" w:themeShade="BF"/>
+        </w:tcBorders>
+      </w:tcPr>
+    </w:tblStylePr>
+    <w:tblStylePr w:type="firstCol">
+      <w:rPr>
+        <w:b/>
+        <w:bCs/>
+      </w:rPr>
+    </w:tblStylePr>
+    <w:tblStylePr w:type="lastCol">
+      <w:rPr>
+        <w:b/>
+        <w:bCs/>
+      </w:rPr>
+    </w:tblStylePr>
+    <w:tblStylePr w:type="band1Vert">
+      <w:tblPr/>
+      <w:tcPr>
+        <w:shd w:val="clear" w:color="auto" w:fill="F2F2F2" w:themeFill="background1" w:themeFillShade="F2"/>
+      </w:tcPr>
+    </w:tblStylePr>
+    <w:tblStylePr w:type="band1Horz">
+      <w:tblPr/>
+      <w:tcPr>
+        <w:shd w:val="clear" w:color="auto" w:fill="F2F2F2" w:themeFill="background1" w:themeFillShade="F2"/>
+      </w:tcPr>
+    </w:tblStylePr>
+  </w:style>
+  <w:style w:type="table" w:styleId="TabeladeGrade4-nfase1">
+    <w:name w:val="Grid Table 4 Accent 1"/>
+    <w:basedOn w:val="Tabelanormal"/>
+    <w:uiPriority w:val="49"/>
+    <w:rsid w:val="004146B4"/>
+    <w:pPr>
+      <w:spacing w:after="0" w:line="240" w:lineRule="auto"/>
+    </w:pPr>
+    <w:tblPr>
+      <w:tblStyleRowBandSize w:val="1"/>
+      <w:tblStyleColBandSize w:val="1"/>
+      <w:tblBorders>
+        <w:top w:val="single" w:sz="4" w:space="0" w:color="8EAADB" w:themeColor="accent1" w:themeTint="99"/>
+        <w:left w:val="single" w:sz="4" w:space="0" w:color="8EAADB" w:themeColor="accent1" w:themeTint="99"/>
+        <w:bottom w:val="single" w:sz="4" w:space="0" w:color="8EAADB" w:themeColor="accent1" w:themeTint="99"/>
+        <w:right w:val="single" w:sz="4" w:space="0" w:color="8EAADB" w:themeColor="accent1" w:themeTint="99"/>
+        <w:insideH w:val="single" w:sz="4" w:space="0" w:color="8EAADB" w:themeColor="accent1" w:themeTint="99"/>
+        <w:insideV w:val="single" w:sz="4" w:space="0" w:color="8EAADB" w:themeColor="accent1" w:themeTint="99"/>
+      </w:tblBorders>
+    </w:tblPr>
+    <w:tblStylePr w:type="firstRow">
+      <w:rPr>
+        <w:b/>
+        <w:bCs/>
+        <w:color w:val="FFFFFF" w:themeColor="background1"/>
+      </w:rPr>
+      <w:tblPr/>
+      <w:tcPr>
+        <w:tcBorders>
+          <w:top w:val="single" w:sz="4" w:space="0" w:color="4472C4" w:themeColor="accent1"/>
+          <w:left w:val="single" w:sz="4" w:space="0" w:color="4472C4" w:themeColor="accent1"/>
+          <w:bottom w:val="single" w:sz="4" w:space="0" w:color="4472C4" w:themeColor="accent1"/>
+          <w:right w:val="single" w:sz="4" w:space="0" w:color="4472C4" w:themeColor="accent1"/>
+          <w:insideH w:val="nil"/>
+          <w:insideV w:val="nil"/>
+        </w:tcBorders>
+        <w:shd w:val="clear" w:color="auto" w:fill="4472C4" w:themeFill="accent1"/>
+      </w:tcPr>
+    </w:tblStylePr>
+    <w:tblStylePr w:type="lastRow">
+      <w:rPr>
+        <w:b/>
+        <w:bCs/>
+      </w:rPr>
+      <w:tblPr/>
+      <w:tcPr>
+        <w:tcBorders>
+          <w:top w:val="double" w:sz="4" w:space="0" w:color="4472C4" w:themeColor="accent1"/>
+        </w:tcBorders>
+      </w:tcPr>
+    </w:tblStylePr>
+    <w:tblStylePr w:type="firstCol">
+      <w:rPr>
+        <w:b/>
+        <w:bCs/>
+      </w:rPr>
+    </w:tblStylePr>
+    <w:tblStylePr w:type="lastCol">
+      <w:rPr>
+        <w:b/>
+        <w:bCs/>
+      </w:rPr>
+    </w:tblStylePr>
+    <w:tblStylePr w:type="band1Vert">
+      <w:tblPr/>
+      <w:tcPr>
+        <w:shd w:val="clear" w:color="auto" w:fill="D9E2F3" w:themeFill="accent1" w:themeFillTint="33"/>
+      </w:tcPr>
+    </w:tblStylePr>
+    <w:tblStylePr w:type="band1Horz">
+      <w:tblPr/>
+      <w:tcPr>
+        <w:shd w:val="clear" w:color="auto" w:fill="D9E2F3" w:themeFill="accent1" w:themeFillTint="33"/>
+      </w:tcPr>
+    </w:tblStylePr>
+  </w:style>
+  <w:style w:type="table" w:styleId="TabeladeGrade6Colorida-nfase5">
+    <w:name w:val="Grid Table 6 Colorful Accent 5"/>
+    <w:basedOn w:val="Tabelanormal"/>
+    <w:uiPriority w:val="51"/>
+    <w:rsid w:val="004146B4"/>
+    <w:pPr>
+      <w:spacing w:after="0" w:line="240" w:lineRule="auto"/>
+    </w:pPr>
+    <w:rPr>
+      <w:color w:val="2E74B5" w:themeColor="accent5" w:themeShade="BF"/>
+    </w:rPr>
+    <w:tblPr>
+      <w:tblStyleRowBandSize w:val="1"/>
+      <w:tblStyleColBandSize w:val="1"/>
+      <w:tblBorders>
+        <w:top w:val="single" w:sz="4" w:space="0" w:color="9CC2E5" w:themeColor="accent5" w:themeTint="99"/>
+        <w:left w:val="single" w:sz="4" w:space="0" w:color="9CC2E5" w:themeColor="accent5" w:themeTint="99"/>
+        <w:bottom w:val="single" w:sz="4" w:space="0" w:color="9CC2E5" w:themeColor="accent5" w:themeTint="99"/>
+        <w:right w:val="single" w:sz="4" w:space="0" w:color="9CC2E5" w:themeColor="accent5" w:themeTint="99"/>
+        <w:insideH w:val="single" w:sz="4" w:space="0" w:color="9CC2E5" w:themeColor="accent5" w:themeTint="99"/>
+        <w:insideV w:val="single" w:sz="4" w:space="0" w:color="9CC2E5" w:themeColor="accent5" w:themeTint="99"/>
+      </w:tblBorders>
+    </w:tblPr>
+    <w:tblStylePr w:type="firstRow">
+      <w:rPr>
+        <w:b/>
+        <w:bCs/>
+      </w:rPr>
+      <w:tblPr/>
+      <w:tcPr>
+        <w:tcBorders>
+          <w:bottom w:val="single" w:sz="12" w:space="0" w:color="9CC2E5" w:themeColor="accent5" w:themeTint="99"/>
+        </w:tcBorders>
+      </w:tcPr>
+    </w:tblStylePr>
+    <w:tblStylePr w:type="lastRow">
+      <w:rPr>
+        <w:b/>
+        <w:bCs/>
+      </w:rPr>
+      <w:tblPr/>
+      <w:tcPr>
+        <w:tcBorders>
+          <w:top w:val="double" w:sz="4" w:space="0" w:color="9CC2E5" w:themeColor="accent5" w:themeTint="99"/>
+        </w:tcBorders>
+      </w:tcPr>
+    </w:tblStylePr>
+    <w:tblStylePr w:type="firstCol">
+      <w:rPr>
+        <w:b/>
+        <w:bCs/>
+      </w:rPr>
+    </w:tblStylePr>
+    <w:tblStylePr w:type="lastCol">
+      <w:rPr>
+        <w:b/>
+        <w:bCs/>
+      </w:rPr>
+    </w:tblStylePr>
+    <w:tblStylePr w:type="band1Vert">
+      <w:tblPr/>
+      <w:tcPr>
+        <w:shd w:val="clear" w:color="auto" w:fill="DEEAF6" w:themeFill="accent5" w:themeFillTint="33"/>
+      </w:tcPr>
+    </w:tblStylePr>
+    <w:tblStylePr w:type="band1Horz">
+      <w:tblPr/>
+      <w:tcPr>
+        <w:shd w:val="clear" w:color="auto" w:fill="DEEAF6" w:themeFill="accent5" w:themeFillTint="33"/>
+      </w:tcPr>
+    </w:tblStylePr>
   </w:style>
 </w:styles>
 </file>
@@ -4867,11 +5695,12 @@
 </file>
 
 <file path=customXml/item1.xml><?xml version="1.0" encoding="utf-8"?>
-<p:properties xmlns:p="http://schemas.microsoft.com/office/2006/metadata/properties" xmlns:xsi="http://www.w3.org/2001/XMLSchema-instance" xmlns:pc="http://schemas.microsoft.com/office/infopath/2007/PartnerControls">
-  <documentManagement>
-    <ReferenceId xmlns="21e0ce27-b0e2-41aa-a79b-741a4637cbb0" xsi:nil="true"/>
-  </documentManagement>
-</p:properties>
+<?mso-contentType ?>
+<FormTemplates xmlns="http://schemas.microsoft.com/sharepoint/v3/contenttype/forms">
+  <Display>DocumentLibraryForm</Display>
+  <Edit>DocumentLibraryForm</Edit>
+  <New>DocumentLibraryForm</New>
+</FormTemplates>
 </file>
 
 <file path=customXml/item2.xml><?xml version="1.0" encoding="utf-8"?>
@@ -5001,20 +5830,17 @@
 </file>
 
 <file path=customXml/item3.xml><?xml version="1.0" encoding="utf-8"?>
-<?mso-contentType ?>
-<FormTemplates xmlns="http://schemas.microsoft.com/sharepoint/v3/contenttype/forms">
-  <Display>DocumentLibraryForm</Display>
-  <Edit>DocumentLibraryForm</Edit>
-  <New>DocumentLibraryForm</New>
-</FormTemplates>
+<p:properties xmlns:p="http://schemas.microsoft.com/office/2006/metadata/properties" xmlns:xsi="http://www.w3.org/2001/XMLSchema-instance" xmlns:pc="http://schemas.microsoft.com/office/infopath/2007/PartnerControls">
+  <documentManagement>
+    <ReferenceId xmlns="21e0ce27-b0e2-41aa-a79b-741a4637cbb0" xsi:nil="true"/>
+  </documentManagement>
+</p:properties>
 </file>
 
 <file path=customXml/itemProps1.xml><?xml version="1.0" encoding="utf-8"?>
-<ds:datastoreItem xmlns:ds="http://schemas.openxmlformats.org/officeDocument/2006/customXml" ds:itemID="{5FE6D219-976A-4CE1-9EDB-A109B2021195}">
+<ds:datastoreItem xmlns:ds="http://schemas.openxmlformats.org/officeDocument/2006/customXml" ds:itemID="{3091FFD0-3601-428E-B685-84AFEE0B15BE}">
   <ds:schemaRefs>
-    <ds:schemaRef ds:uri="http://schemas.microsoft.com/office/2006/metadata/properties"/>
-    <ds:schemaRef ds:uri="http://schemas.microsoft.com/office/infopath/2007/PartnerControls"/>
-    <ds:schemaRef ds:uri="21e0ce27-b0e2-41aa-a79b-741a4637cbb0"/>
+    <ds:schemaRef ds:uri="http://schemas.microsoft.com/sharepoint/v3/contenttype/forms"/>
   </ds:schemaRefs>
 </ds:datastoreItem>
 </file>
@@ -5038,9 +5864,11 @@
 </file>
 
 <file path=customXml/itemProps3.xml><?xml version="1.0" encoding="utf-8"?>
-<ds:datastoreItem xmlns:ds="http://schemas.openxmlformats.org/officeDocument/2006/customXml" ds:itemID="{3091FFD0-3601-428E-B685-84AFEE0B15BE}">
+<ds:datastoreItem xmlns:ds="http://schemas.openxmlformats.org/officeDocument/2006/customXml" ds:itemID="{5FE6D219-976A-4CE1-9EDB-A109B2021195}">
   <ds:schemaRefs>
-    <ds:schemaRef ds:uri="http://schemas.microsoft.com/sharepoint/v3/contenttype/forms"/>
+    <ds:schemaRef ds:uri="http://schemas.microsoft.com/office/2006/metadata/properties"/>
+    <ds:schemaRef ds:uri="http://schemas.microsoft.com/office/infopath/2007/PartnerControls"/>
+    <ds:schemaRef ds:uri="21e0ce27-b0e2-41aa-a79b-741a4637cbb0"/>
   </ds:schemaRefs>
 </ds:datastoreItem>
 </file>
</xml_diff>